<commit_message>
Completed initial 10yr prob of stroke and change in risk factors over time anaylsis. Wrote up additional sections in final report.
</commit_message>
<xml_diff>
--- a/Project3/Reports/Project3_Final_Report.docx
+++ b/Project3/Reports/Project3_Final_Report.docx
@@ -15,6 +15,7 @@
       <w:bookmarkStart w:id="0" w:name="_Toc221895313"/>
       <w:bookmarkStart w:id="1" w:name="_Toc221895378"/>
       <w:bookmarkStart w:id="2" w:name="_Toc222223983"/>
+      <w:bookmarkStart w:id="3" w:name="_Toc227079192"/>
       <w:r>
         <w:rPr>
           <w:b/>
@@ -50,39 +51,97 @@
       <w:bookmarkEnd w:id="0"/>
       <w:bookmarkEnd w:id="1"/>
       <w:bookmarkEnd w:id="2"/>
-    </w:p>
-    <w:p>
-      <w:pPr>
-        <w:pStyle w:val="Heading2"/>
-        <w:jc w:val="center"/>
+      <w:r>
         <w:rPr>
           <w:b/>
           <w:bCs/>
           <w:color w:val="000000" w:themeColor="text1"/>
         </w:rPr>
-      </w:pPr>
-      <w:bookmarkStart w:id="3" w:name="_Toc221895314"/>
-      <w:bookmarkStart w:id="4" w:name="_Toc221895379"/>
-      <w:bookmarkStart w:id="5" w:name="_Toc222223984"/>
+        <w:t xml:space="preserve"> </w:t>
+      </w:r>
       <w:r>
         <w:rPr>
           <w:b/>
           <w:bCs/>
           <w:color w:val="000000" w:themeColor="text1"/>
         </w:rPr>
-        <w:t>Data Analysis Plan</w:t>
+        <w:t>Final Report</w:t>
       </w:r>
       <w:bookmarkEnd w:id="3"/>
-      <w:bookmarkEnd w:id="4"/>
-      <w:bookmarkEnd w:id="5"/>
-    </w:p>
+    </w:p>
+    <w:p>
+      <w:pPr>
+        <w:jc w:val="center"/>
+        <w:rPr>
+          <w:rFonts w:asciiTheme="majorHAnsi" w:eastAsiaTheme="majorEastAsia" w:hAnsiTheme="majorHAnsi" w:cstheme="majorBidi"/>
+          <w:b/>
+          <w:bCs/>
+          <w:color w:val="000000" w:themeColor="text1"/>
+          <w:sz w:val="32"/>
+          <w:szCs w:val="32"/>
+        </w:rPr>
+      </w:pPr>
+      <w:r>
+        <w:rPr>
+          <w:rFonts w:asciiTheme="majorHAnsi" w:eastAsiaTheme="majorEastAsia" w:hAnsiTheme="majorHAnsi" w:cstheme="majorBidi"/>
+          <w:b/>
+          <w:bCs/>
+          <w:color w:val="000000" w:themeColor="text1"/>
+          <w:sz w:val="32"/>
+          <w:szCs w:val="32"/>
+        </w:rPr>
+        <w:t>Identification of</w:t>
+      </w:r>
+      <w:r>
+        <w:rPr>
+          <w:rFonts w:asciiTheme="majorHAnsi" w:eastAsiaTheme="majorEastAsia" w:hAnsiTheme="majorHAnsi" w:cstheme="majorBidi"/>
+          <w:b/>
+          <w:bCs/>
+          <w:color w:val="000000" w:themeColor="text1"/>
+          <w:sz w:val="32"/>
+          <w:szCs w:val="32"/>
+        </w:rPr>
+        <w:t xml:space="preserve"> Risk Factors</w:t>
+      </w:r>
+      <w:r>
+        <w:rPr>
+          <w:rFonts w:asciiTheme="majorHAnsi" w:eastAsiaTheme="majorEastAsia" w:hAnsiTheme="majorHAnsi" w:cstheme="majorBidi"/>
+          <w:b/>
+          <w:bCs/>
+          <w:color w:val="000000" w:themeColor="text1"/>
+          <w:sz w:val="32"/>
+          <w:szCs w:val="32"/>
+        </w:rPr>
+        <w:t xml:space="preserve"> and 10-year Stroke Risk</w:t>
+      </w:r>
+      <w:r>
+        <w:rPr>
+          <w:rFonts w:asciiTheme="majorHAnsi" w:eastAsiaTheme="majorEastAsia" w:hAnsiTheme="majorHAnsi" w:cstheme="majorBidi"/>
+          <w:b/>
+          <w:bCs/>
+          <w:color w:val="000000" w:themeColor="text1"/>
+          <w:sz w:val="32"/>
+          <w:szCs w:val="32"/>
+        </w:rPr>
+        <w:t xml:space="preserve"> in the Framingham Heart Study</w:t>
+      </w:r>
+    </w:p>
+    <w:p/>
     <w:p/>
     <w:p>
       <w:pPr>
         <w:contextualSpacing/>
         <w:jc w:val="center"/>
-      </w:pPr>
-      <w:r>
+        <w:rPr>
+          <w:sz w:val="28"/>
+          <w:szCs w:val="28"/>
+        </w:rPr>
+      </w:pPr>
+      <w:r>
+        <w:rPr>
+          <w:sz w:val="28"/>
+          <w:szCs w:val="28"/>
+        </w:rPr>
         <w:t>Ryan Summers</w:t>
       </w:r>
     </w:p>
@@ -90,47 +149,66 @@
       <w:pPr>
         <w:contextualSpacing/>
         <w:jc w:val="center"/>
-      </w:pPr>
-      <w:r>
+        <w:rPr>
+          <w:sz w:val="28"/>
+          <w:szCs w:val="28"/>
+        </w:rPr>
+      </w:pPr>
+      <w:r>
+        <w:rPr>
+          <w:sz w:val="28"/>
+          <w:szCs w:val="28"/>
+        </w:rPr>
         <w:t>4</w:t>
       </w:r>
       <w:r>
+        <w:rPr>
+          <w:sz w:val="28"/>
+          <w:szCs w:val="28"/>
+        </w:rPr>
         <w:t>/</w:t>
       </w:r>
       <w:r>
-        <w:t>8</w:t>
-      </w:r>
-      <w:r>
+        <w:rPr>
+          <w:sz w:val="28"/>
+          <w:szCs w:val="28"/>
+        </w:rPr>
+        <w:t>22</w:t>
+      </w:r>
+      <w:r>
+        <w:rPr>
+          <w:sz w:val="28"/>
+          <w:szCs w:val="28"/>
+        </w:rPr>
         <w:t>/26</w:t>
       </w:r>
     </w:p>
     <w:p>
       <w:pPr>
         <w:pStyle w:val="Heading2"/>
-        <w:spacing w:before="0" w:after="0" w:line="240" w:lineRule="auto"/>
+        <w:spacing w:before="0" w:after="0"/>
         <w:contextualSpacing/>
       </w:pPr>
     </w:p>
     <w:p>
       <w:pPr>
         <w:pStyle w:val="Heading2"/>
-        <w:spacing w:before="0" w:after="0" w:line="240" w:lineRule="auto"/>
+        <w:spacing w:before="0" w:after="0"/>
         <w:contextualSpacing/>
       </w:pPr>
     </w:p>
+    <w:p>
+      <w:pPr>
+        <w:pStyle w:val="Heading2"/>
+        <w:spacing w:before="0" w:after="0"/>
+        <w:contextualSpacing/>
+      </w:pPr>
+    </w:p>
+    <w:p/>
+    <w:p/>
     <w:sdt>
       <w:sdtPr>
-        <w:rPr>
-          <w:rFonts w:asciiTheme="minorHAnsi" w:eastAsiaTheme="minorHAnsi" w:hAnsiTheme="minorHAnsi" w:cstheme="minorBidi"/>
-          <w:b w:val="0"/>
-          <w:bCs w:val="0"/>
-          <w:color w:val="auto"/>
-          <w:kern w:val="2"/>
-          <w:sz w:val="24"/>
-          <w:szCs w:val="24"/>
-          <w14:ligatures w14:val="standardContextual"/>
-        </w:rPr>
-        <w:id w:val="1857219255"/>
+        <w:id w:val="-1815024890"/>
         <w:docPartObj>
           <w:docPartGallery w:val="Table of Contents"/>
           <w:docPartUnique/>
@@ -138,16 +216,17 @@
       </w:sdtPr>
       <w:sdtEndPr>
         <w:rPr>
+          <w:rFonts w:ascii="Times New Roman" w:eastAsia="Times New Roman" w:hAnsi="Times New Roman" w:cs="Times New Roman"/>
           <w:noProof/>
+          <w:color w:val="auto"/>
+          <w:sz w:val="24"/>
+          <w:szCs w:val="24"/>
         </w:rPr>
       </w:sdtEndPr>
       <w:sdtContent>
         <w:p>
           <w:pPr>
             <w:pStyle w:val="TOCHeading"/>
-            <w:rPr>
-              <w:noProof/>
-            </w:rPr>
           </w:pPr>
           <w:r>
             <w:t>Table of Contents</w:t>
@@ -169,6 +248,7 @@
             </w:rPr>
             <w:fldChar w:fldCharType="separate"/>
           </w:r>
+          <w:hyperlink w:anchor="_Toc227079192" w:history="1"/>
         </w:p>
         <w:p>
           <w:pPr>
@@ -177,21 +257,37 @@
               <w:tab w:val="right" w:leader="dot" w:pos="9350"/>
             </w:tabs>
             <w:rPr>
-              <w:rFonts w:eastAsiaTheme="minorEastAsia"/>
-              <w:b w:val="0"/>
-              <w:bCs w:val="0"/>
+              <w:rFonts w:eastAsiaTheme="minorEastAsia" w:cstheme="minorBidi"/>
+              <w:i/>
+              <w:iCs/>
               <w:noProof/>
+              <w:kern w:val="2"/>
               <w:sz w:val="24"/>
               <w:szCs w:val="24"/>
+              <w14:ligatures w14:val="standardContextual"/>
             </w:rPr>
           </w:pPr>
-          <w:hyperlink w:anchor="_Toc222223985" w:history="1">
+          <w:hyperlink w:anchor="_Toc227079193" w:history="1">
             <w:r>
               <w:rPr>
                 <w:rStyle w:val="Hyperlink"/>
                 <w:noProof/>
               </w:rPr>
-              <w:t>1. Introduction</w:t>
+              <w:t>1. Introdu</w:t>
+            </w:r>
+            <w:r>
+              <w:rPr>
+                <w:rStyle w:val="Hyperlink"/>
+                <w:noProof/>
+              </w:rPr>
+              <w:t>c</w:t>
+            </w:r>
+            <w:r>
+              <w:rPr>
+                <w:rStyle w:val="Hyperlink"/>
+                <w:noProof/>
+              </w:rPr>
+              <w:t>tion</w:t>
             </w:r>
             <w:r>
               <w:rPr>
@@ -212,7 +308,7 @@
                 <w:noProof/>
                 <w:webHidden/>
               </w:rPr>
-              <w:instrText xml:space="preserve"> PAGEREF _Toc222223985 \h </w:instrText>
+              <w:instrText xml:space="preserve"> PAGEREF _Toc227079193 \h </w:instrText>
             </w:r>
             <w:r>
               <w:rPr>
@@ -250,15 +346,17 @@
               <w:tab w:val="right" w:leader="dot" w:pos="9350"/>
             </w:tabs>
             <w:rPr>
-              <w:rFonts w:eastAsiaTheme="minorEastAsia"/>
-              <w:b w:val="0"/>
-              <w:bCs w:val="0"/>
+              <w:rFonts w:eastAsiaTheme="minorEastAsia" w:cstheme="minorBidi"/>
+              <w:i/>
+              <w:iCs/>
               <w:noProof/>
+              <w:kern w:val="2"/>
               <w:sz w:val="24"/>
               <w:szCs w:val="24"/>
+              <w14:ligatures w14:val="standardContextual"/>
             </w:rPr>
           </w:pPr>
-          <w:hyperlink w:anchor="_Toc222223986" w:history="1">
+          <w:hyperlink w:anchor="_Toc227079194" w:history="1">
             <w:r>
               <w:rPr>
                 <w:rStyle w:val="Hyperlink"/>
@@ -285,7 +383,7 @@
                 <w:noProof/>
                 <w:webHidden/>
               </w:rPr>
-              <w:instrText xml:space="preserve"> PAGEREF _Toc222223986 \h </w:instrText>
+              <w:instrText xml:space="preserve"> PAGEREF _Toc227079194 \h </w:instrText>
             </w:r>
             <w:r>
               <w:rPr>
@@ -323,21 +421,23 @@
               <w:tab w:val="right" w:leader="dot" w:pos="9350"/>
             </w:tabs>
             <w:rPr>
-              <w:rFonts w:eastAsiaTheme="minorEastAsia"/>
-              <w:b w:val="0"/>
-              <w:bCs w:val="0"/>
+              <w:rFonts w:eastAsiaTheme="minorEastAsia" w:cstheme="minorBidi"/>
+              <w:i/>
+              <w:iCs/>
               <w:noProof/>
+              <w:kern w:val="2"/>
               <w:sz w:val="24"/>
               <w:szCs w:val="24"/>
+              <w14:ligatures w14:val="standardContextual"/>
             </w:rPr>
           </w:pPr>
-          <w:hyperlink w:anchor="_Toc222223987" w:history="1">
+          <w:hyperlink w:anchor="_Toc227079195" w:history="1">
             <w:r>
               <w:rPr>
                 <w:rStyle w:val="Hyperlink"/>
                 <w:noProof/>
               </w:rPr>
-              <w:t>3. Preliminary Results</w:t>
+              <w:t>3. Results</w:t>
             </w:r>
             <w:r>
               <w:rPr>
@@ -358,7 +458,7 @@
                 <w:noProof/>
                 <w:webHidden/>
               </w:rPr>
-              <w:instrText xml:space="preserve"> PAGEREF _Toc222223987 \h </w:instrText>
+              <w:instrText xml:space="preserve"> PAGEREF _Toc227079195 \h </w:instrText>
             </w:r>
             <w:r>
               <w:rPr>
@@ -379,6 +479,231 @@
                 <w:webHidden/>
               </w:rPr>
               <w:t>4</w:t>
+            </w:r>
+            <w:r>
+              <w:rPr>
+                <w:noProof/>
+                <w:webHidden/>
+              </w:rPr>
+              <w:fldChar w:fldCharType="end"/>
+            </w:r>
+          </w:hyperlink>
+        </w:p>
+        <w:p>
+          <w:pPr>
+            <w:pStyle w:val="TOC2"/>
+            <w:tabs>
+              <w:tab w:val="right" w:leader="dot" w:pos="9350"/>
+            </w:tabs>
+            <w:rPr>
+              <w:rFonts w:eastAsiaTheme="minorEastAsia" w:cstheme="minorBidi"/>
+              <w:i/>
+              <w:iCs/>
+              <w:noProof/>
+              <w:kern w:val="2"/>
+              <w:sz w:val="24"/>
+              <w:szCs w:val="24"/>
+              <w14:ligatures w14:val="standardContextual"/>
+            </w:rPr>
+          </w:pPr>
+          <w:hyperlink w:anchor="_Toc227079196" w:history="1">
+            <w:r>
+              <w:rPr>
+                <w:rStyle w:val="Hyperlink"/>
+                <w:noProof/>
+              </w:rPr>
+              <w:t>4. Discussion</w:t>
+            </w:r>
+            <w:r>
+              <w:rPr>
+                <w:noProof/>
+                <w:webHidden/>
+              </w:rPr>
+              <w:tab/>
+            </w:r>
+            <w:r>
+              <w:rPr>
+                <w:noProof/>
+                <w:webHidden/>
+              </w:rPr>
+              <w:fldChar w:fldCharType="begin"/>
+            </w:r>
+            <w:r>
+              <w:rPr>
+                <w:noProof/>
+                <w:webHidden/>
+              </w:rPr>
+              <w:instrText xml:space="preserve"> PAGEREF _Toc227079196 \h </w:instrText>
+            </w:r>
+            <w:r>
+              <w:rPr>
+                <w:noProof/>
+                <w:webHidden/>
+              </w:rPr>
+            </w:r>
+            <w:r>
+              <w:rPr>
+                <w:noProof/>
+                <w:webHidden/>
+              </w:rPr>
+              <w:fldChar w:fldCharType="separate"/>
+            </w:r>
+            <w:r>
+              <w:rPr>
+                <w:noProof/>
+                <w:webHidden/>
+              </w:rPr>
+              <w:t>8</w:t>
+            </w:r>
+            <w:r>
+              <w:rPr>
+                <w:noProof/>
+                <w:webHidden/>
+              </w:rPr>
+              <w:fldChar w:fldCharType="end"/>
+            </w:r>
+          </w:hyperlink>
+        </w:p>
+        <w:p>
+          <w:pPr>
+            <w:pStyle w:val="TOC2"/>
+            <w:tabs>
+              <w:tab w:val="right" w:leader="dot" w:pos="9350"/>
+            </w:tabs>
+            <w:rPr>
+              <w:rFonts w:eastAsiaTheme="minorEastAsia" w:cstheme="minorBidi"/>
+              <w:i/>
+              <w:iCs/>
+              <w:noProof/>
+              <w:kern w:val="2"/>
+              <w:sz w:val="24"/>
+              <w:szCs w:val="24"/>
+              <w14:ligatures w14:val="standardContextual"/>
+            </w:rPr>
+          </w:pPr>
+          <w:hyperlink w:anchor="_Toc227079197" w:history="1">
+            <w:r>
+              <w:rPr>
+                <w:rStyle w:val="Hyperlink"/>
+                <w:noProof/>
+              </w:rPr>
+              <w:t>References</w:t>
+            </w:r>
+            <w:r>
+              <w:rPr>
+                <w:noProof/>
+                <w:webHidden/>
+              </w:rPr>
+              <w:tab/>
+            </w:r>
+            <w:r>
+              <w:rPr>
+                <w:noProof/>
+                <w:webHidden/>
+              </w:rPr>
+              <w:fldChar w:fldCharType="begin"/>
+            </w:r>
+            <w:r>
+              <w:rPr>
+                <w:noProof/>
+                <w:webHidden/>
+              </w:rPr>
+              <w:instrText xml:space="preserve"> PAGEREF _Toc227079197 \h </w:instrText>
+            </w:r>
+            <w:r>
+              <w:rPr>
+                <w:noProof/>
+                <w:webHidden/>
+              </w:rPr>
+            </w:r>
+            <w:r>
+              <w:rPr>
+                <w:noProof/>
+                <w:webHidden/>
+              </w:rPr>
+              <w:fldChar w:fldCharType="separate"/>
+            </w:r>
+            <w:r>
+              <w:rPr>
+                <w:noProof/>
+                <w:webHidden/>
+              </w:rPr>
+              <w:t>9</w:t>
+            </w:r>
+            <w:r>
+              <w:rPr>
+                <w:noProof/>
+                <w:webHidden/>
+              </w:rPr>
+              <w:fldChar w:fldCharType="end"/>
+            </w:r>
+          </w:hyperlink>
+        </w:p>
+        <w:p>
+          <w:pPr>
+            <w:pStyle w:val="TOC2"/>
+            <w:tabs>
+              <w:tab w:val="right" w:leader="dot" w:pos="9350"/>
+            </w:tabs>
+            <w:rPr>
+              <w:rFonts w:eastAsiaTheme="minorEastAsia" w:cstheme="minorBidi"/>
+              <w:i/>
+              <w:iCs/>
+              <w:noProof/>
+              <w:kern w:val="2"/>
+              <w:sz w:val="24"/>
+              <w:szCs w:val="24"/>
+              <w14:ligatures w14:val="standardContextual"/>
+            </w:rPr>
+          </w:pPr>
+          <w:hyperlink w:anchor="_Toc227079198" w:history="1">
+            <w:r>
+              <w:rPr>
+                <w:rStyle w:val="Hyperlink"/>
+                <w:noProof/>
+              </w:rPr>
+              <w:t>Reproducibility Statement</w:t>
+            </w:r>
+            <w:r>
+              <w:rPr>
+                <w:noProof/>
+                <w:webHidden/>
+              </w:rPr>
+              <w:tab/>
+            </w:r>
+            <w:r>
+              <w:rPr>
+                <w:noProof/>
+                <w:webHidden/>
+              </w:rPr>
+              <w:fldChar w:fldCharType="begin"/>
+            </w:r>
+            <w:r>
+              <w:rPr>
+                <w:noProof/>
+                <w:webHidden/>
+              </w:rPr>
+              <w:instrText xml:space="preserve"> PAGEREF _Toc227079198 \h </w:instrText>
+            </w:r>
+            <w:r>
+              <w:rPr>
+                <w:noProof/>
+                <w:webHidden/>
+              </w:rPr>
+            </w:r>
+            <w:r>
+              <w:rPr>
+                <w:noProof/>
+                <w:webHidden/>
+              </w:rPr>
+              <w:fldChar w:fldCharType="separate"/>
+            </w:r>
+            <w:r>
+              <w:rPr>
+                <w:noProof/>
+                <w:webHidden/>
+              </w:rPr>
+              <w:t>9</w:t>
             </w:r>
             <w:r>
               <w:rPr>
@@ -401,72 +726,60 @@
         </w:p>
       </w:sdtContent>
     </w:sdt>
-    <w:p>
-      <w:pPr>
-        <w:pStyle w:val="Heading2"/>
-        <w:spacing w:before="0" w:after="0" w:line="240" w:lineRule="auto"/>
-        <w:contextualSpacing/>
-      </w:pPr>
-    </w:p>
-    <w:p>
-      <w:pPr>
-        <w:pStyle w:val="Heading2"/>
-        <w:spacing w:before="0" w:after="0" w:line="240" w:lineRule="auto"/>
-        <w:contextualSpacing/>
-      </w:pPr>
-    </w:p>
-    <w:p>
-      <w:pPr>
-        <w:pStyle w:val="Heading2"/>
-        <w:spacing w:before="0" w:after="0" w:line="240" w:lineRule="auto"/>
-        <w:contextualSpacing/>
-      </w:pPr>
-    </w:p>
-    <w:p>
-      <w:pPr>
-        <w:pStyle w:val="Heading2"/>
-        <w:spacing w:before="0" w:after="0" w:line="240" w:lineRule="auto"/>
-        <w:contextualSpacing/>
-      </w:pPr>
-    </w:p>
-    <w:p>
-      <w:pPr>
-        <w:pStyle w:val="Heading2"/>
-        <w:spacing w:before="0" w:after="0" w:line="240" w:lineRule="auto"/>
-        <w:contextualSpacing/>
-      </w:pPr>
-    </w:p>
-    <w:p>
-      <w:pPr>
-        <w:pStyle w:val="Heading2"/>
-      </w:pPr>
-    </w:p>
     <w:p/>
     <w:p/>
+    <w:p/>
+    <w:p/>
     <w:p>
       <w:pPr>
         <w:pStyle w:val="Heading2"/>
+        <w:spacing w:before="0" w:after="0"/>
+        <w:contextualSpacing/>
       </w:pPr>
     </w:p>
     <w:p>
       <w:pPr>
         <w:pStyle w:val="Heading2"/>
-      </w:pPr>
-      <w:bookmarkStart w:id="6" w:name="_Toc221895315"/>
+        <w:spacing w:before="0" w:after="0"/>
+        <w:contextualSpacing/>
+      </w:pPr>
+    </w:p>
+    <w:p>
+      <w:pPr>
+        <w:pStyle w:val="Heading2"/>
+        <w:spacing w:before="0" w:after="0"/>
+        <w:contextualSpacing/>
+      </w:pPr>
+    </w:p>
+    <w:p>
+      <w:pPr>
+        <w:pStyle w:val="Heading2"/>
+        <w:spacing w:before="0" w:after="0"/>
+        <w:contextualSpacing/>
+      </w:pPr>
+    </w:p>
+    <w:p>
+      <w:pPr>
+        <w:pStyle w:val="Heading2"/>
+      </w:pPr>
     </w:p>
     <w:p/>
+    <w:p/>
     <w:p>
       <w:pPr>
         <w:pStyle w:val="Heading2"/>
       </w:pPr>
-      <w:bookmarkStart w:id="7" w:name="_Toc221895380"/>
-    </w:p>
-    <w:p/>
+    </w:p>
+    <w:p>
+      <w:bookmarkStart w:id="4" w:name="_Toc221895315"/>
+      <w:bookmarkStart w:id="5" w:name="_Toc221895380"/>
+    </w:p>
     <w:p>
       <w:pPr>
         <w:pStyle w:val="Heading2"/>
       </w:pPr>
-      <w:bookmarkStart w:id="8" w:name="_Toc222223985"/>
+      <w:bookmarkStart w:id="6" w:name="_Toc222223985"/>
+      <w:bookmarkStart w:id="7" w:name="_Toc227079193"/>
       <w:r>
         <w:lastRenderedPageBreak/>
         <w:t>1. I</w:t>
@@ -474,77 +787,104 @@
       <w:r>
         <w:t>ntroduction</w:t>
       </w:r>
+      <w:bookmarkEnd w:id="4"/>
+      <w:bookmarkEnd w:id="5"/>
       <w:bookmarkEnd w:id="6"/>
       <w:bookmarkEnd w:id="7"/>
+    </w:p>
+    <w:p>
+      <w:pPr>
+        <w:spacing w:after="240" w:line="480" w:lineRule="auto"/>
+      </w:pPr>
+      <w:r>
+        <w:t>The data for this project comes from the Framingham Heart Study (FHS), a long-term prospective study of the pathogenesis of cardiovascular disease among a population of free-living subjects in the community of Framingham, Massachusetts. The dataset contains up to 24 years of biennial follow-up on 4,434 participants, who were followed for the occurrence of the following events: Angina Pectoris, Myocardial Infarction, Atherothrombotic Infarction, Cerebral Hemorrhage (Stroke), or death. Specifically, this subset includes laboratory, clinic, questionnaire, and adjudicated event data. Participant clinic data was collected during three examination periods, approximately 6 years apart, from roughly 1956 to 1968.</w:t>
+      </w:r>
+    </w:p>
+    <w:p>
+      <w:pPr>
+        <w:spacing w:after="240" w:line="480" w:lineRule="auto"/>
+      </w:pPr>
+      <w:r>
+        <w:t xml:space="preserve">The primary objective of this analysis is to </w:t>
+      </w:r>
+      <w:r>
+        <w:t>determine what the important risk factors of stok</w:t>
+      </w:r>
+      <w:r>
+        <w:t>e are and compute the 10-year probability of stroke based on different risk profiles.</w:t>
+      </w:r>
+      <w:r>
+        <w:t xml:space="preserve"> </w:t>
+      </w:r>
+      <w:r>
+        <w:t>To</w:t>
+      </w:r>
+      <w:r>
+        <w:t xml:space="preserve"> </w:t>
+      </w:r>
+      <w:r>
+        <w:t>evaluate risk factors measured closest in time to the outcome, only the first 10 years of follow-up will be used, with baseline risk factors serving as the primary predictors. All analyses will be stratified by sex (male/female) to assess whether risk factor profiles and stroke probabilities differ between groups.</w:t>
+      </w:r>
+    </w:p>
+    <w:p>
+      <w:pPr>
+        <w:spacing w:after="240" w:line="480" w:lineRule="auto"/>
+      </w:pPr>
+      <w:r>
+        <w:t xml:space="preserve">As a secondary aim, this report will describe the degree of change in key risk factors across the three examination periods. This descriptive information will inform whether a more complex time-varying covariate analysis may be warranted in future work. </w:t>
+      </w:r>
+    </w:p>
+    <w:p>
+      <w:pPr>
+        <w:spacing w:after="240" w:line="480" w:lineRule="auto"/>
+      </w:pPr>
+      <w:r>
+        <w:t xml:space="preserve">The </w:t>
+      </w:r>
+      <w:r>
+        <w:t xml:space="preserve">purpose of this report </w:t>
+      </w:r>
+      <w:r>
+        <w:t xml:space="preserve">is to </w:t>
+      </w:r>
+      <w:r>
+        <w:t>answer the research question</w:t>
+      </w:r>
+      <w:r>
+        <w:t>s</w:t>
+      </w:r>
+      <w:r>
+        <w:t xml:space="preserve"> </w:t>
+      </w:r>
+      <w:r>
+        <w:t xml:space="preserve">guiding this </w:t>
+      </w:r>
+      <w:r>
+        <w:t xml:space="preserve">analysis: </w:t>
+      </w:r>
+      <w:r>
+        <w:t>What baseline risk factors are significantly associated with stroke incidence within 10 years of follow-up, and how does the 10-year probability of stroke vary by risk profile and sex among participants in the FHS</w:t>
+      </w:r>
+      <w:r>
+        <w:t>.</w:t>
+      </w:r>
+    </w:p>
+    <w:p>
+      <w:pPr>
+        <w:pStyle w:val="Heading2"/>
+      </w:pPr>
+      <w:bookmarkStart w:id="8" w:name="_Toc221895316"/>
+      <w:bookmarkStart w:id="9" w:name="_Toc221895381"/>
+      <w:bookmarkStart w:id="10" w:name="_Toc222223986"/>
+      <w:bookmarkStart w:id="11" w:name="_Toc227079194"/>
+      <w:r>
+        <w:lastRenderedPageBreak/>
+        <w:t xml:space="preserve">2. </w:t>
+      </w:r>
+      <w:r>
+        <w:t>Methods</w:t>
+      </w:r>
       <w:bookmarkEnd w:id="8"/>
-    </w:p>
-    <w:p>
-      <w:r>
-        <w:t>The data for this project comes from the Framingham Heart Study (FHS), a long-term prospective study of the pathogenesis of cardiovascular disease among a population of free-living subjects in the community of Framingham, Massachusetts. The dataset contains up to 24 years of biennial follow-up on 4,434 participants, who were followed for the occurrence of the following events: Angina Pectoris, Myocardial Infarction, Atherothrombotic Infarction, Cerebral Hemorrhage (Stroke), or death. Specifically, this subset includes laboratory, clinic, questionnaire, and adjudicated event data. Participant clinic data was collected during three examination periods, approximately 6 years apart, from roughly 1956 to 1968.</w:t>
-      </w:r>
-    </w:p>
-    <w:p>
-      <w:r>
-        <w:t xml:space="preserve">The primary objective of this analysis is to </w:t>
-      </w:r>
-      <w:r>
-        <w:t>determine what the important risk factors of stok</w:t>
-      </w:r>
-      <w:r>
-        <w:t>e are and compute the 10-year probability of stroke based on different risk profiles.</w:t>
-      </w:r>
-      <w:r>
-        <w:t xml:space="preserve"> </w:t>
-      </w:r>
-      <w:r>
-        <w:t>To</w:t>
-      </w:r>
-      <w:r>
-        <w:t xml:space="preserve"> </w:t>
-      </w:r>
-      <w:r>
-        <w:t>evaluate risk factors measured closest in time to the outcome, only the first 10 years of follow-up will be used, with baseline risk factors serving as the primary predictors. All analyses will be stratified by sex (male/female) to assess whether risk factor profiles and stroke probabilities differ between groups.</w:t>
-      </w:r>
-    </w:p>
-    <w:p>
-      <w:r>
-        <w:t xml:space="preserve">As a secondary aim, this report will describe the degree of change in key risk factors across the three examination periods. This descriptive information will inform whether a more complex time-varying covariate analysis may be warranted in future work. </w:t>
-      </w:r>
-    </w:p>
-    <w:p>
-      <w:r>
-        <w:t xml:space="preserve">The </w:t>
-      </w:r>
-      <w:r>
-        <w:t xml:space="preserve">purpose of this preliminary report is to develop an analysis plan to answer the research question </w:t>
-      </w:r>
-      <w:r>
-        <w:t xml:space="preserve">guiding this </w:t>
-      </w:r>
-      <w:r>
-        <w:t xml:space="preserve">analysis: </w:t>
-      </w:r>
-      <w:r>
-        <w:t>What baseline risk factors are significantly associated with stroke incidence within 10 years of follow-up, and how does the 10-year probability of stroke vary by risk profile and sex among participants in the FHS</w:t>
-      </w:r>
-      <w:r>
-        <w:t>.</w:t>
-      </w:r>
-    </w:p>
-    <w:p/>
-    <w:p>
-      <w:pPr>
-        <w:pStyle w:val="Heading2"/>
-      </w:pPr>
-      <w:bookmarkStart w:id="9" w:name="_Toc221895316"/>
-      <w:bookmarkStart w:id="10" w:name="_Toc221895381"/>
-      <w:bookmarkStart w:id="11" w:name="_Toc222223986"/>
-      <w:r>
-        <w:t xml:space="preserve">2. </w:t>
-      </w:r>
-      <w:r>
-        <w:t>Methods</w:t>
-      </w:r>
       <w:bookmarkEnd w:id="9"/>
       <w:bookmarkEnd w:id="10"/>
       <w:bookmarkEnd w:id="11"/>
@@ -566,6 +906,9 @@
       </w:r>
     </w:p>
     <w:p>
+      <w:pPr>
+        <w:spacing w:after="240" w:line="480" w:lineRule="auto"/>
+      </w:pPr>
       <w:r>
         <w:t xml:space="preserve">The </w:t>
       </w:r>
@@ -594,9 +937,68 @@
       </w:r>
     </w:p>
     <w:p>
-      <w:r>
-        <w:lastRenderedPageBreak/>
+      <w:pPr>
+        <w:spacing w:after="240" w:line="480" w:lineRule="auto"/>
+      </w:pPr>
+      <w:r>
         <w:t>The primary outcome is time to first stroke, measured in days. Participants who did not experience a stroke within the 10-year follow-up window were censored at either 10 years or their last observed follow-up time, whichever came first. A binary indicator variable was also created to denote whether a participant experienced a stroke within 10 years (yes/no), which will be used for computing 10-year stroke probabilities by risk profile.</w:t>
+      </w:r>
+      <w:r>
+        <w:t xml:space="preserve"> Systolic blood pressure</w:t>
+      </w:r>
+      <w:r>
+        <w:t xml:space="preserve"> and total cholesterol</w:t>
+      </w:r>
+      <w:r>
+        <w:t xml:space="preserve"> </w:t>
+      </w:r>
+      <w:r>
+        <w:t>were</w:t>
+      </w:r>
+      <w:r>
+        <w:t xml:space="preserve"> rescaled </w:t>
+      </w:r>
+      <w:r>
+        <w:t>so that the reported coefficients correspond to a</w:t>
+      </w:r>
+      <w:r>
+        <w:rPr>
+          <w:rFonts w:eastAsiaTheme="majorEastAsia"/>
+        </w:rPr>
+        <w:t> </w:t>
+      </w:r>
+      <w:r>
+        <w:t>10-mmHg</w:t>
+      </w:r>
+      <w:r>
+        <w:rPr>
+          <w:rFonts w:eastAsiaTheme="majorEastAsia"/>
+        </w:rPr>
+        <w:t xml:space="preserve"> </w:t>
+      </w:r>
+      <w:r>
+        <w:t>and a</w:t>
+      </w:r>
+      <w:r>
+        <w:rPr>
+          <w:rFonts w:eastAsiaTheme="majorEastAsia"/>
+        </w:rPr>
+        <w:t> 10</w:t>
+      </w:r>
+      <w:r>
+        <w:t>-</w:t>
+      </w:r>
+      <w:r>
+        <w:rPr>
+          <w:rFonts w:eastAsiaTheme="majorEastAsia"/>
+        </w:rPr>
+        <w:t>mg/dL increment</w:t>
+      </w:r>
+      <w:r>
+        <w:t>s</w:t>
+      </w:r>
+      <w:r>
+        <w:t>, respectively, to improve interpretability.</w:t>
       </w:r>
     </w:p>
     <w:p>
@@ -616,6 +1018,9 @@
       </w:r>
     </w:p>
     <w:p>
+      <w:pPr>
+        <w:spacing w:after="240" w:line="480" w:lineRule="auto"/>
+      </w:pPr>
       <w:r>
         <w:t xml:space="preserve">To address the primary research question, a </w:t>
       </w:r>
@@ -632,30 +1037,18 @@
         <w:t>The proportional hazards assumption will be assessed for each sex-specific model</w:t>
       </w:r>
       <w:r>
+        <w:t xml:space="preserve"> by using Schoenfeld residuals to test whether covariates change over time</w:t>
+      </w:r>
+      <w:r>
         <w:t>.</w:t>
       </w:r>
     </w:p>
     <w:p>
       <w:pPr>
-        <w:spacing w:after="0" w:line="240" w:lineRule="auto"/>
-      </w:pPr>
-      <w:r>
-        <w:t>Candidate baseline risk factors selected a priori</w:t>
-      </w:r>
-      <w:r>
-        <w:t>,</w:t>
-      </w:r>
-      <w:r>
-        <w:t xml:space="preserve"> based </w:t>
-      </w:r>
-      <w:r>
-        <w:t>discussion</w:t>
-      </w:r>
-      <w:r>
-        <w:t>s</w:t>
-      </w:r>
-      <w:r>
-        <w:t xml:space="preserve"> with the primary investigator (</w:t>
+        <w:spacing w:after="240" w:line="480" w:lineRule="auto"/>
+      </w:pPr>
+      <w:r>
+        <w:t>Candidate baseline risk factors were selected a priori based on discussions with the primary investigator (</w:t>
       </w:r>
       <w:r>
         <w:rPr>
@@ -665,19 +1058,7 @@
         <w:t>PI</w:t>
       </w:r>
       <w:r>
-        <w:t>)</w:t>
-      </w:r>
-      <w:r>
-        <w:t>,</w:t>
-      </w:r>
-      <w:r>
-        <w:t xml:space="preserve"> includes </w:t>
-      </w:r>
-      <w:r>
-        <w:t>age, systolic blood pressure</w:t>
-      </w:r>
-      <w:r>
-        <w:t xml:space="preserve"> (</w:t>
+        <w:t>), including age, systolic blood pressure (</w:t>
       </w:r>
       <w:r>
         <w:rPr>
@@ -687,61 +1068,76 @@
         <w:t>BP</w:t>
       </w:r>
       <w:r>
-        <w:t>)</w:t>
-      </w:r>
-      <w:r>
-        <w:t>,</w:t>
-      </w:r>
-      <w:r>
-        <w:t xml:space="preserve"> and diabetes status.</w:t>
-      </w:r>
-      <w:r>
-        <w:t xml:space="preserve"> </w:t>
-      </w:r>
-      <w:r>
-        <w:rPr>
-          <w:highlight w:val="yellow"/>
-        </w:rPr>
-        <w:t xml:space="preserve">Other potential risk factors to be assessed </w:t>
-      </w:r>
-      <w:r>
-        <w:rPr>
-          <w:highlight w:val="yellow"/>
-        </w:rPr>
-        <w:t>include</w:t>
-      </w:r>
-      <w:r>
-        <w:rPr>
-          <w:highlight w:val="yellow"/>
-        </w:rPr>
-        <w:t xml:space="preserve"> total cholesterol, BMI, current smoking status, blood pressure medication use, and prevalent coronary heart disease (</w:t>
+        <w:t xml:space="preserve">), and diabetes status. Additional </w:t>
+      </w:r>
+      <w:r>
+        <w:lastRenderedPageBreak/>
+        <w:t>variables considered for inclusion include total cholesterol, body mass index (</w:t>
       </w:r>
       <w:r>
         <w:rPr>
           <w:b/>
           <w:bCs/>
-          <w:highlight w:val="yellow"/>
+        </w:rPr>
+        <w:t>BMI</w:t>
+      </w:r>
+      <w:r>
+        <w:t>), current smoking status, blood pressure medication use, and prevalent coronary heart disease (</w:t>
+      </w:r>
+      <w:r>
+        <w:rPr>
+          <w:b/>
+          <w:bCs/>
         </w:rPr>
         <w:t>CHD</w:t>
       </w:r>
       <w:r>
-        <w:rPr>
-          <w:highlight w:val="yellow"/>
-        </w:rPr>
-        <w:t>).</w:t>
+        <w:t xml:space="preserve">). Variable selection for the </w:t>
+      </w:r>
+      <w:r>
+        <w:t>additional variables to be considered</w:t>
+      </w:r>
+      <w:r>
+        <w:t xml:space="preserve"> will be performed using a backward stepwise procedure implemented via the </w:t>
+      </w:r>
+      <w:proofErr w:type="spellStart"/>
+      <w:r>
+        <w:t>StepReg</w:t>
+      </w:r>
+      <w:proofErr w:type="spellEnd"/>
+      <w:r>
+        <w:t xml:space="preserve"> function</w:t>
+      </w:r>
+      <w:r>
+        <w:t xml:space="preserve"> in R</w:t>
+      </w:r>
+      <w:r>
+        <w:t>, with model selection guided by information criteria including</w:t>
+      </w:r>
+      <w:r>
+        <w:t xml:space="preserve"> corrected Akaike’s Information Criterion</w:t>
       </w:r>
       <w:r>
         <w:t xml:space="preserve"> </w:t>
       </w:r>
-    </w:p>
-    <w:p>
-      <w:pPr>
-        <w:spacing w:after="0" w:line="240" w:lineRule="auto"/>
-      </w:pPr>
-    </w:p>
-    <w:p>
-      <w:pPr>
-        <w:spacing w:after="0" w:line="240" w:lineRule="auto"/>
+      <w:r>
+        <w:t>(</w:t>
+      </w:r>
+      <w:proofErr w:type="spellStart"/>
+      <w:r>
+        <w:t>AICc</w:t>
+      </w:r>
+      <w:proofErr w:type="spellEnd"/>
+      <w:r>
+        <w:t>)</w:t>
+      </w:r>
+      <w:r>
+        <w:t>, Schwarz Bayesian Criterion (SBC), and Hannan–Quinn (HQ). Final model selection will also consider clinical relevance and interpretability.</w:t>
+      </w:r>
+    </w:p>
+    <w:p>
+      <w:pPr>
+        <w:spacing w:after="240" w:line="480" w:lineRule="auto"/>
       </w:pPr>
       <w:r>
         <w:t>Potential correlations and confounding among predictors will be assessed</w:t>
@@ -752,74 +1148,52 @@
       <w:r>
         <w:t>ensitivity analyses to evaluate the impact of high correlation and confounding among predictors (e.g., systolic BP and BP medication use) on model estimates and interpretation, including the impact of including or excluding these predictors.</w:t>
       </w:r>
-      <w:r>
-        <w:br/>
-      </w:r>
-    </w:p>
-    <w:p>
-      <w:r>
-        <w:t>To address the secondary research question, 10-year stroke probabilities will be computed from the fitted Cox model</w:t>
-      </w:r>
-      <w:r>
-        <w:t>s</w:t>
-      </w:r>
-      <w:r>
-        <w:t xml:space="preserve"> for different risk profiles of interest, stratified by sex. Risk profiles will be defined by</w:t>
-      </w:r>
-      <w:r>
-        <w:t xml:space="preserve"> stratifying ages 40, 50, and 60 along with</w:t>
-      </w:r>
-      <w:r>
-        <w:t xml:space="preserve"> clinically meaningful combinations of </w:t>
-      </w:r>
-      <w:r>
-        <w:t xml:space="preserve">significant </w:t>
-      </w:r>
-      <w:r>
-        <w:t>risk factors identified in the multivariable model.</w:t>
-      </w:r>
-    </w:p>
-    <w:p>
-      <w:pPr>
-        <w:rPr>
-          <w:i/>
-          <w:iCs/>
-        </w:rPr>
-      </w:pPr>
-      <w:r>
-        <w:rPr>
-          <w:i/>
-          <w:iCs/>
-        </w:rPr>
-        <w:t xml:space="preserve">“To illustrate the clinical impact of the fitted models, 10-year stroke probabilities will be estimated for five prespecified risk profiles at three selected ages. Predicted risks will be computed separately for men and women. The selected scenarios will represent clinically meaningful combinations of major baseline risk factors, ranging from </w:t>
-      </w:r>
-      <w:proofErr w:type="gramStart"/>
-      <w:r>
-        <w:rPr>
-          <w:i/>
-          <w:iCs/>
-        </w:rPr>
-        <w:t>low-risk</w:t>
-      </w:r>
-      <w:proofErr w:type="gramEnd"/>
-      <w:r>
-        <w:rPr>
-          <w:i/>
-          <w:iCs/>
-        </w:rPr>
-        <w:t xml:space="preserve"> to high-risk profiles”</w:t>
-      </w:r>
-    </w:p>
-    <w:p>
-      <w:r>
-        <w:rPr>
-          <w:highlight w:val="yellow"/>
-        </w:rPr>
-        <w:t>As an additional descriptive aim, the degree of change in key risk factors across the three examination periods will be summarized using means and standard deviations for continuous variables and proportions for categorical variables. This will inform whether a time-varying covariate analysis may be warranted in future work.</w:t>
-      </w:r>
-    </w:p>
-    <w:p>
-      <w:r>
+    </w:p>
+    <w:p>
+      <w:pPr>
+        <w:spacing w:after="240" w:line="480" w:lineRule="auto"/>
+      </w:pPr>
+      <w:r>
+        <w:t xml:space="preserve">To address the secondary research question, </w:t>
+      </w:r>
+      <w:r>
+        <w:t>10</w:t>
+      </w:r>
+      <w:r>
+        <w:t xml:space="preserve">-year stroke probabilities </w:t>
+      </w:r>
+      <w:r>
+        <w:t>will be</w:t>
+      </w:r>
+      <w:r>
+        <w:t xml:space="preserve"> estimated separately for men and women from the fitted Cox proportional hazards models for five prespecified clinical scenarios at ages 40, 50, and 60 years. The scenarios included a baseline profile with no major risk factors, high blood pressure alone, diabetes alone, diabetes with high blood pressure, and current smoking alone. Predicted risk was calculated as one minus the estimated 10-year stroke-free survival probability from the sex-specific Cox models.</w:t>
+      </w:r>
+    </w:p>
+    <w:p>
+      <w:pPr>
+        <w:spacing w:after="240" w:line="480" w:lineRule="auto"/>
+      </w:pPr>
+      <w:r>
+        <w:t xml:space="preserve">As an additional descriptive aim, </w:t>
+      </w:r>
+      <w:r>
+        <w:t>r</w:t>
+      </w:r>
+      <w:r>
+        <w:t>isk factors will be summarized across the three examination periods using means and standard deviations for continuous variables and proportions for categorical variables. These summaries will be calculated separately at each examination period to describe changes in risk factor distributions over time</w:t>
+      </w:r>
+    </w:p>
+    <w:p>
+      <w:pPr>
+        <w:spacing w:after="240" w:line="480" w:lineRule="auto"/>
+      </w:pPr>
+    </w:p>
+    <w:p>
+      <w:pPr>
+        <w:spacing w:after="240" w:line="480" w:lineRule="auto"/>
+      </w:pPr>
+      <w:r>
+        <w:lastRenderedPageBreak/>
         <w:t xml:space="preserve">All analyses </w:t>
       </w:r>
       <w:r>
@@ -838,11 +1212,7 @@
         <w:t xml:space="preserve"> </w:t>
       </w:r>
       <w:r>
-        <w:t xml:space="preserve">Findings will be interpreted under the assumption that </w:t>
-      </w:r>
-      <w:r>
-        <w:lastRenderedPageBreak/>
-        <w:t xml:space="preserve">missingness is at least missing at </w:t>
+        <w:t xml:space="preserve">Findings will be interpreted under the assumption that missingness is at least missing at </w:t>
       </w:r>
       <w:r>
         <w:t>random (MAR), where dropout depends on observed variables</w:t>
@@ -851,8 +1221,6 @@
         <w:t>.</w:t>
       </w:r>
     </w:p>
-    <w:p/>
-    <w:p/>
     <w:p>
       <w:pPr>
         <w:pStyle w:val="Heading2"/>
@@ -860,6 +1228,7 @@
       <w:bookmarkStart w:id="12" w:name="_Toc221895317"/>
       <w:bookmarkStart w:id="13" w:name="_Toc221895382"/>
       <w:bookmarkStart w:id="14" w:name="_Toc222223987"/>
+      <w:bookmarkStart w:id="15" w:name="_Toc227079195"/>
       <w:r>
         <w:t xml:space="preserve">3. </w:t>
       </w:r>
@@ -872,20 +1241,18 @@
       <w:bookmarkEnd w:id="12"/>
       <w:bookmarkEnd w:id="13"/>
       <w:bookmarkEnd w:id="14"/>
+      <w:bookmarkEnd w:id="15"/>
     </w:p>
     <w:p>
       <w:pPr>
         <w:jc w:val="center"/>
       </w:pPr>
       <w:r>
-        <w:rPr>
-          <w:noProof/>
-        </w:rPr>
         <w:drawing>
-          <wp:inline distT="0" distB="0" distL="0" distR="0" wp14:anchorId="3EFE83D0" wp14:editId="66233C42">
-            <wp:extent cx="4874116" cy="6496216"/>
-            <wp:effectExtent l="0" t="0" r="3175" b="0"/>
-            <wp:docPr id="1470798841" name="Picture 1"/>
+          <wp:inline distT="0" distB="0" distL="0" distR="0" wp14:anchorId="6FF7F063" wp14:editId="6B17CCF0">
+            <wp:extent cx="5943600" cy="4904740"/>
+            <wp:effectExtent l="0" t="0" r="0" b="0"/>
+            <wp:docPr id="1643568842" name="Picture 1"/>
             <wp:cNvGraphicFramePr>
               <a:graphicFrameLocks xmlns:a="http://schemas.openxmlformats.org/drawingml/2006/main" noChangeAspect="1"/>
             </wp:cNvGraphicFramePr>
@@ -893,7 +1260,7 @@
               <a:graphicData uri="http://schemas.openxmlformats.org/drawingml/2006/picture">
                 <pic:pic xmlns:pic="http://schemas.openxmlformats.org/drawingml/2006/picture">
                   <pic:nvPicPr>
-                    <pic:cNvPr id="1470798841" name=""/>
+                    <pic:cNvPr id="1643568842" name=""/>
                     <pic:cNvPicPr/>
                   </pic:nvPicPr>
                   <pic:blipFill>
@@ -905,7 +1272,7 @@
                   <pic:spPr>
                     <a:xfrm>
                       <a:off x="0" y="0"/>
-                      <a:ext cx="5047205" cy="6726909"/>
+                      <a:ext cx="5943600" cy="4904740"/>
                     </a:xfrm>
                     <a:prstGeom prst="rect">
                       <a:avLst/>
@@ -927,7 +1294,7 @@
           <w:szCs w:val="21"/>
         </w:rPr>
       </w:pPr>
-      <w:bookmarkStart w:id="15" w:name="_Ref220679477"/>
+      <w:bookmarkStart w:id="16" w:name="_Ref220679477"/>
       <w:r>
         <w:rPr>
           <w:b/>
@@ -936,7 +1303,6 @@
           <w:sz w:val="21"/>
           <w:szCs w:val="21"/>
         </w:rPr>
-        <w:lastRenderedPageBreak/>
         <w:t xml:space="preserve">Table </w:t>
       </w:r>
       <w:r>
@@ -990,7 +1356,7 @@
         </w:rPr>
         <w:fldChar w:fldCharType="end"/>
       </w:r>
-      <w:bookmarkEnd w:id="15"/>
+      <w:bookmarkEnd w:id="16"/>
       <w:r>
         <w:rPr>
           <w:b/>
@@ -1039,12 +1405,21 @@
           <w:sz w:val="21"/>
           <w:szCs w:val="21"/>
         </w:rPr>
+        <w:t xml:space="preserve"> during 10 years of follow-up</w:t>
+      </w:r>
+      <w:r>
+        <w:rPr>
+          <w:color w:val="000000" w:themeColor="text1"/>
+          <w:sz w:val="21"/>
+          <w:szCs w:val="21"/>
+        </w:rPr>
         <w:t>.</w:t>
       </w:r>
     </w:p>
-    <w:p>
-      <w:pPr>
-        <w:spacing w:after="0" w:line="240" w:lineRule="auto"/>
+    <w:p/>
+    <w:p>
+      <w:pPr>
+        <w:spacing w:after="240" w:line="480" w:lineRule="auto"/>
       </w:pPr>
       <w:r>
         <w:t xml:space="preserve">Baseline characteristics of the </w:t>
@@ -1065,97 +1440,95 @@
         <w:t>Table 1</w:t>
       </w:r>
       <w:r>
+        <w:t xml:space="preserve">. </w:t>
+      </w:r>
+      <w:r>
+        <w:t>Smoking</w:t>
+      </w:r>
+      <w:r>
+        <w:t xml:space="preserve"> </w:t>
+      </w:r>
+      <w:r>
+        <w:t xml:space="preserve">status </w:t>
+      </w:r>
+      <w:r>
+        <w:t xml:space="preserve">and </w:t>
+      </w:r>
+      <w:r>
+        <w:t>pre</w:t>
+      </w:r>
+      <w:r>
+        <w:t>-existing</w:t>
+      </w:r>
+      <w:r>
+        <w:t xml:space="preserve"> </w:t>
+      </w:r>
+      <w:r>
+        <w:t>CHD</w:t>
+      </w:r>
+      <w:r>
+        <w:t xml:space="preserve"> </w:t>
+      </w:r>
+      <w:r>
+        <w:t>were</w:t>
+      </w:r>
+      <w:r>
+        <w:t xml:space="preserve"> higher </w:t>
+      </w:r>
+      <w:r>
+        <w:t>among men as compared to women</w:t>
+      </w:r>
+      <w:r>
+        <w:t>.</w:t>
+      </w:r>
+      <w:r>
+        <w:t xml:space="preserve"> Age, systolic </w:t>
+      </w:r>
+      <w:r>
+        <w:t>BP</w:t>
+      </w:r>
+      <w:r>
+        <w:t>, diabetes</w:t>
+      </w:r>
+      <w:r>
+        <w:t xml:space="preserve"> status</w:t>
+      </w:r>
+      <w:r>
         <w:t xml:space="preserve">, </w:t>
       </w:r>
       <w:r>
-        <w:t xml:space="preserve">which shows that </w:t>
-      </w:r>
-      <w:r>
-        <w:t>2.5</w:t>
-      </w:r>
-      <w:r>
-        <w:t xml:space="preserve">% of participants </w:t>
-      </w:r>
-      <w:r>
-        <w:t>experienced a stroke, while 97.5% did not experience the event by the 10yr cutoff</w:t>
-      </w:r>
-      <w:r>
-        <w:t xml:space="preserve">. </w:t>
-      </w:r>
-      <w:r>
-        <w:t>Smoking</w:t>
-      </w:r>
-      <w:r>
-        <w:t xml:space="preserve"> </w:t>
-      </w:r>
-      <w:r>
-        <w:t xml:space="preserve">status </w:t>
-      </w:r>
-      <w:r>
-        <w:t xml:space="preserve">and </w:t>
-      </w:r>
-      <w:r>
-        <w:t>pre</w:t>
-      </w:r>
-      <w:r>
-        <w:t>-existing</w:t>
-      </w:r>
-      <w:r>
-        <w:t xml:space="preserve"> </w:t>
-      </w:r>
-      <w:r>
-        <w:t>CHD</w:t>
-      </w:r>
-      <w:r>
-        <w:t xml:space="preserve"> </w:t>
-      </w:r>
-      <w:r>
-        <w:t>were</w:t>
-      </w:r>
-      <w:r>
-        <w:t xml:space="preserve"> higher </w:t>
-      </w:r>
-      <w:r>
-        <w:t>among men as compared to women</w:t>
+        <w:lastRenderedPageBreak/>
+        <w:t>cholesterol</w:t>
+      </w:r>
+      <w:r>
+        <w:t xml:space="preserve"> levels</w:t>
+      </w:r>
+      <w:r>
+        <w:t>, BP med</w:t>
+      </w:r>
+      <w:r>
+        <w:t>ication</w:t>
+      </w:r>
+      <w:r>
+        <w:t xml:space="preserve"> use</w:t>
+      </w:r>
+      <w:r>
+        <w:t xml:space="preserve">, and BMI </w:t>
+      </w:r>
+      <w:r>
+        <w:t>showed no practically meaningful differences between men and women</w:t>
       </w:r>
       <w:r>
         <w:t>.</w:t>
       </w:r>
       <w:r>
-        <w:t xml:space="preserve"> Age, systolic </w:t>
-      </w:r>
-      <w:r>
-        <w:t>BP</w:t>
-      </w:r>
-      <w:r>
-        <w:t>, diabetes</w:t>
-      </w:r>
-      <w:r>
-        <w:t xml:space="preserve"> status</w:t>
-      </w:r>
-      <w:r>
-        <w:t>, cholesterol</w:t>
-      </w:r>
-      <w:r>
-        <w:t xml:space="preserve"> levels</w:t>
-      </w:r>
-      <w:r>
-        <w:t>, BP med</w:t>
-      </w:r>
-      <w:r>
-        <w:t>ication</w:t>
-      </w:r>
-      <w:r>
-        <w:t xml:space="preserve"> use</w:t>
-      </w:r>
-      <w:r>
-        <w:t xml:space="preserve">, and BMI </w:t>
-      </w:r>
-      <w:r>
-        <w:t>showed no practically meaningful differences between men and women</w:t>
-      </w:r>
-      <w:r>
-        <w:t>.</w:t>
+        <w:t xml:space="preserve"> During the 10 years of follow-</w:t>
+      </w:r>
+      <w:r>
+        <w:rPr>
+          <w:highlight w:val="yellow"/>
+        </w:rPr>
+        <w:t>up, 111 stroke events</w:t>
       </w:r>
     </w:p>
     <w:p/>
@@ -1368,7 +1741,7 @@
           <w:sz w:val="21"/>
           <w:szCs w:val="21"/>
         </w:rPr>
-        <w:t>2</w:t>
+        <w:t>1</w:t>
       </w:r>
       <w:r>
         <w:rPr>
@@ -1482,15 +1855,553 @@
     </w:p>
     <w:p/>
     <w:p>
+      <w:r>
+        <w:t>Several predictors, including diabetes, smoking, blood pressure medication use, and prevalent coronary heart disease, were not statistically significant in the multivariable models. This is likely due in part to the relatively low number of stroke events, particularly within subgroups such as individuals with prevalent coronary heart disease, resulting in limited statistical power and wide confidence intervals. Notably, point estimates for several of these variables suggest potentially meaningful associations despite the lack of statistical significance.</w:t>
+      </w:r>
+    </w:p>
+    <w:p/>
+    <w:p>
+      <w:pPr>
+        <w:spacing w:after="160" w:line="278" w:lineRule="auto"/>
+      </w:pPr>
+      <w:r>
+        <w:t>The direction and magnitude of several effect estimates were consistent with established clinical risk factors, suggesting that lack of statistical significance may reflect limited power rather than absence of association.</w:t>
+      </w:r>
+    </w:p>
+    <w:p/>
+    <w:p>
+      <w:pPr>
+        <w:pStyle w:val="Heading4"/>
+      </w:pPr>
+      <w:r>
+        <w:lastRenderedPageBreak/>
+        <w:t>3.</w:t>
+      </w:r>
+      <w:r>
+        <w:t>1</w:t>
+      </w:r>
+      <w:r>
+        <w:t xml:space="preserve"> </w:t>
+      </w:r>
+      <w:r>
+        <w:t>Risk Factors of Stroke</w:t>
+      </w:r>
+    </w:p>
+    <w:p>
+      <w:pPr>
+        <w:spacing w:after="160" w:line="278" w:lineRule="auto"/>
+      </w:pPr>
+      <w:r>
+        <w:t>Results from stepwise procedures, indicated that only smoking status was a significant predictor of stroke. However, b</w:t>
+      </w:r>
+      <w:r>
+        <w:t>ased on prior literature</w:t>
+      </w:r>
+      <w:r>
+        <w:t xml:space="preserve"> and </w:t>
+      </w:r>
+      <w:r>
+        <w:t>the Framingham Stroke Risk Profile</w:t>
+      </w:r>
+      <w:r>
+        <w:t xml:space="preserve"> report</w:t>
+      </w:r>
+      <w:r>
+        <w:t xml:space="preserve">, an interaction between systolic blood pressure and </w:t>
+      </w:r>
+      <w:r>
+        <w:t>blood pressure medication</w:t>
+      </w:r>
+      <w:r>
+        <w:t xml:space="preserve"> and prevalence of cardiovascular disease</w:t>
+      </w:r>
+      <w:r>
+        <w:t xml:space="preserve"> use</w:t>
+      </w:r>
+      <w:r>
+        <w:t xml:space="preserve"> was </w:t>
+      </w:r>
+      <w:r>
+        <w:t xml:space="preserve">included </w:t>
+      </w:r>
+      <w:r>
+        <w:t xml:space="preserve">in the models </w:t>
+      </w:r>
+      <w:r>
+        <w:t>regardless of significance</w:t>
+      </w:r>
+      <w:r>
+        <w:t xml:space="preserve"> due to clinical </w:t>
+      </w:r>
+      <w:r>
+        <w:t>significance</w:t>
+      </w:r>
+      <w:r>
+        <w:t>. Th</w:t>
+      </w:r>
+      <w:r>
+        <w:t xml:space="preserve">e </w:t>
+      </w:r>
+      <w:r>
+        <w:t>term</w:t>
+      </w:r>
+      <w:r>
+        <w:t>s were</w:t>
+      </w:r>
+      <w:r>
+        <w:t xml:space="preserve"> evaluated within </w:t>
+      </w:r>
+      <w:r>
+        <w:t xml:space="preserve">each </w:t>
+      </w:r>
+      <w:r>
+        <w:t>sex-specific Cox models.</w:t>
+      </w:r>
+    </w:p>
+    <w:p>
+      <w:pPr>
+        <w:spacing w:after="160" w:line="278" w:lineRule="auto"/>
+        <w:rPr>
+          <w:rFonts w:asciiTheme="minorHAnsi" w:eastAsiaTheme="minorHAnsi" w:hAnsiTheme="minorHAnsi" w:cstheme="minorBidi"/>
+          <w:kern w:val="2"/>
+          <w14:ligatures w14:val="standardContextual"/>
+        </w:rPr>
+      </w:pPr>
+    </w:p>
+    <w:p>
+      <w:r>
+        <w:drawing>
+          <wp:inline distT="0" distB="0" distL="0" distR="0" wp14:anchorId="52AB9347" wp14:editId="71CEDCA8">
+            <wp:extent cx="5943600" cy="2291080"/>
+            <wp:effectExtent l="0" t="0" r="0" b="0"/>
+            <wp:docPr id="410048960" name="Picture 1"/>
+            <wp:cNvGraphicFramePr>
+              <a:graphicFrameLocks xmlns:a="http://schemas.openxmlformats.org/drawingml/2006/main" noChangeAspect="1"/>
+            </wp:cNvGraphicFramePr>
+            <a:graphic xmlns:a="http://schemas.openxmlformats.org/drawingml/2006/main">
+              <a:graphicData uri="http://schemas.openxmlformats.org/drawingml/2006/picture">
+                <pic:pic xmlns:pic="http://schemas.openxmlformats.org/drawingml/2006/picture">
+                  <pic:nvPicPr>
+                    <pic:cNvPr id="410048960" name=""/>
+                    <pic:cNvPicPr/>
+                  </pic:nvPicPr>
+                  <pic:blipFill>
+                    <a:blip r:embed="rId11"/>
+                    <a:stretch>
+                      <a:fillRect/>
+                    </a:stretch>
+                  </pic:blipFill>
+                  <pic:spPr>
+                    <a:xfrm>
+                      <a:off x="0" y="0"/>
+                      <a:ext cx="5943600" cy="2291080"/>
+                    </a:xfrm>
+                    <a:prstGeom prst="rect">
+                      <a:avLst/>
+                    </a:prstGeom>
+                  </pic:spPr>
+                </pic:pic>
+              </a:graphicData>
+            </a:graphic>
+          </wp:inline>
+        </w:drawing>
+      </w:r>
+    </w:p>
+    <w:p>
+      <w:pPr>
+        <w:pStyle w:val="Caption"/>
+        <w:rPr>
+          <w:color w:val="000000" w:themeColor="text1"/>
+          <w:sz w:val="21"/>
+          <w:szCs w:val="21"/>
+        </w:rPr>
+      </w:pPr>
+      <w:r>
+        <w:rPr>
+          <w:b/>
+          <w:bCs/>
+          <w:color w:val="000000" w:themeColor="text1"/>
+          <w:sz w:val="21"/>
+          <w:szCs w:val="21"/>
+        </w:rPr>
+        <w:t xml:space="preserve"> </w:t>
+      </w:r>
+      <w:r>
+        <w:rPr>
+          <w:b/>
+          <w:bCs/>
+          <w:color w:val="000000" w:themeColor="text1"/>
+          <w:sz w:val="21"/>
+          <w:szCs w:val="21"/>
+        </w:rPr>
+        <w:t xml:space="preserve">Table </w:t>
+      </w:r>
+      <w:r>
+        <w:rPr>
+          <w:b/>
+          <w:bCs/>
+          <w:color w:val="000000" w:themeColor="text1"/>
+          <w:sz w:val="21"/>
+          <w:szCs w:val="21"/>
+        </w:rPr>
+        <w:t>2</w:t>
+      </w:r>
+      <w:r>
+        <w:rPr>
+          <w:color w:val="000000" w:themeColor="text1"/>
+          <w:sz w:val="21"/>
+          <w:szCs w:val="21"/>
+        </w:rPr>
+        <w:t xml:space="preserve">.  </w:t>
+      </w:r>
+      <w:r>
+        <w:rPr>
+          <w:rFonts w:asciiTheme="minorHAnsi" w:eastAsiaTheme="minorHAnsi" w:hAnsiTheme="minorHAnsi" w:cstheme="minorBidi"/>
+          <w:color w:val="000000" w:themeColor="text1"/>
+          <w:kern w:val="2"/>
+          <w:sz w:val="21"/>
+          <w:szCs w:val="21"/>
+          <w14:ligatures w14:val="standardContextual"/>
+        </w:rPr>
+        <w:t xml:space="preserve">Sex-specific Cox proportional hazards models for 10-year stroke risk. Hazard ratios (95% CI; p-value) and percent change in hazard are shown for each </w:t>
+      </w:r>
+      <w:r>
+        <w:rPr>
+          <w:color w:val="000000" w:themeColor="text1"/>
+          <w:sz w:val="21"/>
+          <w:szCs w:val="21"/>
+        </w:rPr>
+        <w:t>risk facto</w:t>
+      </w:r>
+      <w:r>
+        <w:rPr>
+          <w:rFonts w:asciiTheme="minorHAnsi" w:eastAsiaTheme="minorHAnsi" w:hAnsiTheme="minorHAnsi" w:cstheme="minorBidi"/>
+          <w:color w:val="000000" w:themeColor="text1"/>
+          <w:kern w:val="2"/>
+          <w:sz w:val="21"/>
+          <w:szCs w:val="21"/>
+          <w14:ligatures w14:val="standardContextual"/>
+        </w:rPr>
+        <w:t>r. Continuous variables are scaled as indicated, and categorical variables are compared to their reference groups</w:t>
+      </w:r>
+      <w:r>
+        <w:rPr>
+          <w:color w:val="000000" w:themeColor="text1"/>
+          <w:sz w:val="21"/>
+          <w:szCs w:val="21"/>
+        </w:rPr>
+        <w:t>.</w:t>
+      </w:r>
+    </w:p>
+    <w:p>
+      <w:pPr>
+        <w:spacing w:after="160" w:line="278" w:lineRule="auto"/>
+      </w:pPr>
+      <w:r>
+        <w:t xml:space="preserve">In sex-stratified Cox models, </w:t>
+      </w:r>
+      <w:r>
+        <w:rPr>
+          <w:rFonts w:eastAsiaTheme="majorEastAsia"/>
+        </w:rPr>
+        <w:t>age and systolic blood pressure</w:t>
+      </w:r>
+      <w:r>
+        <w:t xml:space="preserve"> were </w:t>
+      </w:r>
+      <w:r>
+        <w:t xml:space="preserve">identified as major risk factors </w:t>
+      </w:r>
+      <w:r>
+        <w:t xml:space="preserve">of stroke in both men and women. </w:t>
+      </w:r>
+      <w:r>
+        <w:t>Systolic BP</w:t>
+      </w:r>
+      <w:r>
+        <w:t xml:space="preserve"> showed a 28% increase in hazard per 10 mmHg in women and 41% in men.</w:t>
+      </w:r>
+    </w:p>
+    <w:p>
+      <w:pPr>
+        <w:spacing w:after="160" w:line="278" w:lineRule="auto"/>
+      </w:pPr>
+      <w:r>
+        <w:rPr>
+          <w:rFonts w:eastAsiaTheme="majorEastAsia"/>
+        </w:rPr>
+        <w:t>Diabetes</w:t>
+      </w:r>
+      <w:r>
+        <w:t xml:space="preserve">, </w:t>
+      </w:r>
+      <w:r>
+        <w:rPr>
+          <w:rFonts w:eastAsiaTheme="majorEastAsia"/>
+        </w:rPr>
+        <w:t>current smoking</w:t>
+      </w:r>
+      <w:r>
+        <w:t xml:space="preserve"> status, and interaction </w:t>
+      </w:r>
+      <w:r>
+        <w:t xml:space="preserve">between </w:t>
+      </w:r>
+      <w:r>
+        <w:rPr>
+          <w:rFonts w:eastAsiaTheme="majorEastAsia"/>
+        </w:rPr>
+        <w:t>systolic blood pressure and blood pressure medication</w:t>
+      </w:r>
+      <w:r>
+        <w:t xml:space="preserve"> were associated with increased stroke risk</w:t>
+      </w:r>
+      <w:r>
+        <w:t xml:space="preserve"> for</w:t>
+      </w:r>
+      <w:r>
+        <w:t xml:space="preserve"> men but not women. </w:t>
+      </w:r>
+      <w:r>
+        <w:rPr>
+          <w:rFonts w:eastAsiaTheme="majorEastAsia"/>
+        </w:rPr>
+        <w:t>Cardiovascular disease</w:t>
+      </w:r>
+      <w:r>
+        <w:t xml:space="preserve"> showed positive but non-significant associations in both sexes. The lack of statistical significance</w:t>
+      </w:r>
+      <w:r>
+        <w:t xml:space="preserve"> </w:t>
+      </w:r>
+      <w:r>
+        <w:t xml:space="preserve">for several </w:t>
+      </w:r>
+      <w:r>
+        <w:t>risk factors</w:t>
+      </w:r>
+      <w:r>
+        <w:t xml:space="preserve"> likely reflects limited power due to the relatively small number of stroke events</w:t>
+      </w:r>
+      <w:r>
+        <w:t xml:space="preserve"> </w:t>
+      </w:r>
+      <w:r>
+        <w:t xml:space="preserve">within each stratification. This was highlighted in </w:t>
+      </w:r>
+      <w:r>
+        <w:rPr>
+          <w:b/>
+          <w:bCs/>
+        </w:rPr>
+        <w:t>Figure 1</w:t>
+      </w:r>
+      <w:r>
+        <w:t>, where limited follow-up for some risk factors.</w:t>
+      </w:r>
+    </w:p>
+    <w:p/>
+    <w:p>
+      <w:pPr>
+        <w:pStyle w:val="Heading4"/>
+      </w:pPr>
+      <w:r>
+        <w:t>3.</w:t>
+      </w:r>
+      <w:r>
+        <w:t>2</w:t>
+      </w:r>
+      <w:r>
+        <w:t xml:space="preserve"> </w:t>
+      </w:r>
+      <w:r>
+        <w:t>10-year Probability of Stroke by Risk Profile</w:t>
+      </w:r>
+    </w:p>
+    <w:p/>
+    <w:p/>
+    <w:p/>
+    <w:p>
+      <w:r>
+        <w:t xml:space="preserve">The estimated 10-year probabilities of stroke were low for individuals without </w:t>
+      </w:r>
+      <w:r>
+        <w:t xml:space="preserve">any </w:t>
+      </w:r>
+      <w:r>
+        <w:t>major risk factors, reflecting the relatively low incidence of stroke in this cohort over a 10-year period. Predicted risk increased with age and the presence of risk factors</w:t>
+      </w:r>
+      <w:r>
+        <w:t xml:space="preserve"> in both men and women. The </w:t>
+      </w:r>
+      <w:r>
+        <w:t xml:space="preserve">highest risks </w:t>
+      </w:r>
+      <w:r>
+        <w:t xml:space="preserve">were </w:t>
+      </w:r>
+      <w:r>
+        <w:t xml:space="preserve">observed among individuals with </w:t>
+      </w:r>
+      <w:r>
+        <w:t xml:space="preserve">multiple risk factors, particularly for men, </w:t>
+      </w:r>
+      <w:r>
+        <w:lastRenderedPageBreak/>
+        <w:t xml:space="preserve">where having </w:t>
+      </w:r>
+      <w:r>
+        <w:t>diabetes</w:t>
+      </w:r>
+      <w:r>
+        <w:t xml:space="preserve">, </w:t>
+      </w:r>
+      <w:r>
+        <w:t>elevated blood pressure</w:t>
+      </w:r>
+      <w:r>
+        <w:t xml:space="preserve">, and </w:t>
+      </w:r>
+      <w:r>
+        <w:t>being a</w:t>
+      </w:r>
+      <w:r>
+        <w:t xml:space="preserve"> current smoker</w:t>
+      </w:r>
+      <w:r>
+        <w:t xml:space="preserve"> resulted in the highest probabilities</w:t>
+      </w:r>
+      <w:r>
+        <w:t>.</w:t>
+      </w:r>
+    </w:p>
+    <w:p>
+      <w:pPr>
+        <w:rPr>
+          <w:rFonts w:asciiTheme="minorHAnsi" w:eastAsiaTheme="minorHAnsi" w:hAnsiTheme="minorHAnsi" w:cstheme="minorBidi"/>
+          <w:kern w:val="2"/>
+          <w14:ligatures w14:val="standardContextual"/>
+        </w:rPr>
+      </w:pPr>
+    </w:p>
+    <w:p>
+      <w:pPr>
+        <w:pStyle w:val="Caption"/>
+        <w:rPr>
+          <w:rFonts w:asciiTheme="minorHAnsi" w:eastAsiaTheme="minorHAnsi" w:hAnsiTheme="minorHAnsi" w:cstheme="minorBidi"/>
+          <w:color w:val="000000" w:themeColor="text1"/>
+          <w:kern w:val="2"/>
+          <w:sz w:val="21"/>
+          <w:szCs w:val="21"/>
+          <w14:ligatures w14:val="standardContextual"/>
+        </w:rPr>
+      </w:pPr>
+      <w:r>
+        <w:rPr>
+          <w:b/>
+          <w:bCs/>
+          <w:color w:val="000000" w:themeColor="text1"/>
+          <w:sz w:val="21"/>
+          <w:szCs w:val="21"/>
+        </w:rPr>
+        <w:t xml:space="preserve">Table </w:t>
+      </w:r>
+      <w:r>
+        <w:rPr>
+          <w:b/>
+          <w:bCs/>
+          <w:color w:val="000000" w:themeColor="text1"/>
+          <w:sz w:val="21"/>
+          <w:szCs w:val="21"/>
+        </w:rPr>
+        <w:t>2</w:t>
+      </w:r>
+      <w:r>
+        <w:rPr>
+          <w:color w:val="000000" w:themeColor="text1"/>
+          <w:sz w:val="21"/>
+          <w:szCs w:val="21"/>
+        </w:rPr>
+        <w:t xml:space="preserve">.  </w:t>
+      </w:r>
+      <w:r>
+        <w:rPr>
+          <w:rFonts w:asciiTheme="minorHAnsi" w:eastAsiaTheme="minorHAnsi" w:hAnsiTheme="minorHAnsi" w:cstheme="minorBidi"/>
+          <w:color w:val="000000" w:themeColor="text1"/>
+          <w:kern w:val="2"/>
+          <w:sz w:val="21"/>
+          <w:szCs w:val="21"/>
+          <w14:ligatures w14:val="standardContextual"/>
+        </w:rPr>
+        <w:t>Predicted 10-year stroke risk (%) by age, sex, and risk profile from sex-specific Cox models. Risk profiles include baseline, high blood pressure, diabetes, diabetes with high blood pressure, and combined smoking, diabetes, and high blood pressure, with other factors held constant at reference levels</w:t>
+      </w:r>
+      <w:r>
+        <w:rPr>
+          <w:color w:val="000000" w:themeColor="text1"/>
+          <w:sz w:val="21"/>
+          <w:szCs w:val="21"/>
+        </w:rPr>
+        <w:t xml:space="preserve"> (absent of disease)</w:t>
+      </w:r>
+      <w:r>
+        <w:rPr>
+          <w:rFonts w:asciiTheme="minorHAnsi" w:eastAsiaTheme="minorHAnsi" w:hAnsiTheme="minorHAnsi" w:cstheme="minorBidi"/>
+          <w:color w:val="000000" w:themeColor="text1"/>
+          <w:kern w:val="2"/>
+          <w:sz w:val="21"/>
+          <w:szCs w:val="21"/>
+          <w14:ligatures w14:val="standardContextual"/>
+        </w:rPr>
+        <w:t>.</w:t>
+      </w:r>
+    </w:p>
+    <w:p>
+      <w:pPr>
+        <w:pStyle w:val="Caption"/>
+        <w:rPr>
+          <w:color w:val="000000" w:themeColor="text1"/>
+          <w:sz w:val="21"/>
+          <w:szCs w:val="21"/>
+        </w:rPr>
+      </w:pPr>
+    </w:p>
+    <w:p>
+      <w:pPr>
+        <w:rPr>
+          <w:rFonts w:asciiTheme="minorHAnsi" w:eastAsiaTheme="minorHAnsi" w:hAnsiTheme="minorHAnsi" w:cstheme="minorBidi"/>
+          <w:kern w:val="2"/>
+          <w14:ligatures w14:val="standardContextual"/>
+        </w:rPr>
+      </w:pPr>
+    </w:p>
+    <w:p/>
+    <w:p>
       <w:pPr>
         <w:pStyle w:val="Heading2"/>
       </w:pPr>
-      <w:bookmarkStart w:id="16" w:name="_Toc221022976"/>
+      <w:bookmarkStart w:id="17" w:name="_Toc221022976"/>
+      <w:bookmarkStart w:id="18" w:name="_Toc227079196"/>
       <w:r>
         <w:t>4. Discussion</w:t>
       </w:r>
-      <w:bookmarkEnd w:id="16"/>
-    </w:p>
+      <w:bookmarkEnd w:id="17"/>
+      <w:bookmarkEnd w:id="18"/>
+    </w:p>
+    <w:p>
+      <w:r>
+        <w:t xml:space="preserve">High blood pressure (hypertension) was identified as the largest risk factor </w:t>
+      </w:r>
+      <w:r>
+        <w:t>of</w:t>
+      </w:r>
+      <w:r>
+        <w:t xml:space="preserve"> stroke</w:t>
+      </w:r>
+      <w:r>
+        <w:t xml:space="preserve"> for both women and men.</w:t>
+      </w:r>
+    </w:p>
+    <w:p/>
     <w:p>
       <w:pPr>
         <w:pStyle w:val="Heading4"/>
@@ -1528,40 +2439,88 @@
       <w:pPr>
         <w:pStyle w:val="Heading2"/>
       </w:pPr>
-      <w:r>
-        <w:lastRenderedPageBreak/>
+      <w:bookmarkStart w:id="19" w:name="_Toc227079197"/>
+      <w:r>
         <w:t>References</w:t>
       </w:r>
-    </w:p>
-    <w:p>
-      <w:pPr>
-        <w:rPr>
-          <w:color w:val="000000" w:themeColor="text1"/>
-        </w:rPr>
-      </w:pPr>
-      <w:r>
-        <w:rPr>
-          <w:color w:val="000000" w:themeColor="text1"/>
-        </w:rPr>
+      <w:bookmarkEnd w:id="19"/>
+    </w:p>
+    <w:p>
+      <w:r>
         <w:t>ChatGPT was used to check R code errors for some of the packages used and to grammar check (OpenAI, 2025).</w:t>
       </w:r>
     </w:p>
+    <w:p>
+      <w:pPr>
+        <w:pStyle w:val="p1"/>
+      </w:pPr>
+      <w:r>
+        <w:t xml:space="preserve">Li, J., Hu, K., Lu, X., Nayak, S. N., Bautista Sotelo, C., Lodato, M. A., Liu, W., &amp; Zhu, L. J. (2026). </w:t>
+      </w:r>
+      <w:proofErr w:type="spellStart"/>
+      <w:r>
+        <w:rPr>
+          <w:i/>
+          <w:iCs/>
+        </w:rPr>
+        <w:t>StepReg</w:t>
+      </w:r>
+      <w:proofErr w:type="spellEnd"/>
+      <w:r>
+        <w:rPr>
+          <w:i/>
+          <w:iCs/>
+        </w:rPr>
+        <w:t>: Stepwise regression analysis (Version 1.6.2) [R package vignette]</w:t>
+      </w:r>
+      <w:r>
+        <w:t xml:space="preserve">. Comprehensive R Archive Network. </w:t>
+      </w:r>
+      <w:hyperlink r:id="rId12" w:history="1">
+        <w:r>
+          <w:rPr>
+            <w:rStyle w:val="Hyperlink"/>
+          </w:rPr>
+          <w:t>https://cran.rproject.org/web/packages/StepReg/vignettes/StepReg.html</w:t>
+        </w:r>
+      </w:hyperlink>
+    </w:p>
+    <w:p>
+      <w:pPr>
+        <w:pStyle w:val="p1"/>
+      </w:pPr>
+      <w:r>
+        <w:t xml:space="preserve">Wolf, P. A., D’Agostino, R. B., Belanger, A. J., &amp; Kannel, W. B. (1991). Probability of stroke: A risk profile from the Framingham Study. </w:t>
+      </w:r>
+      <w:r>
+        <w:rPr>
+          <w:i/>
+          <w:iCs/>
+        </w:rPr>
+        <w:t>Stroke, 22</w:t>
+      </w:r>
+      <w:r>
+        <w:t>(3), 312–318.</w:t>
+      </w:r>
+    </w:p>
     <w:p/>
     <w:p>
       <w:pPr>
         <w:pStyle w:val="Heading2"/>
       </w:pPr>
-      <w:bookmarkStart w:id="17" w:name="_Toc221022978"/>
+      <w:bookmarkStart w:id="20" w:name="_Toc221022978"/>
+      <w:bookmarkStart w:id="21" w:name="_Toc227079198"/>
       <w:r>
         <w:t>Reproducibility Statement</w:t>
       </w:r>
-      <w:bookmarkEnd w:id="17"/>
+      <w:bookmarkEnd w:id="20"/>
+      <w:bookmarkEnd w:id="21"/>
     </w:p>
     <w:p>
       <w:r>
         <w:t xml:space="preserve">The statistical code used in this analysis is available on my GitHub under the Code directory at: </w:t>
       </w:r>
-      <w:hyperlink r:id="rId11" w:history="1">
+      <w:hyperlink r:id="rId13" w:history="1">
         <w:r>
           <w:rPr>
             <w:rStyle w:val="Hyperlink"/>
@@ -1570,11 +2529,13 @@
         </w:r>
       </w:hyperlink>
     </w:p>
+    <w:p/>
     <w:p>
       <w:r>
         <w:t>Raw data are not tracked in this repository and is available upon request.</w:t>
       </w:r>
     </w:p>
+    <w:p/>
     <w:p>
       <w:r>
         <w:t>Link to data on local drive: /Users/ryan_summers/GitHub/BIOS6624-Class/Project</w:t>
@@ -2489,6 +3450,15 @@
   <w:style w:type="paragraph" w:default="1" w:styleId="Normal">
     <w:name w:val="Normal"/>
     <w:qFormat/>
+    <w:rsid w:val="00496AE5"/>
+    <w:pPr>
+      <w:spacing w:after="0" w:line="240" w:lineRule="auto"/>
+    </w:pPr>
+    <w:rPr>
+      <w:rFonts w:ascii="Times New Roman" w:eastAsia="Times New Roman" w:hAnsi="Times New Roman" w:cs="Times New Roman"/>
+      <w:kern w:val="0"/>
+      <w14:ligatures w14:val="none"/>
+    </w:rPr>
   </w:style>
   <w:style w:type="paragraph" w:styleId="Heading1">
     <w:name w:val="heading 1"/>
@@ -2611,7 +3581,7 @@
     <w:pPr>
       <w:keepNext/>
       <w:keepLines/>
-      <w:spacing w:before="40" w:after="0"/>
+      <w:spacing w:before="40"/>
       <w:outlineLvl w:val="5"/>
     </w:pPr>
     <w:rPr>
@@ -2634,7 +3604,7 @@
     <w:pPr>
       <w:keepNext/>
       <w:keepLines/>
-      <w:spacing w:before="40" w:after="0"/>
+      <w:spacing w:before="40"/>
       <w:outlineLvl w:val="6"/>
     </w:pPr>
     <w:rPr>
@@ -2655,7 +3625,6 @@
     <w:pPr>
       <w:keepNext/>
       <w:keepLines/>
-      <w:spacing w:after="0"/>
       <w:outlineLvl w:val="7"/>
     </w:pPr>
     <w:rPr>
@@ -2678,7 +3647,6 @@
     <w:pPr>
       <w:keepNext/>
       <w:keepLines/>
-      <w:spacing w:after="0"/>
       <w:outlineLvl w:val="8"/>
     </w:pPr>
     <w:rPr>
@@ -2689,7 +3657,6 @@
   <w:style w:type="character" w:default="1" w:styleId="DefaultParagraphFont">
     <w:name w:val="Default Paragraph Font"/>
     <w:uiPriority w:val="1"/>
-    <w:semiHidden/>
     <w:unhideWhenUsed/>
   </w:style>
   <w:style w:type="table" w:default="1" w:styleId="TableNormal">
@@ -2838,7 +3805,7 @@
     <w:qFormat/>
     <w:rsid w:val="00FB74D0"/>
     <w:pPr>
-      <w:spacing w:after="80" w:line="240" w:lineRule="auto"/>
+      <w:spacing w:after="80"/>
       <w:contextualSpacing/>
     </w:pPr>
     <w:rPr>
@@ -3008,13 +3975,8 @@
     <w:unhideWhenUsed/>
     <w:rsid w:val="006D1CA8"/>
     <w:pPr>
-      <w:spacing w:before="100" w:beforeAutospacing="1" w:after="100" w:afterAutospacing="1" w:line="240" w:lineRule="auto"/>
+      <w:spacing w:before="100" w:beforeAutospacing="1" w:after="100" w:afterAutospacing="1"/>
     </w:pPr>
-    <w:rPr>
-      <w:rFonts w:ascii="Times New Roman" w:eastAsia="Times New Roman" w:hAnsi="Times New Roman" w:cs="Times New Roman"/>
-      <w:kern w:val="0"/>
-      <w14:ligatures w14:val="none"/>
-    </w:rPr>
   </w:style>
   <w:style w:type="character" w:customStyle="1" w:styleId="apple-converted-space">
     <w:name w:val="apple-converted-space"/>
@@ -3054,7 +4016,7 @@
     <w:qFormat/>
     <w:rsid w:val="0002461F"/>
     <w:pPr>
-      <w:spacing w:after="200" w:line="240" w:lineRule="auto"/>
+      <w:spacing w:after="200"/>
     </w:pPr>
     <w:rPr>
       <w:i/>
@@ -3117,10 +4079,8 @@
     <w:rPr>
       <w:b/>
       <w:bCs/>
-      <w:kern w:val="0"/>
       <w:sz w:val="28"/>
       <w:szCs w:val="28"/>
-      <w14:ligatures w14:val="none"/>
     </w:rPr>
   </w:style>
   <w:style w:type="paragraph" w:styleId="TOC2">
@@ -3132,10 +4092,11 @@
     <w:unhideWhenUsed/>
     <w:rsid w:val="00A65C67"/>
     <w:pPr>
-      <w:spacing w:before="120" w:after="0"/>
+      <w:spacing w:before="120"/>
       <w:ind w:left="240"/>
     </w:pPr>
     <w:rPr>
+      <w:rFonts w:asciiTheme="minorHAnsi" w:hAnsiTheme="minorHAnsi"/>
       <w:b/>
       <w:bCs/>
       <w:sz w:val="22"/>
@@ -3152,9 +4113,10 @@
     <w:unhideWhenUsed/>
     <w:rsid w:val="00A65C67"/>
     <w:pPr>
-      <w:spacing w:before="120" w:after="0"/>
+      <w:spacing w:before="120"/>
     </w:pPr>
     <w:rPr>
+      <w:rFonts w:asciiTheme="minorHAnsi" w:hAnsiTheme="minorHAnsi"/>
       <w:b/>
       <w:bCs/>
       <w:i/>
@@ -3171,10 +4133,10 @@
     <w:unhideWhenUsed/>
     <w:rsid w:val="00A65C67"/>
     <w:pPr>
-      <w:spacing w:after="0"/>
       <w:ind w:left="480"/>
     </w:pPr>
     <w:rPr>
+      <w:rFonts w:asciiTheme="minorHAnsi" w:hAnsiTheme="minorHAnsi"/>
       <w:sz w:val="20"/>
       <w:szCs w:val="20"/>
     </w:rPr>
@@ -3189,10 +4151,10 @@
     <w:unhideWhenUsed/>
     <w:rsid w:val="00A65C67"/>
     <w:pPr>
-      <w:spacing w:after="0"/>
       <w:ind w:left="720"/>
     </w:pPr>
     <w:rPr>
+      <w:rFonts w:asciiTheme="minorHAnsi" w:hAnsiTheme="minorHAnsi"/>
       <w:sz w:val="20"/>
       <w:szCs w:val="20"/>
     </w:rPr>
@@ -3207,10 +4169,10 @@
     <w:unhideWhenUsed/>
     <w:rsid w:val="00A65C67"/>
     <w:pPr>
-      <w:spacing w:after="0"/>
       <w:ind w:left="960"/>
     </w:pPr>
     <w:rPr>
+      <w:rFonts w:asciiTheme="minorHAnsi" w:hAnsiTheme="minorHAnsi"/>
       <w:sz w:val="20"/>
       <w:szCs w:val="20"/>
     </w:rPr>
@@ -3225,10 +4187,10 @@
     <w:unhideWhenUsed/>
     <w:rsid w:val="00A65C67"/>
     <w:pPr>
-      <w:spacing w:after="0"/>
       <w:ind w:left="1200"/>
     </w:pPr>
     <w:rPr>
+      <w:rFonts w:asciiTheme="minorHAnsi" w:hAnsiTheme="minorHAnsi"/>
       <w:sz w:val="20"/>
       <w:szCs w:val="20"/>
     </w:rPr>
@@ -3243,10 +4205,10 @@
     <w:unhideWhenUsed/>
     <w:rsid w:val="00A65C67"/>
     <w:pPr>
-      <w:spacing w:after="0"/>
       <w:ind w:left="1440"/>
     </w:pPr>
     <w:rPr>
+      <w:rFonts w:asciiTheme="minorHAnsi" w:hAnsiTheme="minorHAnsi"/>
       <w:sz w:val="20"/>
       <w:szCs w:val="20"/>
     </w:rPr>
@@ -3261,10 +4223,10 @@
     <w:unhideWhenUsed/>
     <w:rsid w:val="00A65C67"/>
     <w:pPr>
-      <w:spacing w:after="0"/>
       <w:ind w:left="1680"/>
     </w:pPr>
     <w:rPr>
+      <w:rFonts w:asciiTheme="minorHAnsi" w:hAnsiTheme="minorHAnsi"/>
       <w:sz w:val="20"/>
       <w:szCs w:val="20"/>
     </w:rPr>
@@ -3279,10 +4241,10 @@
     <w:unhideWhenUsed/>
     <w:rsid w:val="00A65C67"/>
     <w:pPr>
-      <w:spacing w:after="0"/>
       <w:ind w:left="1920"/>
     </w:pPr>
     <w:rPr>
+      <w:rFonts w:asciiTheme="minorHAnsi" w:hAnsiTheme="minorHAnsi"/>
       <w:sz w:val="20"/>
       <w:szCs w:val="20"/>
     </w:rPr>
@@ -3292,13 +4254,8 @@
     <w:basedOn w:val="Normal"/>
     <w:rsid w:val="00525D92"/>
     <w:pPr>
-      <w:spacing w:before="100" w:beforeAutospacing="1" w:after="100" w:afterAutospacing="1" w:line="240" w:lineRule="auto"/>
+      <w:spacing w:before="100" w:beforeAutospacing="1" w:after="100" w:afterAutospacing="1"/>
     </w:pPr>
-    <w:rPr>
-      <w:rFonts w:ascii="Times New Roman" w:eastAsia="Times New Roman" w:hAnsi="Times New Roman" w:cs="Times New Roman"/>
-      <w:kern w:val="0"/>
-      <w14:ligatures w14:val="none"/>
-    </w:rPr>
   </w:style>
   <w:style w:type="character" w:customStyle="1" w:styleId="s1">
     <w:name w:val="s1"/>

</xml_diff>

<commit_message>
Added background information to each model. Final report has been completely written and now just needs to be reviewed for accuracy/grammar.
</commit_message>
<xml_diff>
--- a/Project3/Reports/Project3_Final_Report.docx
+++ b/Project3/Reports/Project3_Final_Report.docx
@@ -208,6 +208,14 @@
     <w:p/>
     <w:sdt>
       <w:sdtPr>
+        <w:rPr>
+          <w:rFonts w:ascii="Times New Roman" w:eastAsia="Times New Roman" w:hAnsi="Times New Roman" w:cs="Times New Roman"/>
+          <w:b w:val="0"/>
+          <w:bCs w:val="0"/>
+          <w:color w:val="auto"/>
+          <w:sz w:val="24"/>
+          <w:szCs w:val="24"/>
+        </w:rPr>
         <w:id w:val="-1815024890"/>
         <w:docPartObj>
           <w:docPartGallery w:val="Table of Contents"/>
@@ -216,17 +224,16 @@
       </w:sdtPr>
       <w:sdtEndPr>
         <w:rPr>
-          <w:rFonts w:ascii="Times New Roman" w:eastAsia="Times New Roman" w:hAnsi="Times New Roman" w:cs="Times New Roman"/>
           <w:noProof/>
-          <w:color w:val="auto"/>
-          <w:sz w:val="24"/>
-          <w:szCs w:val="24"/>
         </w:rPr>
       </w:sdtEndPr>
       <w:sdtContent>
         <w:p>
           <w:pPr>
             <w:pStyle w:val="TOCHeading"/>
+            <w:rPr>
+              <w:noProof/>
+            </w:rPr>
           </w:pPr>
           <w:r>
             <w:t>Table of Contents</w:t>
@@ -248,7 +255,6 @@
             </w:rPr>
             <w:fldChar w:fldCharType="separate"/>
           </w:r>
-          <w:hyperlink w:anchor="_Toc227079192" w:history="1"/>
         </w:p>
         <w:p>
           <w:pPr>
@@ -273,21 +279,7 @@
                 <w:rStyle w:val="Hyperlink"/>
                 <w:noProof/>
               </w:rPr>
-              <w:t>1. Introdu</w:t>
-            </w:r>
-            <w:r>
-              <w:rPr>
-                <w:rStyle w:val="Hyperlink"/>
-                <w:noProof/>
-              </w:rPr>
-              <w:t>c</w:t>
-            </w:r>
-            <w:r>
-              <w:rPr>
-                <w:rStyle w:val="Hyperlink"/>
-                <w:noProof/>
-              </w:rPr>
-              <w:t>tion</w:t>
+              <w:t>1. Introduction</w:t>
             </w:r>
             <w:r>
               <w:rPr>
@@ -628,7 +620,7 @@
                 <w:noProof/>
                 <w:webHidden/>
               </w:rPr>
-              <w:t>9</w:t>
+              <w:t>10</w:t>
             </w:r>
             <w:r>
               <w:rPr>
@@ -703,7 +695,7 @@
                 <w:noProof/>
                 <w:webHidden/>
               </w:rPr>
-              <w:t>9</w:t>
+              <w:t>10</w:t>
             </w:r>
             <w:r>
               <w:rPr>
@@ -792,12 +784,13 @@
       <w:bookmarkEnd w:id="6"/>
       <w:bookmarkEnd w:id="7"/>
     </w:p>
+    <w:p/>
     <w:p>
       <w:pPr>
         <w:spacing w:after="240" w:line="480" w:lineRule="auto"/>
       </w:pPr>
       <w:r>
-        <w:t>The data for this project comes from the Framingham Heart Study (FHS), a long-term prospective study of the pathogenesis of cardiovascular disease among a population of free-living subjects in the community of Framingham, Massachusetts. The dataset contains up to 24 years of biennial follow-up on 4,434 participants, who were followed for the occurrence of the following events: Angina Pectoris, Myocardial Infarction, Atherothrombotic Infarction, Cerebral Hemorrhage (Stroke), or death. Specifically, this subset includes laboratory, clinic, questionnaire, and adjudicated event data. Participant clinic data was collected during three examination periods, approximately 6 years apart, from roughly 1956 to 1968.</w:t>
+        <w:t>The Framingham Heart Study (FHS) is a long-term prospective study investigating cardiovascular disease among community-dwelling individuals in Framingham, Massachusetts. This dataset includes up to 24 years of biennial follow-up for 4,434 participants, with repeated measures of clinical, laboratory, and questionnaire data, as well as adjudicated cardiovascular events.</w:t>
       </w:r>
     </w:p>
     <w:p>
@@ -805,25 +798,7 @@
         <w:spacing w:after="240" w:line="480" w:lineRule="auto"/>
       </w:pPr>
       <w:r>
-        <w:t xml:space="preserve">The primary objective of this analysis is to </w:t>
-      </w:r>
-      <w:r>
-        <w:t>determine what the important risk factors of stok</w:t>
-      </w:r>
-      <w:r>
-        <w:t>e are and compute the 10-year probability of stroke based on different risk profiles.</w:t>
-      </w:r>
-      <w:r>
-        <w:t xml:space="preserve"> </w:t>
-      </w:r>
-      <w:r>
-        <w:t>To</w:t>
-      </w:r>
-      <w:r>
-        <w:t xml:space="preserve"> </w:t>
-      </w:r>
-      <w:r>
-        <w:t>evaluate risk factors measured closest in time to the outcome, only the first 10 years of follow-up will be used, with baseline risk factors serving as the primary predictors. All analyses will be stratified by sex (male/female) to assess whether risk factor profiles and stroke probabilities differ between groups.</w:t>
+        <w:t>The primary objective of this analysis is to identify baseline risk factors associated with incident stroke within 10 years and to estimate 10-year stroke probability across clinically relevant risk profiles. Analyses were stratified by sex to account for known differences in cardiovascular risk.</w:t>
       </w:r>
     </w:p>
     <w:p>
@@ -831,7 +806,7 @@
         <w:spacing w:after="240" w:line="480" w:lineRule="auto"/>
       </w:pPr>
       <w:r>
-        <w:t xml:space="preserve">As a secondary aim, this report will describe the degree of change in key risk factors across the three examination periods. This descriptive information will inform whether a more complex time-varying covariate analysis may be warranted in future work. </w:t>
+        <w:t>A secondary aim was to describe changes in key risk factors across three examination periods to assess whether a time-varying covariate approach may be warranted in future analyses.</w:t>
       </w:r>
     </w:p>
     <w:p>
@@ -878,7 +853,6 @@
       <w:bookmarkStart w:id="10" w:name="_Toc222223986"/>
       <w:bookmarkStart w:id="11" w:name="_Toc227079194"/>
       <w:r>
-        <w:lastRenderedPageBreak/>
         <w:t xml:space="preserve">2. </w:t>
       </w:r>
       <w:r>
@@ -889,6 +863,7 @@
       <w:bookmarkEnd w:id="10"/>
       <w:bookmarkEnd w:id="11"/>
     </w:p>
+    <w:p/>
     <w:p>
       <w:pPr>
         <w:pStyle w:val="Heading4"/>
@@ -916,24 +891,58 @@
         <w:t>original</w:t>
       </w:r>
       <w:r>
-        <w:t xml:space="preserve"> FHS dataset contains 4,434 participants with up to 24 years of follow-up</w:t>
+        <w:t xml:space="preserve"> FHS dataset contain</w:t>
+      </w:r>
+      <w:r>
+        <w:t>ed</w:t>
+      </w:r>
+      <w:r>
+        <w:t xml:space="preserve"> 4,434 participants with up to 24 years of follow-up</w:t>
       </w:r>
       <w:r>
         <w:t xml:space="preserve"> structured in long format with repeated biennial visits per participant</w:t>
       </w:r>
       <w:r>
-        <w:t xml:space="preserve">. For this analysis, follow-up was restricted to the first 10 years and data was filtered to examination period 1 </w:t>
-      </w:r>
-      <w:proofErr w:type="gramStart"/>
-      <w:r>
-        <w:t>in order to</w:t>
-      </w:r>
-      <w:proofErr w:type="gramEnd"/>
+        <w:t xml:space="preserve">. </w:t>
+      </w:r>
+      <w:r>
+        <w:t>Analyses were restricted to baseline (Exam 1) and the first 10 years of follow-up. Participants with prior stroke were excluded, yielding a final sample of 4,402 individuals.</w:t>
+      </w:r>
+    </w:p>
+    <w:p>
+      <w:pPr>
+        <w:spacing w:after="240" w:line="480" w:lineRule="auto"/>
+      </w:pPr>
+      <w:r>
+        <w:lastRenderedPageBreak/>
+        <w:t>The primary outcome is time to first stroke, measured in days</w:t>
+      </w:r>
+      <w:r>
+        <w:t>, within 10 years</w:t>
+      </w:r>
+      <w:r>
+        <w:t xml:space="preserve">. </w:t>
+      </w:r>
+      <w:r>
+        <w:t>Participants without stroke were censored at 10 years or last follow-up. A binary indicator of stroke within 10 years</w:t>
+      </w:r>
       <w:r>
         <w:t xml:space="preserve"> </w:t>
       </w:r>
       <w:r>
-        <w:t>use baseline risk factors as the primary predictors. Additionally, participants who had experienced a stroke prior to study entry were excluded, as they would not be at risk for a first stroke event. These exclusions resulted in a final dataset of 4,402 participants.</w:t>
+        <w:t xml:space="preserve">(yes/no), </w:t>
+      </w:r>
+      <w:r>
+        <w:t>was also created</w:t>
+      </w:r>
+      <w:r>
+        <w:t xml:space="preserve"> </w:t>
+      </w:r>
+      <w:r>
+        <w:t>which will be used for computing 10-year stroke probabilities by risk profile</w:t>
+      </w:r>
+      <w:r>
+        <w:t>.</w:t>
       </w:r>
     </w:p>
     <w:p>
@@ -941,10 +950,20 @@
         <w:spacing w:after="240" w:line="480" w:lineRule="auto"/>
       </w:pPr>
       <w:r>
-        <w:t>The primary outcome is time to first stroke, measured in days. Participants who did not experience a stroke within the 10-year follow-up window were censored at either 10 years or their last observed follow-up time, whichever came first. A binary indicator variable was also created to denote whether a participant experienced a stroke within 10 years (yes/no), which will be used for computing 10-year stroke probabilities by risk profile.</w:t>
-      </w:r>
-      <w:r>
-        <w:t xml:space="preserve"> Systolic blood pressure</w:t>
+        <w:t>Systolic blood pressure</w:t>
+      </w:r>
+      <w:r>
+        <w:t xml:space="preserve"> (</w:t>
+      </w:r>
+      <w:r>
+        <w:rPr>
+          <w:b/>
+          <w:bCs/>
+        </w:rPr>
+        <w:t>SBP</w:t>
+      </w:r>
+      <w:r>
+        <w:t>)</w:t>
       </w:r>
       <w:r>
         <w:t xml:space="preserve"> and total cholesterol</w:t>
@@ -959,7 +978,13 @@
         <w:t xml:space="preserve"> rescaled </w:t>
       </w:r>
       <w:r>
-        <w:t>so that the reported coefficients correspond to a</w:t>
+        <w:t xml:space="preserve">so that the reported </w:t>
+      </w:r>
+      <w:r>
+        <w:t xml:space="preserve">model </w:t>
+      </w:r>
+      <w:r>
+        <w:t>coefficients correspond to a</w:t>
       </w:r>
       <w:r>
         <w:rPr>
@@ -1022,33 +1047,37 @@
         <w:spacing w:after="240" w:line="480" w:lineRule="auto"/>
       </w:pPr>
       <w:r>
-        <w:t xml:space="preserve">To address the primary research question, a </w:t>
-      </w:r>
-      <w:r>
-        <w:t xml:space="preserve">multivariable </w:t>
-      </w:r>
-      <w:r>
-        <w:t xml:space="preserve">Cox proportional hazards model will be fit separately for men and women to identify baseline risk factors significantly associated with time to first stroke within 10 years of follow-up. </w:t>
-      </w:r>
-      <w:r>
-        <w:t xml:space="preserve"> </w:t>
-      </w:r>
-      <w:r>
-        <w:t>The proportional hazards assumption will be assessed for each sex-specific model</w:t>
-      </w:r>
-      <w:r>
-        <w:t xml:space="preserve"> by using Schoenfeld residuals to test whether covariates change over time</w:t>
-      </w:r>
-      <w:r>
-        <w:t>.</w:t>
-      </w:r>
-    </w:p>
-    <w:p>
-      <w:pPr>
-        <w:spacing w:after="240" w:line="480" w:lineRule="auto"/>
-      </w:pPr>
-      <w:r>
-        <w:t>Candidate baseline risk factors were selected a priori based on discussions with the primary investigator (</w:t>
+        <w:t xml:space="preserve">To address the primary research question, </w:t>
+      </w:r>
+      <w:r>
+        <w:t>s</w:t>
+      </w:r>
+      <w:r>
+        <w:t>ex-stratified Cox proportional hazards models were used to identify risk factors associated with time to stroke. The proportional hazards assumption was assessed using Schoenfeld residual</w:t>
+      </w:r>
+      <w:r>
+        <w:t>s.</w:t>
+      </w:r>
+    </w:p>
+    <w:p>
+      <w:pPr>
+        <w:pStyle w:val="p1"/>
+        <w:spacing w:line="480" w:lineRule="auto"/>
+      </w:pPr>
+      <w:r>
+        <w:t>Candidate baseline risk factors included age, SBP, and diabetes</w:t>
+      </w:r>
+      <w:r>
+        <w:t xml:space="preserve">, </w:t>
+      </w:r>
+      <w:r>
+        <w:t>selected a priori</w:t>
+      </w:r>
+      <w:r>
+        <w:t xml:space="preserve"> based on discussions with </w:t>
+      </w:r>
+      <w:r>
+        <w:t>primary investigator (</w:t>
       </w:r>
       <w:r>
         <w:rPr>
@@ -1058,164 +1087,127 @@
         <w:t>PI</w:t>
       </w:r>
       <w:r>
-        <w:t>), including age, systolic blood pressure (</w:t>
+        <w:t>),</w:t>
+      </w:r>
+      <w:r>
+        <w:t xml:space="preserve"> with </w:t>
+      </w:r>
+      <w:r>
+        <w:t xml:space="preserve">total </w:t>
+      </w:r>
+      <w:r>
+        <w:t>cholesterol, BMI, smoking</w:t>
+      </w:r>
+      <w:r>
+        <w:t xml:space="preserve"> status</w:t>
+      </w:r>
+      <w:r>
+        <w:t xml:space="preserve">, BP medication use, and prevalent </w:t>
+      </w:r>
+      <w:r>
+        <w:t>cardiovascular disease (</w:t>
       </w:r>
       <w:r>
         <w:rPr>
           <w:b/>
           <w:bCs/>
         </w:rPr>
+        <w:t>CHD</w:t>
+      </w:r>
+      <w:r>
+        <w:t>)</w:t>
+      </w:r>
+      <w:r>
+        <w:t xml:space="preserve"> considered using backward stepwise selection based on </w:t>
+      </w:r>
+      <w:r>
+        <w:t>corrected Akaike’s Information Criterion</w:t>
+      </w:r>
+      <w:r>
+        <w:t xml:space="preserve"> </w:t>
+      </w:r>
+      <w:r>
+        <w:t>(</w:t>
+      </w:r>
+      <w:proofErr w:type="spellStart"/>
+      <w:r>
+        <w:t>AICc</w:t>
+      </w:r>
+      <w:proofErr w:type="spellEnd"/>
+      <w:r>
+        <w:t>)</w:t>
+      </w:r>
+      <w:r>
+        <w:t>, Schwarz Bayesian Criterion (SBC)</w:t>
+      </w:r>
+      <w:r>
+        <w:t xml:space="preserve"> </w:t>
+      </w:r>
+      <w:r>
+        <w:t>criteria. Clinical relevance informed final model selection.</w:t>
+      </w:r>
+    </w:p>
+    <w:p>
+      <w:pPr>
+        <w:spacing w:after="240" w:line="480" w:lineRule="auto"/>
+      </w:pPr>
+      <w:r>
+        <w:t xml:space="preserve">To address the secondary research question, </w:t>
+      </w:r>
+      <w:r>
+        <w:t>10</w:t>
+      </w:r>
+      <w:r>
+        <w:t>-year stroke probabilities were estimated from Cox models for five prespecified risk profiles at ages 40, 50, and 60.</w:t>
+      </w:r>
+      <w:r>
+        <w:t xml:space="preserve"> </w:t>
+      </w:r>
+      <w:r>
+        <w:t xml:space="preserve">The scenarios included a baseline profile with no major risk factors, high </w:t>
+      </w:r>
+      <w:r>
         <w:t>BP</w:t>
       </w:r>
       <w:r>
-        <w:t xml:space="preserve">), and diabetes status. Additional </w:t>
-      </w:r>
+        <w:t xml:space="preserve"> alone, diabetes alone, diabetes with high</w:t>
+      </w:r>
+      <w:r>
+        <w:t xml:space="preserve"> BP</w:t>
+      </w:r>
+      <w:r>
+        <w:t xml:space="preserve">, and </w:t>
+      </w:r>
+      <w:r>
+        <w:t>diabetes with high BP and a current smoker</w:t>
+      </w:r>
+      <w:r>
+        <w:t>. Predicted risk was calculated as one minus the estimated 10-year stroke-free survival probability from the sex-specific Cox models.</w:t>
+      </w:r>
+    </w:p>
+    <w:p>
+      <w:pPr>
+        <w:pStyle w:val="p1"/>
+        <w:spacing w:line="480" w:lineRule="auto"/>
+      </w:pPr>
       <w:r>
         <w:lastRenderedPageBreak/>
-        <w:t>variables considered for inclusion include total cholesterol, body mass index (</w:t>
-      </w:r>
-      <w:r>
-        <w:rPr>
-          <w:b/>
-          <w:bCs/>
-        </w:rPr>
-        <w:t>BMI</w:t>
-      </w:r>
-      <w:r>
-        <w:t>), current smoking status, blood pressure medication use, and prevalent coronary heart disease (</w:t>
-      </w:r>
-      <w:r>
-        <w:rPr>
-          <w:b/>
-          <w:bCs/>
-        </w:rPr>
-        <w:t>CHD</w:t>
-      </w:r>
-      <w:r>
-        <w:t xml:space="preserve">). Variable selection for the </w:t>
-      </w:r>
-      <w:r>
-        <w:t>additional variables to be considered</w:t>
-      </w:r>
-      <w:r>
-        <w:t xml:space="preserve"> will be performed using a backward stepwise procedure implemented via the </w:t>
-      </w:r>
-      <w:proofErr w:type="spellStart"/>
-      <w:r>
-        <w:t>StepReg</w:t>
-      </w:r>
-      <w:proofErr w:type="spellEnd"/>
-      <w:r>
-        <w:t xml:space="preserve"> function</w:t>
-      </w:r>
-      <w:r>
-        <w:t xml:space="preserve"> in R</w:t>
-      </w:r>
-      <w:r>
-        <w:t>, with model selection guided by information criteria including</w:t>
-      </w:r>
-      <w:r>
-        <w:t xml:space="preserve"> corrected Akaike’s Information Criterion</w:t>
-      </w:r>
-      <w:r>
-        <w:t xml:space="preserve"> </w:t>
-      </w:r>
-      <w:r>
-        <w:t>(</w:t>
-      </w:r>
-      <w:proofErr w:type="spellStart"/>
-      <w:r>
-        <w:t>AICc</w:t>
-      </w:r>
-      <w:proofErr w:type="spellEnd"/>
-      <w:r>
-        <w:t>)</w:t>
-      </w:r>
-      <w:r>
-        <w:t>, Schwarz Bayesian Criterion (SBC), and Hannan–Quinn (HQ). Final model selection will also consider clinical relevance and interpretability.</w:t>
-      </w:r>
-    </w:p>
-    <w:p>
-      <w:pPr>
-        <w:spacing w:after="240" w:line="480" w:lineRule="auto"/>
-      </w:pPr>
-      <w:r>
-        <w:t>Potential correlations and confounding among predictors will be assessed</w:t>
-      </w:r>
-      <w:r>
-        <w:t xml:space="preserve"> using s</w:t>
-      </w:r>
-      <w:r>
-        <w:t>ensitivity analyses to evaluate the impact of high correlation and confounding among predictors (e.g., systolic BP and BP medication use) on model estimates and interpretation, including the impact of including or excluding these predictors.</w:t>
-      </w:r>
-    </w:p>
-    <w:p>
-      <w:pPr>
-        <w:spacing w:after="240" w:line="480" w:lineRule="auto"/>
-      </w:pPr>
-      <w:r>
-        <w:t xml:space="preserve">To address the secondary research question, </w:t>
-      </w:r>
-      <w:r>
-        <w:t>10</w:t>
-      </w:r>
-      <w:r>
-        <w:t xml:space="preserve">-year stroke probabilities </w:t>
-      </w:r>
-      <w:r>
-        <w:t>will be</w:t>
-      </w:r>
-      <w:r>
-        <w:t xml:space="preserve"> estimated separately for men and women from the fitted Cox proportional hazards models for five prespecified clinical scenarios at ages 40, 50, and 60 years. The scenarios included a baseline profile with no major risk factors, high blood pressure alone, diabetes alone, diabetes with high blood pressure, and current smoking alone. Predicted risk was calculated as one minus the estimated 10-year stroke-free survival probability from the sex-specific Cox models.</w:t>
-      </w:r>
-    </w:p>
-    <w:p>
-      <w:pPr>
-        <w:spacing w:after="240" w:line="480" w:lineRule="auto"/>
-      </w:pPr>
-      <w:r>
         <w:t xml:space="preserve">As an additional descriptive aim, </w:t>
       </w:r>
       <w:r>
-        <w:t>r</w:t>
-      </w:r>
-      <w:r>
-        <w:t>isk factors will be summarized across the three examination periods using means and standard deviations for continuous variables and proportions for categorical variables. These summaries will be calculated separately at each examination period to describe changes in risk factor distributions over time</w:t>
-      </w:r>
-    </w:p>
-    <w:p>
-      <w:pPr>
-        <w:spacing w:after="240" w:line="480" w:lineRule="auto"/>
-      </w:pPr>
-    </w:p>
-    <w:p>
-      <w:pPr>
-        <w:spacing w:after="240" w:line="480" w:lineRule="auto"/>
-      </w:pPr>
-      <w:r>
-        <w:lastRenderedPageBreak/>
-        <w:t xml:space="preserve">All analyses </w:t>
-      </w:r>
-      <w:r>
-        <w:t>will be</w:t>
-      </w:r>
-      <w:r>
-        <w:t xml:space="preserve"> conducted using complete-case observations for the variables included in each model. The number of observations </w:t>
-      </w:r>
-      <w:r>
-        <w:t>removed due to missingness will be</w:t>
-      </w:r>
-      <w:r>
-        <w:t xml:space="preserve"> reported alongside model results.</w:t>
-      </w:r>
-      <w:r>
-        <w:t xml:space="preserve"> </w:t>
-      </w:r>
-      <w:r>
-        <w:t xml:space="preserve">Findings will be interpreted under the assumption that missingness is at least missing at </w:t>
-      </w:r>
-      <w:r>
-        <w:t>random (MAR), where dropout depends on observed variables</w:t>
+        <w:t>risk factors were also summarized across three examination periods using means (SD) and proportions to assess temporal changes.</w:t>
+      </w:r>
+    </w:p>
+    <w:p>
+      <w:pPr>
+        <w:pStyle w:val="p1"/>
+        <w:spacing w:line="480" w:lineRule="auto"/>
+      </w:pPr>
+      <w:r>
+        <w:t xml:space="preserve">All analyses used complete-case data under a missing at random assumption, </w:t>
+      </w:r>
+      <w:r>
+        <w:t>where dropout depends on observed variables</w:t>
       </w:r>
       <w:r>
         <w:t>.</w:t>
@@ -1248,11 +1240,14 @@
         <w:jc w:val="center"/>
       </w:pPr>
       <w:r>
+        <w:rPr>
+          <w:noProof/>
+        </w:rPr>
         <w:drawing>
-          <wp:inline distT="0" distB="0" distL="0" distR="0" wp14:anchorId="6FF7F063" wp14:editId="6B17CCF0">
-            <wp:extent cx="5943600" cy="4904740"/>
-            <wp:effectExtent l="0" t="0" r="0" b="0"/>
-            <wp:docPr id="1643568842" name="Picture 1"/>
+          <wp:inline distT="0" distB="0" distL="0" distR="0" wp14:anchorId="65933D86" wp14:editId="740783D5">
+            <wp:extent cx="5789962" cy="5368705"/>
+            <wp:effectExtent l="0" t="0" r="1270" b="3810"/>
+            <wp:docPr id="1602840842" name="Picture 1"/>
             <wp:cNvGraphicFramePr>
               <a:graphicFrameLocks xmlns:a="http://schemas.openxmlformats.org/drawingml/2006/main" noChangeAspect="1"/>
             </wp:cNvGraphicFramePr>
@@ -1260,7 +1255,7 @@
               <a:graphicData uri="http://schemas.openxmlformats.org/drawingml/2006/picture">
                 <pic:pic xmlns:pic="http://schemas.openxmlformats.org/drawingml/2006/picture">
                   <pic:nvPicPr>
-                    <pic:cNvPr id="1643568842" name=""/>
+                    <pic:cNvPr id="1602840842" name=""/>
                     <pic:cNvPicPr/>
                   </pic:nvPicPr>
                   <pic:blipFill>
@@ -1272,7 +1267,7 @@
                   <pic:spPr>
                     <a:xfrm>
                       <a:off x="0" y="0"/>
-                      <a:ext cx="5943600" cy="4904740"/>
+                      <a:ext cx="5799776" cy="5377805"/>
                     </a:xfrm>
                     <a:prstGeom prst="rect">
                       <a:avLst/>
@@ -1287,264 +1282,143 @@
     </w:p>
     <w:p>
       <w:pPr>
+        <w:jc w:val="center"/>
+      </w:pPr>
+    </w:p>
+    <w:p>
+      <w:pPr>
         <w:pStyle w:val="Caption"/>
         <w:rPr>
+          <w:rFonts w:asciiTheme="minorHAnsi" w:hAnsiTheme="minorHAnsi"/>
           <w:color w:val="000000" w:themeColor="text1"/>
           <w:sz w:val="21"/>
           <w:szCs w:val="21"/>
         </w:rPr>
       </w:pPr>
-      <w:bookmarkStart w:id="16" w:name="_Ref220679477"/>
-      <w:r>
-        <w:rPr>
+      <w:r>
+        <w:rPr>
+          <w:rFonts w:asciiTheme="minorHAnsi" w:hAnsiTheme="minorHAnsi"/>
+          <w:b/>
+          <w:bCs/>
+          <w:sz w:val="21"/>
+          <w:szCs w:val="21"/>
+        </w:rPr>
+        <w:t xml:space="preserve">Table </w:t>
+      </w:r>
+      <w:r>
+        <w:rPr>
+          <w:rFonts w:asciiTheme="minorHAnsi" w:hAnsiTheme="minorHAnsi"/>
+          <w:b/>
+          <w:bCs/>
+          <w:sz w:val="21"/>
+          <w:szCs w:val="21"/>
+        </w:rPr>
+        <w:fldChar w:fldCharType="begin"/>
+      </w:r>
+      <w:r>
+        <w:rPr>
+          <w:rFonts w:asciiTheme="minorHAnsi" w:hAnsiTheme="minorHAnsi"/>
+          <w:b/>
+          <w:bCs/>
+          <w:sz w:val="21"/>
+          <w:szCs w:val="21"/>
+        </w:rPr>
+        <w:instrText xml:space="preserve"> SEQ Table \* ARABIC </w:instrText>
+      </w:r>
+      <w:r>
+        <w:rPr>
+          <w:rFonts w:asciiTheme="minorHAnsi" w:hAnsiTheme="minorHAnsi"/>
+          <w:b/>
+          <w:bCs/>
+          <w:sz w:val="21"/>
+          <w:szCs w:val="21"/>
+        </w:rPr>
+        <w:fldChar w:fldCharType="separate"/>
+      </w:r>
+      <w:r>
+        <w:rPr>
+          <w:rFonts w:asciiTheme="minorHAnsi" w:hAnsiTheme="minorHAnsi"/>
+          <w:b/>
+          <w:bCs/>
+          <w:noProof/>
+          <w:sz w:val="21"/>
+          <w:szCs w:val="21"/>
+        </w:rPr>
+        <w:t>1</w:t>
+      </w:r>
+      <w:r>
+        <w:rPr>
+          <w:rFonts w:asciiTheme="minorHAnsi" w:hAnsiTheme="minorHAnsi"/>
+          <w:b/>
+          <w:bCs/>
+          <w:sz w:val="21"/>
+          <w:szCs w:val="21"/>
+        </w:rPr>
+        <w:fldChar w:fldCharType="end"/>
+      </w:r>
+      <w:r>
+        <w:rPr>
+          <w:rFonts w:asciiTheme="minorHAnsi" w:hAnsiTheme="minorHAnsi"/>
           <w:b/>
           <w:bCs/>
           <w:color w:val="000000" w:themeColor="text1"/>
           <w:sz w:val="21"/>
           <w:szCs w:val="21"/>
         </w:rPr>
-        <w:t xml:space="preserve">Table </w:t>
-      </w:r>
-      <w:r>
-        <w:rPr>
-          <w:b/>
-          <w:bCs/>
+        <w:t>.</w:t>
+      </w:r>
+      <w:r>
+        <w:rPr>
+          <w:rFonts w:asciiTheme="minorHAnsi" w:hAnsiTheme="minorHAnsi"/>
           <w:color w:val="000000" w:themeColor="text1"/>
           <w:sz w:val="21"/>
           <w:szCs w:val="21"/>
         </w:rPr>
-        <w:fldChar w:fldCharType="begin"/>
+        <w:t> Baseline characteristics of Framingham Heart Study participants, overall and stratified by sex during 10 years of follow-up.</w:t>
+      </w:r>
+    </w:p>
+    <w:p/>
+    <w:p>
+      <w:pPr>
+        <w:spacing w:line="480" w:lineRule="auto"/>
+      </w:pPr>
+      <w:r>
+        <w:t xml:space="preserve">Baseline characteristics are shown in </w:t>
       </w:r>
       <w:r>
         <w:rPr>
           <w:b/>
           <w:bCs/>
-          <w:color w:val="000000" w:themeColor="text1"/>
-          <w:sz w:val="21"/>
-          <w:szCs w:val="21"/>
-        </w:rPr>
-        <w:instrText xml:space="preserve"> SEQ Table \* ARABIC </w:instrText>
+        </w:rPr>
+        <w:t>Table 1</w:t>
       </w:r>
       <w:r>
         <w:rPr>
           <w:b/>
           <w:bCs/>
-          <w:color w:val="000000" w:themeColor="text1"/>
-          <w:sz w:val="21"/>
-          <w:szCs w:val="21"/>
-        </w:rPr>
-        <w:fldChar w:fldCharType="separate"/>
-      </w:r>
-      <w:r>
-        <w:rPr>
-          <w:b/>
-          <w:bCs/>
-          <w:noProof/>
-          <w:color w:val="000000" w:themeColor="text1"/>
-          <w:sz w:val="21"/>
-          <w:szCs w:val="21"/>
-        </w:rPr>
-        <w:t>1</w:t>
-      </w:r>
-      <w:r>
-        <w:rPr>
-          <w:b/>
-          <w:bCs/>
-          <w:color w:val="000000" w:themeColor="text1"/>
-          <w:sz w:val="21"/>
-          <w:szCs w:val="21"/>
-        </w:rPr>
-        <w:fldChar w:fldCharType="end"/>
-      </w:r>
-      <w:bookmarkEnd w:id="16"/>
-      <w:r>
-        <w:rPr>
-          <w:b/>
-          <w:bCs/>
-          <w:color w:val="000000" w:themeColor="text1"/>
-          <w:sz w:val="21"/>
-          <w:szCs w:val="21"/>
         </w:rPr>
         <w:t>.</w:t>
       </w:r>
       <w:r>
-        <w:rPr>
-          <w:color w:val="000000" w:themeColor="text1"/>
-          <w:sz w:val="21"/>
-          <w:szCs w:val="21"/>
-        </w:rPr>
-        <w:t xml:space="preserve"> Baseline characteristics of </w:t>
-      </w:r>
-      <w:r>
-        <w:rPr>
-          <w:color w:val="000000" w:themeColor="text1"/>
-          <w:sz w:val="21"/>
-          <w:szCs w:val="21"/>
-        </w:rPr>
-        <w:t>Framingham Heart Study participants</w:t>
-      </w:r>
-      <w:r>
-        <w:rPr>
-          <w:color w:val="000000" w:themeColor="text1"/>
-          <w:sz w:val="21"/>
-          <w:szCs w:val="21"/>
-        </w:rPr>
-        <w:t xml:space="preserve">, overall and stratified by </w:t>
-      </w:r>
-      <w:r>
-        <w:rPr>
-          <w:color w:val="000000" w:themeColor="text1"/>
-          <w:sz w:val="21"/>
-          <w:szCs w:val="21"/>
-        </w:rPr>
-        <w:t>sex</w:t>
-      </w:r>
-      <w:r>
-        <w:rPr>
-          <w:color w:val="000000" w:themeColor="text1"/>
-          <w:sz w:val="21"/>
-          <w:szCs w:val="21"/>
-        </w:rPr>
-        <w:t xml:space="preserve"> during 10 years of follow-up</w:t>
-      </w:r>
-      <w:r>
-        <w:rPr>
-          <w:color w:val="000000" w:themeColor="text1"/>
-          <w:sz w:val="21"/>
-          <w:szCs w:val="21"/>
-        </w:rPr>
-        <w:t>.</w:t>
-      </w:r>
-    </w:p>
-    <w:p/>
-    <w:p>
-      <w:pPr>
-        <w:spacing w:after="240" w:line="480" w:lineRule="auto"/>
-      </w:pPr>
-      <w:r>
-        <w:t xml:space="preserve">Baseline characteristics of the </w:t>
-      </w:r>
-      <w:r>
-        <w:t xml:space="preserve">FHS </w:t>
-      </w:r>
-      <w:r>
-        <w:t xml:space="preserve">cohort are presented in </w:t>
-      </w:r>
-      <w:r>
-        <w:rPr>
-          <w:b/>
-          <w:bCs/>
-          <w:i/>
-          <w:iCs/>
-        </w:rPr>
-        <w:t>Table 1</w:t>
-      </w:r>
-      <w:r>
-        <w:t xml:space="preserve">. </w:t>
-      </w:r>
-      <w:r>
-        <w:t>Smoking</w:t>
-      </w:r>
-      <w:r>
-        <w:t xml:space="preserve"> </w:t>
-      </w:r>
-      <w:r>
-        <w:t xml:space="preserve">status </w:t>
-      </w:r>
-      <w:r>
-        <w:t xml:space="preserve">and </w:t>
-      </w:r>
-      <w:r>
-        <w:t>pre</w:t>
-      </w:r>
-      <w:r>
-        <w:t>-existing</w:t>
-      </w:r>
-      <w:r>
-        <w:t xml:space="preserve"> </w:t>
-      </w:r>
-      <w:r>
-        <w:t>CHD</w:t>
-      </w:r>
-      <w:r>
-        <w:t xml:space="preserve"> </w:t>
-      </w:r>
-      <w:r>
-        <w:t>were</w:t>
-      </w:r>
-      <w:r>
-        <w:t xml:space="preserve"> higher </w:t>
-      </w:r>
-      <w:r>
-        <w:t>among men as compared to women</w:t>
-      </w:r>
-      <w:r>
-        <w:t>.</w:t>
-      </w:r>
-      <w:r>
-        <w:t xml:space="preserve"> Age, systolic </w:t>
-      </w:r>
-      <w:r>
-        <w:t>BP</w:t>
-      </w:r>
-      <w:r>
-        <w:t>, diabetes</w:t>
-      </w:r>
-      <w:r>
-        <w:t xml:space="preserve"> status</w:t>
-      </w:r>
-      <w:r>
-        <w:t xml:space="preserve">, </w:t>
-      </w:r>
-      <w:r>
-        <w:lastRenderedPageBreak/>
-        <w:t>cholesterol</w:t>
-      </w:r>
-      <w:r>
-        <w:t xml:space="preserve"> levels</w:t>
-      </w:r>
-      <w:r>
-        <w:t>, BP med</w:t>
-      </w:r>
-      <w:r>
-        <w:t>ication</w:t>
-      </w:r>
-      <w:r>
-        <w:t xml:space="preserve"> use</w:t>
-      </w:r>
-      <w:r>
-        <w:t xml:space="preserve">, and BMI </w:t>
-      </w:r>
-      <w:r>
-        <w:t>showed no practically meaningful differences between men and women</w:t>
-      </w:r>
-      <w:r>
-        <w:t>.</w:t>
-      </w:r>
-      <w:r>
-        <w:t xml:space="preserve"> During the 10 years of follow-</w:t>
-      </w:r>
-      <w:r>
-        <w:rPr>
-          <w:highlight w:val="yellow"/>
-        </w:rPr>
-        <w:t>up, 111 stroke events</w:t>
-      </w:r>
-    </w:p>
-    <w:p/>
+        <w:t xml:space="preserve"> Smoking and prevalent CHD were more common in men, while other risk factors were similar between sexes. Over 10 years, 111 stroke events </w:t>
+      </w:r>
+      <w:r>
+        <w:t xml:space="preserve">occurred </w:t>
+      </w:r>
+      <w:r>
+        <w:t>among 2,472 women and 1,930 men, corresponding to a cumulative incidence of approximately 2.5%.</w:t>
+      </w:r>
+    </w:p>
     <w:p>
       <w:pPr>
         <w:jc w:val="center"/>
       </w:pPr>
       <w:r>
-        <w:rPr>
-          <w:noProof/>
-        </w:rPr>
         <w:drawing>
-          <wp:inline distT="0" distB="0" distL="0" distR="0" wp14:anchorId="14626EC8" wp14:editId="33D032E4">
-            <wp:extent cx="5577720" cy="3864478"/>
+          <wp:inline distT="0" distB="0" distL="0" distR="0" wp14:anchorId="51D2C172" wp14:editId="1D540390">
+            <wp:extent cx="5943600" cy="2874645"/>
             <wp:effectExtent l="0" t="0" r="0" b="0"/>
-            <wp:docPr id="1711780099" name="Picture 1"/>
+            <wp:docPr id="1097103598" name="Picture 1"/>
             <wp:cNvGraphicFramePr>
               <a:graphicFrameLocks xmlns:a="http://schemas.openxmlformats.org/drawingml/2006/main" noChangeAspect="1"/>
             </wp:cNvGraphicFramePr>
@@ -1552,7 +1426,7 @@
               <a:graphicData uri="http://schemas.openxmlformats.org/drawingml/2006/picture">
                 <pic:pic xmlns:pic="http://schemas.openxmlformats.org/drawingml/2006/picture">
                   <pic:nvPicPr>
-                    <pic:cNvPr id="1711780099" name=""/>
+                    <pic:cNvPr id="1097103598" name=""/>
                     <pic:cNvPicPr/>
                   </pic:nvPicPr>
                   <pic:blipFill>
@@ -1564,7 +1438,7 @@
                   <pic:spPr>
                     <a:xfrm>
                       <a:off x="0" y="0"/>
-                      <a:ext cx="5601196" cy="3880743"/>
+                      <a:ext cx="5943600" cy="2874645"/>
                     </a:xfrm>
                     <a:prstGeom prst="rect">
                       <a:avLst/>
@@ -1581,16 +1455,17 @@
       <w:pPr>
         <w:jc w:val="center"/>
       </w:pPr>
-      <w:r>
-        <w:rPr>
-          <w:noProof/>
-        </w:rPr>
-        <w:lastRenderedPageBreak/>
+    </w:p>
+    <w:p>
+      <w:pPr>
+        <w:jc w:val="center"/>
+      </w:pPr>
+      <w:r>
         <w:drawing>
-          <wp:inline distT="0" distB="0" distL="0" distR="0" wp14:anchorId="6A51394B" wp14:editId="54D75F09">
-            <wp:extent cx="5604095" cy="3851618"/>
+          <wp:inline distT="0" distB="0" distL="0" distR="0" wp14:anchorId="3B197A4A" wp14:editId="5B752D97">
+            <wp:extent cx="5943600" cy="2834640"/>
             <wp:effectExtent l="0" t="0" r="0" b="0"/>
-            <wp:docPr id="1820034345" name="Picture 1"/>
+            <wp:docPr id="2026184100" name="Picture 1"/>
             <wp:cNvGraphicFramePr>
               <a:graphicFrameLocks xmlns:a="http://schemas.openxmlformats.org/drawingml/2006/main" noChangeAspect="1"/>
             </wp:cNvGraphicFramePr>
@@ -1598,7 +1473,7 @@
               <a:graphicData uri="http://schemas.openxmlformats.org/drawingml/2006/picture">
                 <pic:pic xmlns:pic="http://schemas.openxmlformats.org/drawingml/2006/picture">
                   <pic:nvPicPr>
-                    <pic:cNvPr id="1820034345" name=""/>
+                    <pic:cNvPr id="2026184100" name=""/>
                     <pic:cNvPicPr/>
                   </pic:nvPicPr>
                   <pic:blipFill>
@@ -1610,7 +1485,7 @@
                   <pic:spPr>
                     <a:xfrm>
                       <a:off x="0" y="0"/>
-                      <a:ext cx="5620781" cy="3863086"/>
+                      <a:ext cx="5943600" cy="2834640"/>
                     </a:xfrm>
                     <a:prstGeom prst="rect">
                       <a:avLst/>
@@ -1627,15 +1502,251 @@
       <w:pPr>
         <w:jc w:val="center"/>
       </w:pPr>
-      <w:r>
-        <w:rPr>
+    </w:p>
+    <w:p>
+      <w:pPr>
+        <w:pStyle w:val="Caption"/>
+        <w:rPr>
+          <w:rFonts w:asciiTheme="minorHAnsi" w:hAnsiTheme="minorHAnsi"/>
+          <w:color w:val="000000" w:themeColor="text1"/>
+          <w:sz w:val="21"/>
+          <w:szCs w:val="21"/>
+        </w:rPr>
+      </w:pPr>
+      <w:r>
+        <w:rPr>
+          <w:rFonts w:asciiTheme="minorHAnsi" w:hAnsiTheme="minorHAnsi"/>
+          <w:b/>
+          <w:bCs/>
+          <w:sz w:val="21"/>
+          <w:szCs w:val="21"/>
+        </w:rPr>
+        <w:t xml:space="preserve">Figure </w:t>
+      </w:r>
+      <w:r>
+        <w:rPr>
+          <w:rFonts w:asciiTheme="minorHAnsi" w:hAnsiTheme="minorHAnsi"/>
+          <w:b/>
+          <w:bCs/>
+          <w:sz w:val="21"/>
+          <w:szCs w:val="21"/>
+        </w:rPr>
+        <w:fldChar w:fldCharType="begin"/>
+      </w:r>
+      <w:r>
+        <w:rPr>
+          <w:rFonts w:asciiTheme="minorHAnsi" w:hAnsiTheme="minorHAnsi"/>
+          <w:b/>
+          <w:bCs/>
+          <w:sz w:val="21"/>
+          <w:szCs w:val="21"/>
+        </w:rPr>
+        <w:instrText xml:space="preserve"> SEQ Figure \* ARABIC </w:instrText>
+      </w:r>
+      <w:r>
+        <w:rPr>
+          <w:rFonts w:asciiTheme="minorHAnsi" w:hAnsiTheme="minorHAnsi"/>
+          <w:b/>
+          <w:bCs/>
+          <w:sz w:val="21"/>
+          <w:szCs w:val="21"/>
+        </w:rPr>
+        <w:fldChar w:fldCharType="separate"/>
+      </w:r>
+      <w:r>
+        <w:rPr>
+          <w:rFonts w:asciiTheme="minorHAnsi" w:hAnsiTheme="minorHAnsi"/>
+          <w:b/>
+          <w:bCs/>
           <w:noProof/>
+          <w:sz w:val="21"/>
+          <w:szCs w:val="21"/>
+        </w:rPr>
+        <w:t>1</w:t>
+      </w:r>
+      <w:r>
+        <w:rPr>
+          <w:rFonts w:asciiTheme="minorHAnsi" w:hAnsiTheme="minorHAnsi"/>
+          <w:b/>
+          <w:bCs/>
+          <w:sz w:val="21"/>
+          <w:szCs w:val="21"/>
+        </w:rPr>
+        <w:fldChar w:fldCharType="end"/>
+      </w:r>
+      <w:r>
+        <w:rPr>
+          <w:rFonts w:asciiTheme="minorHAnsi" w:hAnsiTheme="minorHAnsi"/>
+          <w:b/>
+          <w:bCs/>
+          <w:color w:val="000000" w:themeColor="text1"/>
+          <w:sz w:val="21"/>
+          <w:szCs w:val="21"/>
+        </w:rPr>
+        <w:t>.</w:t>
+      </w:r>
+      <w:r>
+        <w:rPr>
+          <w:rFonts w:asciiTheme="minorHAnsi" w:hAnsiTheme="minorHAnsi"/>
+          <w:color w:val="000000" w:themeColor="text1"/>
+          <w:sz w:val="21"/>
+          <w:szCs w:val="21"/>
+        </w:rPr>
+        <w:t xml:space="preserve"> Kaplan–Meier curves of stroke-free survival over 10 years, stratified by sex and baseline risk factors. Each panel displays survival probabilities for levels of the corresponding risk factor for women and men, with tick marks denoting censored observations.</w:t>
+      </w:r>
+    </w:p>
+    <w:p>
+      <w:pPr>
+        <w:spacing w:after="240" w:line="480" w:lineRule="auto"/>
+      </w:pPr>
+      <w:r>
+        <w:lastRenderedPageBreak/>
+        <w:t>Kaplan–Meier curves</w:t>
+      </w:r>
+      <w:r>
+        <w:t>,</w:t>
+      </w:r>
+      <w:r>
+        <w:t xml:space="preserve"> stratified by selected baseline risk factors</w:t>
+      </w:r>
+      <w:r>
+        <w:t>,</w:t>
+      </w:r>
+      <w:r>
+        <w:t xml:space="preserve"> </w:t>
+      </w:r>
+      <w:r>
+        <w:t>showed lower stroke-free survival among individuals with elevated SBP</w:t>
+      </w:r>
+      <w:r>
+        <w:t xml:space="preserve"> (≥160mmHg)</w:t>
+      </w:r>
+      <w:r>
+        <w:t>, diabetes, older age</w:t>
+      </w:r>
+      <w:r>
+        <w:t xml:space="preserve"> (≥60yrs)</w:t>
+      </w:r>
+      <w:r>
+        <w:t>, and prevalent CHD.</w:t>
+      </w:r>
+    </w:p>
+    <w:p>
+      <w:pPr>
+        <w:pStyle w:val="Heading4"/>
+      </w:pPr>
+      <w:r>
+        <w:t>3.</w:t>
+      </w:r>
+      <w:r>
+        <w:t>1</w:t>
+      </w:r>
+      <w:r>
+        <w:t xml:space="preserve"> </w:t>
+      </w:r>
+      <w:r>
+        <w:t>Risk Factors of Stroke</w:t>
+      </w:r>
+    </w:p>
+    <w:p/>
+    <w:p>
+      <w:pPr>
+        <w:pStyle w:val="Caption"/>
+        <w:spacing w:line="480" w:lineRule="auto"/>
+        <w:rPr>
+          <w:i w:val="0"/>
+          <w:iCs w:val="0"/>
+          <w:color w:val="auto"/>
+          <w:sz w:val="24"/>
+          <w:szCs w:val="24"/>
+        </w:rPr>
+      </w:pPr>
+      <w:r>
+        <w:rPr>
+          <w:i w:val="0"/>
+          <w:iCs w:val="0"/>
+          <w:color w:val="auto"/>
+          <w:sz w:val="24"/>
+          <w:szCs w:val="24"/>
+        </w:rPr>
+        <w:t xml:space="preserve">Stepwise procedures identified smoking as the only statistically significant predictor of stroke. However, prior literature, including the Framingham Stroke Risk Profile (Wolf et al., 1991), incorporated an interaction between </w:t>
+      </w:r>
+      <w:r>
+        <w:rPr>
+          <w:i w:val="0"/>
+          <w:iCs w:val="0"/>
+          <w:color w:val="auto"/>
+          <w:sz w:val="24"/>
+          <w:szCs w:val="24"/>
+        </w:rPr>
+        <w:t>SBP</w:t>
+      </w:r>
+      <w:r>
+        <w:rPr>
+          <w:i w:val="0"/>
+          <w:iCs w:val="0"/>
+          <w:color w:val="auto"/>
+          <w:sz w:val="24"/>
+          <w:szCs w:val="24"/>
+        </w:rPr>
+        <w:t xml:space="preserve"> and BP medication use, as well as prevalent </w:t>
+      </w:r>
+      <w:r>
+        <w:rPr>
+          <w:i w:val="0"/>
+          <w:iCs w:val="0"/>
+          <w:color w:val="auto"/>
+          <w:sz w:val="24"/>
+          <w:szCs w:val="24"/>
+        </w:rPr>
+        <w:t>CHD</w:t>
+      </w:r>
+      <w:r>
+        <w:rPr>
+          <w:i w:val="0"/>
+          <w:iCs w:val="0"/>
+          <w:color w:val="auto"/>
+          <w:sz w:val="24"/>
+          <w:szCs w:val="24"/>
+        </w:rPr>
+        <w:t>, based on clinical relevance. These terms were therefore retained in the final sex-specific Cox models</w:t>
+      </w:r>
+      <w:r>
+        <w:rPr>
+          <w:i w:val="0"/>
+          <w:iCs w:val="0"/>
+          <w:color w:val="auto"/>
+          <w:sz w:val="24"/>
+          <w:szCs w:val="24"/>
+        </w:rPr>
+        <w:t>.</w:t>
+      </w:r>
+    </w:p>
+    <w:p>
+      <w:pPr>
+        <w:pStyle w:val="Caption"/>
+        <w:rPr>
+          <w:rFonts w:asciiTheme="minorHAnsi" w:hAnsiTheme="minorHAnsi"/>
+          <w:b/>
+          <w:bCs/>
+          <w:position w:val="-6"/>
+          <w:sz w:val="21"/>
+          <w:szCs w:val="21"/>
+        </w:rPr>
+      </w:pPr>
+      <w:r>
+        <w:rPr>
+          <w:rFonts w:asciiTheme="minorHAnsi" w:hAnsiTheme="minorHAnsi"/>
+          <w:b/>
+          <w:bCs/>
+          <w:sz w:val="21"/>
+          <w:szCs w:val="21"/>
         </w:rPr>
         <w:drawing>
-          <wp:inline distT="0" distB="0" distL="0" distR="0" wp14:anchorId="776EC3D1" wp14:editId="2CE435AD">
-            <wp:extent cx="5441132" cy="3766938"/>
-            <wp:effectExtent l="0" t="0" r="0" b="5080"/>
-            <wp:docPr id="1732227725" name="Picture 1"/>
+          <wp:inline distT="0" distB="0" distL="0" distR="0" wp14:anchorId="3CF09226" wp14:editId="3DFC97D1">
+            <wp:extent cx="5943600" cy="2292985"/>
+            <wp:effectExtent l="0" t="0" r="0" b="5715"/>
+            <wp:docPr id="511273182" name="Picture 1"/>
             <wp:cNvGraphicFramePr>
               <a:graphicFrameLocks xmlns:a="http://schemas.openxmlformats.org/drawingml/2006/main" noChangeAspect="1"/>
             </wp:cNvGraphicFramePr>
@@ -1643,7 +1754,7 @@
               <a:graphicData uri="http://schemas.openxmlformats.org/drawingml/2006/picture">
                 <pic:pic xmlns:pic="http://schemas.openxmlformats.org/drawingml/2006/picture">
                   <pic:nvPicPr>
-                    <pic:cNvPr id="1732227725" name=""/>
+                    <pic:cNvPr id="511273182" name=""/>
                     <pic:cNvPicPr/>
                   </pic:nvPicPr>
                   <pic:blipFill>
@@ -1655,7 +1766,7 @@
                   <pic:spPr>
                     <a:xfrm>
                       <a:off x="0" y="0"/>
-                      <a:ext cx="5463832" cy="3782653"/>
+                      <a:ext cx="5943600" cy="2292985"/>
                     </a:xfrm>
                     <a:prstGeom prst="rect">
                       <a:avLst/>
@@ -1667,21 +1778,261 @@
           </wp:inline>
         </w:drawing>
       </w:r>
-    </w:p>
-    <w:p>
-      <w:pPr>
+      <w:r>
+        <w:rPr>
+          <w:rFonts w:asciiTheme="minorHAnsi" w:hAnsiTheme="minorHAnsi"/>
+          <w:b/>
+          <w:bCs/>
+          <w:position w:val="-6"/>
+          <w:sz w:val="21"/>
+          <w:szCs w:val="21"/>
+        </w:rPr>
+        <w:t xml:space="preserve">Table </w:t>
+      </w:r>
+      <w:r>
+        <w:rPr>
+          <w:rFonts w:asciiTheme="minorHAnsi" w:hAnsiTheme="minorHAnsi"/>
+          <w:b/>
+          <w:bCs/>
+          <w:position w:val="-6"/>
+          <w:sz w:val="21"/>
+          <w:szCs w:val="21"/>
+        </w:rPr>
+        <w:fldChar w:fldCharType="begin"/>
+      </w:r>
+      <w:r>
+        <w:rPr>
+          <w:rFonts w:asciiTheme="minorHAnsi" w:hAnsiTheme="minorHAnsi"/>
+          <w:b/>
+          <w:bCs/>
+          <w:position w:val="-6"/>
+          <w:sz w:val="21"/>
+          <w:szCs w:val="21"/>
+        </w:rPr>
+        <w:instrText xml:space="preserve"> SEQ Table \* ARABIC </w:instrText>
+      </w:r>
+      <w:r>
+        <w:rPr>
+          <w:rFonts w:asciiTheme="minorHAnsi" w:hAnsiTheme="minorHAnsi"/>
+          <w:b/>
+          <w:bCs/>
+          <w:position w:val="-6"/>
+          <w:sz w:val="21"/>
+          <w:szCs w:val="21"/>
+        </w:rPr>
+        <w:fldChar w:fldCharType="separate"/>
+      </w:r>
+      <w:r>
+        <w:rPr>
+          <w:rFonts w:asciiTheme="minorHAnsi" w:hAnsiTheme="minorHAnsi"/>
+          <w:b/>
+          <w:bCs/>
+          <w:noProof/>
+          <w:position w:val="-6"/>
+          <w:sz w:val="21"/>
+          <w:szCs w:val="21"/>
+        </w:rPr>
+        <w:t>2</w:t>
+      </w:r>
+      <w:r>
+        <w:rPr>
+          <w:rFonts w:asciiTheme="minorHAnsi" w:hAnsiTheme="minorHAnsi"/>
+          <w:b/>
+          <w:bCs/>
+          <w:position w:val="-6"/>
+          <w:sz w:val="21"/>
+          <w:szCs w:val="21"/>
+        </w:rPr>
+        <w:fldChar w:fldCharType="end"/>
+      </w:r>
+      <w:r>
+        <w:rPr>
+          <w:rFonts w:asciiTheme="minorHAnsi" w:hAnsiTheme="minorHAnsi"/>
+          <w:b/>
+          <w:bCs/>
+          <w:i w:val="0"/>
+          <w:iCs w:val="0"/>
+          <w:color w:val="000000" w:themeColor="text1"/>
+          <w:position w:val="-6"/>
+          <w:sz w:val="21"/>
+          <w:szCs w:val="21"/>
+        </w:rPr>
+        <w:t>.</w:t>
+      </w:r>
+      <w:r>
+        <w:rPr>
+          <w:rFonts w:asciiTheme="minorHAnsi" w:hAnsiTheme="minorHAnsi"/>
+          <w:i w:val="0"/>
+          <w:iCs w:val="0"/>
+          <w:color w:val="000000" w:themeColor="text1"/>
+          <w:position w:val="-6"/>
+          <w:sz w:val="21"/>
+          <w:szCs w:val="21"/>
+        </w:rPr>
+        <w:t xml:space="preserve">  </w:t>
+      </w:r>
+      <w:r>
+        <w:rPr>
+          <w:rFonts w:asciiTheme="minorHAnsi" w:hAnsiTheme="minorHAnsi"/>
+          <w:color w:val="000000" w:themeColor="text1"/>
+          <w:position w:val="-6"/>
+          <w:sz w:val="21"/>
+          <w:szCs w:val="21"/>
+        </w:rPr>
+        <w:t>Sex-specific Cox proportional hazards models for 10-year stroke risk. Hazard ratios (95% CI; p-value) and percent change in hazard are shown for each risk factor. Continuous variables are scaled as indicated, and categorical variables are compared to their reference groups.</w:t>
+      </w:r>
+    </w:p>
+    <w:p>
+      <w:pPr>
+        <w:pStyle w:val="p1"/>
+        <w:spacing w:after="0" w:afterAutospacing="0" w:line="480" w:lineRule="auto"/>
+      </w:pPr>
+      <w:r>
+        <w:t>In sex-stratified Cox models, age and SBP were the primary predictors of stroke in both sexes. SBP was associated with a 28% increase in hazard per 10 mmHg in women and 41% in men.</w:t>
+      </w:r>
+    </w:p>
+    <w:p>
+      <w:pPr>
+        <w:pStyle w:val="p1"/>
+        <w:spacing w:after="240" w:afterAutospacing="0" w:line="480" w:lineRule="auto"/>
+      </w:pPr>
+      <w:r>
+        <w:t>Among men, diabetes, smoking status, and the interaction between SBP and BP medication use were also important predictors. Diabetes was associated with a markedly increased hazard (HR ≈ 5), although the small number of events (N = 7) suggests some uncertainty in this estimate.</w:t>
+      </w:r>
+      <w:r>
+        <w:t xml:space="preserve"> </w:t>
+      </w:r>
+      <w:r>
+        <w:lastRenderedPageBreak/>
+        <w:t>Current smoking was also associated with an approximately twofold increase in hazard (HR ≈ 2). The interaction indicates that men on BP medication have lower hazards at higher SBP levels compared to men not on BP medication.</w:t>
+      </w:r>
+    </w:p>
+    <w:p>
+      <w:pPr>
+        <w:spacing w:after="240" w:line="480" w:lineRule="auto"/>
+      </w:pPr>
+      <w:r>
+        <w:t>Other predictors, including smoking, BP medication use, and prevalent CHD, were not statistically significant, likely reflecting limited power due to the relatively small number of stroke events within each stratum. For example, there were only seven events among women and five among men with prevalent CHD. Although CHD is a well-established risk factor for stroke, it was not statistically significant in this analysis</w:t>
+      </w:r>
+      <w:r>
+        <w:t>.</w:t>
+      </w:r>
+    </w:p>
+    <w:p>
+      <w:pPr>
+        <w:pStyle w:val="Heading4"/>
+      </w:pPr>
+      <w:r>
+        <w:t>3.</w:t>
+      </w:r>
+      <w:r>
+        <w:t>2</w:t>
+      </w:r>
+      <w:r>
+        <w:t xml:space="preserve"> </w:t>
+      </w:r>
+      <w:r>
+        <w:t>10-year Probability of Stroke by Risk Profile</w:t>
+      </w:r>
+    </w:p>
+    <w:p/>
+    <w:p>
+      <w:pPr>
+        <w:spacing w:line="480" w:lineRule="auto"/>
+      </w:pPr>
+      <w:r>
+        <w:t xml:space="preserve">The estimated 10-year probabilities of stroke were low for individuals without </w:t>
+      </w:r>
+      <w:r>
+        <w:t xml:space="preserve">any </w:t>
+      </w:r>
+      <w:r>
+        <w:t>major risk factors, reflecting the relatively low incidence of stroke in this cohort over a 10-year period. Predicted risk increased with age and the presence of risk factors</w:t>
+      </w:r>
+      <w:r>
+        <w:t xml:space="preserve"> in both men and women. The </w:t>
+      </w:r>
+      <w:r>
+        <w:t xml:space="preserve">highest risks </w:t>
+      </w:r>
+      <w:r>
+        <w:t xml:space="preserve">were </w:t>
+      </w:r>
+      <w:r>
+        <w:t xml:space="preserve">observed among individuals with </w:t>
+      </w:r>
+      <w:r>
+        <w:t xml:space="preserve">multiple risk factors, particularly for men, where having </w:t>
+      </w:r>
+      <w:r>
+        <w:t>diabetes</w:t>
+      </w:r>
+      <w:r>
+        <w:t xml:space="preserve">, </w:t>
+      </w:r>
+      <w:r>
+        <w:t xml:space="preserve">elevated </w:t>
+      </w:r>
+      <w:r>
+        <w:t>BP</w:t>
+      </w:r>
+      <w:r>
+        <w:t xml:space="preserve">, and </w:t>
+      </w:r>
+      <w:r>
+        <w:t>being a</w:t>
+      </w:r>
+      <w:r>
+        <w:t xml:space="preserve"> current smoker</w:t>
+      </w:r>
+      <w:r>
+        <w:t xml:space="preserve"> resulted in the highest probabilities</w:t>
+      </w:r>
+      <w:r>
+        <w:t xml:space="preserve"> (</w:t>
+      </w:r>
+      <w:r>
+        <w:rPr>
+          <w:b/>
+          <w:bCs/>
+        </w:rPr>
+        <w:t xml:space="preserve">Table </w:t>
+      </w:r>
+      <w:r>
+        <w:rPr>
+          <w:b/>
+          <w:bCs/>
+        </w:rPr>
+        <w:t>3</w:t>
+      </w:r>
+      <w:r>
+        <w:t>)</w:t>
+      </w:r>
+      <w:r>
+        <w:t>.</w:t>
+      </w:r>
+    </w:p>
+    <w:p>
+      <w:pPr>
+        <w:pStyle w:val="Caption"/>
         <w:jc w:val="center"/>
-      </w:pPr>
-      <w:r>
-        <w:rPr>
-          <w:noProof/>
-        </w:rPr>
-        <w:lastRenderedPageBreak/>
+        <w:rPr>
+          <w:color w:val="000000" w:themeColor="text1"/>
+          <w:sz w:val="21"/>
+          <w:szCs w:val="21"/>
+        </w:rPr>
+      </w:pPr>
+      <w:r>
+        <w:rPr>
+          <w:color w:val="000000" w:themeColor="text1"/>
+          <w:sz w:val="21"/>
+          <w:szCs w:val="21"/>
+        </w:rPr>
         <w:drawing>
-          <wp:inline distT="0" distB="0" distL="0" distR="0" wp14:anchorId="6CF57B69" wp14:editId="76E807B2">
-            <wp:extent cx="5658416" cy="3893788"/>
-            <wp:effectExtent l="0" t="0" r="0" b="5715"/>
-            <wp:docPr id="497752095" name="Picture 1"/>
+          <wp:inline distT="0" distB="0" distL="0" distR="0" wp14:anchorId="04EE87C0" wp14:editId="18715BB3">
+            <wp:extent cx="5576934" cy="2062154"/>
+            <wp:effectExtent l="0" t="0" r="0" b="0"/>
+            <wp:docPr id="545186418" name="Picture 1"/>
             <wp:cNvGraphicFramePr>
               <a:graphicFrameLocks xmlns:a="http://schemas.openxmlformats.org/drawingml/2006/main" noChangeAspect="1"/>
             </wp:cNvGraphicFramePr>
@@ -1689,7 +2040,7 @@
               <a:graphicData uri="http://schemas.openxmlformats.org/drawingml/2006/picture">
                 <pic:pic xmlns:pic="http://schemas.openxmlformats.org/drawingml/2006/picture">
                   <pic:nvPicPr>
-                    <pic:cNvPr id="497752095" name=""/>
+                    <pic:cNvPr id="545186418" name=""/>
                     <pic:cNvPicPr/>
                   </pic:nvPicPr>
                   <pic:blipFill>
@@ -1701,7 +2052,7 @@
                   <pic:spPr>
                     <a:xfrm>
                       <a:off x="0" y="0"/>
-                      <a:ext cx="5671747" cy="3902961"/>
+                      <a:ext cx="5614293" cy="2075968"/>
                     </a:xfrm>
                     <a:prstGeom prst="rect">
                       <a:avLst/>
@@ -1731,250 +2082,124 @@
           <w:sz w:val="21"/>
           <w:szCs w:val="21"/>
         </w:rPr>
-        <w:t xml:space="preserve">Figure </w:t>
-      </w:r>
-      <w:r>
-        <w:rPr>
-          <w:b/>
-          <w:bCs/>
+        <w:t>Table 3</w:t>
+      </w:r>
+      <w:r>
+        <w:rPr>
           <w:color w:val="000000" w:themeColor="text1"/>
           <w:sz w:val="21"/>
           <w:szCs w:val="21"/>
         </w:rPr>
-        <w:t>1</w:t>
-      </w:r>
-      <w:r>
-        <w:rPr>
+        <w:t xml:space="preserve">.  </w:t>
+      </w:r>
+      <w:r>
+        <w:rPr>
+          <w:rFonts w:asciiTheme="minorHAnsi" w:eastAsiaTheme="minorHAnsi" w:hAnsiTheme="minorHAnsi" w:cstheme="minorBidi"/>
           <w:color w:val="000000" w:themeColor="text1"/>
+          <w:kern w:val="2"/>
           <w:sz w:val="21"/>
           <w:szCs w:val="21"/>
-        </w:rPr>
-        <w:t xml:space="preserve">. Kaplan–Meier curves of stroke-free survival over 10 years, stratified by </w:t>
-      </w:r>
-      <w:r>
-        <w:rPr>
+          <w14:ligatures w14:val="standardContextual"/>
+        </w:rPr>
+        <w:t xml:space="preserve">Predicted 10-year stroke risk (%) by age, sex, and risk profile from sex-specific Cox models. </w:t>
+      </w:r>
+      <w:r>
+        <w:rPr>
+          <w:rFonts w:asciiTheme="minorHAnsi" w:eastAsiaTheme="minorHAnsi" w:hAnsiTheme="minorHAnsi" w:cstheme="minorBidi"/>
           <w:color w:val="000000" w:themeColor="text1"/>
+          <w:kern w:val="2"/>
           <w:sz w:val="21"/>
           <w:szCs w:val="21"/>
-        </w:rPr>
-        <w:t xml:space="preserve">sex and </w:t>
-      </w:r>
-      <w:r>
-        <w:rPr>
+          <w14:ligatures w14:val="standardContextual"/>
+        </w:rPr>
+        <w:t>Other r</w:t>
+      </w:r>
+      <w:r>
+        <w:rPr>
+          <w:rFonts w:asciiTheme="minorHAnsi" w:eastAsiaTheme="minorHAnsi" w:hAnsiTheme="minorHAnsi" w:cstheme="minorBidi"/>
           <w:color w:val="000000" w:themeColor="text1"/>
+          <w:kern w:val="2"/>
           <w:sz w:val="21"/>
           <w:szCs w:val="21"/>
-        </w:rPr>
-        <w:t>baseline</w:t>
-      </w:r>
-      <w:r>
-        <w:rPr>
+          <w14:ligatures w14:val="standardContextual"/>
+        </w:rPr>
+        <w:t xml:space="preserve">isk </w:t>
+      </w:r>
+      <w:r>
+        <w:rPr>
+          <w:rFonts w:asciiTheme="minorHAnsi" w:eastAsiaTheme="minorHAnsi" w:hAnsiTheme="minorHAnsi" w:cstheme="minorBidi"/>
           <w:color w:val="000000" w:themeColor="text1"/>
+          <w:kern w:val="2"/>
           <w:sz w:val="21"/>
           <w:szCs w:val="21"/>
-        </w:rPr>
-        <w:t xml:space="preserve"> risk factors</w:t>
-      </w:r>
-      <w:r>
-        <w:rPr>
+          <w14:ligatures w14:val="standardContextual"/>
+        </w:rPr>
+        <w:t>factors were</w:t>
+      </w:r>
+      <w:r>
+        <w:rPr>
+          <w:rFonts w:asciiTheme="minorHAnsi" w:eastAsiaTheme="minorHAnsi" w:hAnsiTheme="minorHAnsi" w:cstheme="minorBidi"/>
           <w:color w:val="000000" w:themeColor="text1"/>
+          <w:kern w:val="2"/>
           <w:sz w:val="21"/>
           <w:szCs w:val="21"/>
-        </w:rPr>
-        <w:t>. Each panel displays survival probabilities for levels of the corresponding risk factor</w:t>
-      </w:r>
-      <w:r>
-        <w:rPr>
+          <w14:ligatures w14:val="standardContextual"/>
+        </w:rPr>
+        <w:t xml:space="preserve"> held constant at reference levels</w:t>
+      </w:r>
+      <w:r>
+        <w:rPr>
+          <w:rFonts w:asciiTheme="minorHAnsi" w:eastAsiaTheme="minorHAnsi" w:hAnsiTheme="minorHAnsi" w:cstheme="minorBidi"/>
           <w:color w:val="000000" w:themeColor="text1"/>
+          <w:kern w:val="2"/>
           <w:sz w:val="21"/>
           <w:szCs w:val="21"/>
-        </w:rPr>
-        <w:t xml:space="preserve"> for women and men</w:t>
-      </w:r>
-      <w:r>
-        <w:rPr>
+          <w14:ligatures w14:val="standardContextual"/>
+        </w:rPr>
+        <w:t xml:space="preserve"> (absent of disease)</w:t>
+      </w:r>
+      <w:r>
+        <w:rPr>
+          <w:rFonts w:asciiTheme="minorHAnsi" w:eastAsiaTheme="minorHAnsi" w:hAnsiTheme="minorHAnsi" w:cstheme="minorBidi"/>
           <w:color w:val="000000" w:themeColor="text1"/>
+          <w:kern w:val="2"/>
           <w:sz w:val="21"/>
           <w:szCs w:val="21"/>
-        </w:rPr>
-        <w:t>, with tick marks denoting censored observations.</w:t>
-      </w:r>
-    </w:p>
-    <w:p>
-      <w:r>
-        <w:t xml:space="preserve">Kaplan–Meier curves stratified by selected baseline risk factors showed modest differences in stroke-free survival over 10 years. Lower survival probabilities were observed among participants with elevated systolic </w:t>
-      </w:r>
-      <w:r>
-        <w:t>BP</w:t>
-      </w:r>
-      <w:r>
-        <w:t xml:space="preserve">, </w:t>
-      </w:r>
-      <w:r>
-        <w:t xml:space="preserve">not on BP medication, </w:t>
-      </w:r>
-      <w:r>
-        <w:t xml:space="preserve">diabetes, prevalent </w:t>
-      </w:r>
-      <w:r>
-        <w:t>CHD</w:t>
-      </w:r>
-      <w:r>
-        <w:t xml:space="preserve">, and older age. </w:t>
-      </w:r>
-      <w:r>
-        <w:t>Although these differences appear</w:t>
-      </w:r>
-      <w:r>
-        <w:t xml:space="preserve"> small in magnitude</w:t>
-      </w:r>
-      <w:r>
-        <w:t>,</w:t>
-      </w:r>
-      <w:r>
-        <w:t xml:space="preserve"> due to the low incidence of stroke, </w:t>
-      </w:r>
-      <w:r>
-        <w:t>it</w:t>
-      </w:r>
-      <w:r>
-        <w:t xml:space="preserve"> support</w:t>
-      </w:r>
-      <w:r>
-        <w:t>s</w:t>
-      </w:r>
-      <w:r>
-        <w:t xml:space="preserve"> the inclusion of these variables</w:t>
+          <w14:ligatures w14:val="standardContextual"/>
+        </w:rPr>
+        <w:t>.</w:t>
+      </w:r>
+    </w:p>
+    <w:p/>
+    <w:p/>
+    <w:p>
+      <w:pPr>
+        <w:pStyle w:val="Heading4"/>
+      </w:pPr>
+      <w:r>
+        <w:t>3.</w:t>
+      </w:r>
+      <w:r>
+        <w:t>3</w:t>
       </w:r>
       <w:r>
         <w:t xml:space="preserve"> </w:t>
       </w:r>
       <w:r>
-        <w:t>in subsequent multivariable Cox proportional hazards models.</w:t>
+        <w:t>Time-varying Covariates</w:t>
       </w:r>
     </w:p>
     <w:p/>
     <w:p>
-      <w:r>
-        <w:t>Several predictors, including diabetes, smoking, blood pressure medication use, and prevalent coronary heart disease, were not statistically significant in the multivariable models. This is likely due in part to the relatively low number of stroke events, particularly within subgroups such as individuals with prevalent coronary heart disease, resulting in limited statistical power and wide confidence intervals. Notably, point estimates for several of these variables suggest potentially meaningful associations despite the lack of statistical significance.</w:t>
-      </w:r>
-    </w:p>
-    <w:p/>
-    <w:p>
-      <w:pPr>
-        <w:spacing w:after="160" w:line="278" w:lineRule="auto"/>
-      </w:pPr>
-      <w:r>
-        <w:t>The direction and magnitude of several effect estimates were consistent with established clinical risk factors, suggesting that lack of statistical significance may reflect limited power rather than absence of association.</w:t>
-      </w:r>
-    </w:p>
-    <w:p/>
-    <w:p>
-      <w:pPr>
-        <w:pStyle w:val="Heading4"/>
-      </w:pPr>
-      <w:r>
-        <w:lastRenderedPageBreak/>
-        <w:t>3.</w:t>
-      </w:r>
-      <w:r>
-        <w:t>1</w:t>
-      </w:r>
-      <w:r>
-        <w:t xml:space="preserve"> </w:t>
-      </w:r>
-      <w:r>
-        <w:t>Risk Factors of Stroke</w:t>
-      </w:r>
-    </w:p>
-    <w:p>
-      <w:pPr>
-        <w:spacing w:after="160" w:line="278" w:lineRule="auto"/>
-      </w:pPr>
-      <w:r>
-        <w:t>Results from stepwise procedures, indicated that only smoking status was a significant predictor of stroke. However, b</w:t>
-      </w:r>
-      <w:r>
-        <w:t>ased on prior literature</w:t>
-      </w:r>
-      <w:r>
-        <w:t xml:space="preserve"> and </w:t>
-      </w:r>
-      <w:r>
-        <w:t>the Framingham Stroke Risk Profile</w:t>
-      </w:r>
-      <w:r>
-        <w:t xml:space="preserve"> report</w:t>
-      </w:r>
-      <w:r>
-        <w:t xml:space="preserve">, an interaction between systolic blood pressure and </w:t>
-      </w:r>
-      <w:r>
-        <w:t>blood pressure medication</w:t>
-      </w:r>
-      <w:r>
-        <w:t xml:space="preserve"> and prevalence of cardiovascular disease</w:t>
-      </w:r>
-      <w:r>
-        <w:t xml:space="preserve"> use</w:t>
-      </w:r>
-      <w:r>
-        <w:t xml:space="preserve"> was </w:t>
-      </w:r>
-      <w:r>
-        <w:t xml:space="preserve">included </w:t>
-      </w:r>
-      <w:r>
-        <w:t xml:space="preserve">in the models </w:t>
-      </w:r>
-      <w:r>
-        <w:t>regardless of significance</w:t>
-      </w:r>
-      <w:r>
-        <w:t xml:space="preserve"> due to clinical </w:t>
-      </w:r>
-      <w:r>
-        <w:t>significance</w:t>
-      </w:r>
-      <w:r>
-        <w:t>. Th</w:t>
-      </w:r>
-      <w:r>
-        <w:t xml:space="preserve">e </w:t>
-      </w:r>
-      <w:r>
-        <w:t>term</w:t>
-      </w:r>
-      <w:r>
-        <w:t>s were</w:t>
-      </w:r>
-      <w:r>
-        <w:t xml:space="preserve"> evaluated within </w:t>
-      </w:r>
-      <w:r>
-        <w:t xml:space="preserve">each </w:t>
-      </w:r>
-      <w:r>
-        <w:t>sex-specific Cox models.</w:t>
-      </w:r>
-    </w:p>
-    <w:p>
-      <w:pPr>
-        <w:spacing w:after="160" w:line="278" w:lineRule="auto"/>
-        <w:rPr>
-          <w:rFonts w:asciiTheme="minorHAnsi" w:eastAsiaTheme="minorHAnsi" w:hAnsiTheme="minorHAnsi" w:cstheme="minorBidi"/>
-          <w:kern w:val="2"/>
-          <w14:ligatures w14:val="standardContextual"/>
-        </w:rPr>
-      </w:pPr>
-    </w:p>
-    <w:p>
+      <w:pPr>
+        <w:jc w:val="center"/>
+      </w:pPr>
       <w:r>
         <w:drawing>
-          <wp:inline distT="0" distB="0" distL="0" distR="0" wp14:anchorId="52AB9347" wp14:editId="71CEDCA8">
-            <wp:extent cx="5943600" cy="2291080"/>
+          <wp:inline distT="0" distB="0" distL="0" distR="0" wp14:anchorId="38EE3CF9" wp14:editId="40B1C1A7">
+            <wp:extent cx="5943600" cy="1563370"/>
             <wp:effectExtent l="0" t="0" r="0" b="0"/>
-            <wp:docPr id="410048960" name="Picture 1"/>
+            <wp:docPr id="952664028" name="Picture 1"/>
             <wp:cNvGraphicFramePr>
               <a:graphicFrameLocks xmlns:a="http://schemas.openxmlformats.org/drawingml/2006/main" noChangeAspect="1"/>
             </wp:cNvGraphicFramePr>
@@ -1982,7 +2207,7 @@
               <a:graphicData uri="http://schemas.openxmlformats.org/drawingml/2006/picture">
                 <pic:pic xmlns:pic="http://schemas.openxmlformats.org/drawingml/2006/picture">
                   <pic:nvPicPr>
-                    <pic:cNvPr id="410048960" name=""/>
+                    <pic:cNvPr id="952664028" name=""/>
                     <pic:cNvPicPr/>
                   </pic:nvPicPr>
                   <pic:blipFill>
@@ -1994,7 +2219,7 @@
                   <pic:spPr>
                     <a:xfrm>
                       <a:off x="0" y="0"/>
-                      <a:ext cx="5943600" cy="2291080"/>
+                      <a:ext cx="5943600" cy="1563370"/>
                     </a:xfrm>
                     <a:prstGeom prst="rect">
                       <a:avLst/>
@@ -2011,51 +2236,6 @@
       <w:pPr>
         <w:pStyle w:val="Caption"/>
         <w:rPr>
-          <w:color w:val="000000" w:themeColor="text1"/>
-          <w:sz w:val="21"/>
-          <w:szCs w:val="21"/>
-        </w:rPr>
-      </w:pPr>
-      <w:r>
-        <w:rPr>
-          <w:b/>
-          <w:bCs/>
-          <w:color w:val="000000" w:themeColor="text1"/>
-          <w:sz w:val="21"/>
-          <w:szCs w:val="21"/>
-        </w:rPr>
-        <w:t xml:space="preserve"> </w:t>
-      </w:r>
-      <w:r>
-        <w:rPr>
-          <w:b/>
-          <w:bCs/>
-          <w:color w:val="000000" w:themeColor="text1"/>
-          <w:sz w:val="21"/>
-          <w:szCs w:val="21"/>
-        </w:rPr>
-        <w:t xml:space="preserve">Table </w:t>
-      </w:r>
-      <w:r>
-        <w:rPr>
-          <w:b/>
-          <w:bCs/>
-          <w:color w:val="000000" w:themeColor="text1"/>
-          <w:sz w:val="21"/>
-          <w:szCs w:val="21"/>
-        </w:rPr>
-        <w:t>2</w:t>
-      </w:r>
-      <w:r>
-        <w:rPr>
-          <w:color w:val="000000" w:themeColor="text1"/>
-          <w:sz w:val="21"/>
-          <w:szCs w:val="21"/>
-        </w:rPr>
-        <w:t xml:space="preserve">.  </w:t>
-      </w:r>
-      <w:r>
-        <w:rPr>
           <w:rFonts w:asciiTheme="minorHAnsi" w:eastAsiaTheme="minorHAnsi" w:hAnsiTheme="minorHAnsi" w:cstheme="minorBidi"/>
           <w:color w:val="000000" w:themeColor="text1"/>
           <w:kern w:val="2"/>
@@ -2063,15 +2243,24 @@
           <w:szCs w:val="21"/>
           <w14:ligatures w14:val="standardContextual"/>
         </w:rPr>
-        <w:t xml:space="preserve">Sex-specific Cox proportional hazards models for 10-year stroke risk. Hazard ratios (95% CI; p-value) and percent change in hazard are shown for each </w:t>
-      </w:r>
-      <w:r>
-        <w:rPr>
+      </w:pPr>
+      <w:r>
+        <w:rPr>
+          <w:b/>
+          <w:bCs/>
           <w:color w:val="000000" w:themeColor="text1"/>
           <w:sz w:val="21"/>
           <w:szCs w:val="21"/>
         </w:rPr>
-        <w:t>risk facto</w:t>
+        <w:t>Table 4</w:t>
+      </w:r>
+      <w:r>
+        <w:rPr>
+          <w:color w:val="000000" w:themeColor="text1"/>
+          <w:sz w:val="21"/>
+          <w:szCs w:val="21"/>
+        </w:rPr>
+        <w:t xml:space="preserve">.  </w:t>
       </w:r>
       <w:r>
         <w:rPr>
@@ -2082,211 +2271,9 @@
           <w:szCs w:val="21"/>
           <w14:ligatures w14:val="standardContextual"/>
         </w:rPr>
-        <w:t>r. Continuous variables are scaled as indicated, and categorical variables are compared to their reference groups</w:t>
-      </w:r>
-      <w:r>
-        <w:rPr>
-          <w:color w:val="000000" w:themeColor="text1"/>
-          <w:sz w:val="21"/>
-          <w:szCs w:val="21"/>
-        </w:rPr>
-        <w:t>.</w:t>
-      </w:r>
-    </w:p>
-    <w:p>
-      <w:pPr>
-        <w:spacing w:after="160" w:line="278" w:lineRule="auto"/>
-      </w:pPr>
-      <w:r>
-        <w:t xml:space="preserve">In sex-stratified Cox models, </w:t>
-      </w:r>
-      <w:r>
-        <w:rPr>
-          <w:rFonts w:eastAsiaTheme="majorEastAsia"/>
-        </w:rPr>
-        <w:t>age and systolic blood pressure</w:t>
-      </w:r>
-      <w:r>
-        <w:t xml:space="preserve"> were </w:t>
-      </w:r>
-      <w:r>
-        <w:t xml:space="preserve">identified as major risk factors </w:t>
-      </w:r>
-      <w:r>
-        <w:t xml:space="preserve">of stroke in both men and women. </w:t>
-      </w:r>
-      <w:r>
-        <w:t>Systolic BP</w:t>
-      </w:r>
-      <w:r>
-        <w:t xml:space="preserve"> showed a 28% increase in hazard per 10 mmHg in women and 41% in men.</w:t>
-      </w:r>
-    </w:p>
-    <w:p>
-      <w:pPr>
-        <w:spacing w:after="160" w:line="278" w:lineRule="auto"/>
-      </w:pPr>
-      <w:r>
-        <w:rPr>
-          <w:rFonts w:eastAsiaTheme="majorEastAsia"/>
-        </w:rPr>
-        <w:t>Diabetes</w:t>
-      </w:r>
-      <w:r>
-        <w:t xml:space="preserve">, </w:t>
-      </w:r>
-      <w:r>
-        <w:rPr>
-          <w:rFonts w:eastAsiaTheme="majorEastAsia"/>
-        </w:rPr>
-        <w:t>current smoking</w:t>
-      </w:r>
-      <w:r>
-        <w:t xml:space="preserve"> status, and interaction </w:t>
-      </w:r>
-      <w:r>
-        <w:t xml:space="preserve">between </w:t>
-      </w:r>
-      <w:r>
-        <w:rPr>
-          <w:rFonts w:eastAsiaTheme="majorEastAsia"/>
-        </w:rPr>
-        <w:t>systolic blood pressure and blood pressure medication</w:t>
-      </w:r>
-      <w:r>
-        <w:t xml:space="preserve"> were associated with increased stroke risk</w:t>
-      </w:r>
-      <w:r>
-        <w:t xml:space="preserve"> for</w:t>
-      </w:r>
-      <w:r>
-        <w:t xml:space="preserve"> men but not women. </w:t>
-      </w:r>
-      <w:r>
-        <w:rPr>
-          <w:rFonts w:eastAsiaTheme="majorEastAsia"/>
-        </w:rPr>
-        <w:t>Cardiovascular disease</w:t>
-      </w:r>
-      <w:r>
-        <w:t xml:space="preserve"> showed positive but non-significant associations in both sexes. The lack of statistical significance</w:t>
-      </w:r>
-      <w:r>
-        <w:t xml:space="preserve"> </w:t>
-      </w:r>
-      <w:r>
-        <w:t xml:space="preserve">for several </w:t>
-      </w:r>
-      <w:r>
-        <w:t>risk factors</w:t>
-      </w:r>
-      <w:r>
-        <w:t xml:space="preserve"> likely reflects limited power due to the relatively small number of stroke events</w:t>
-      </w:r>
-      <w:r>
-        <w:t xml:space="preserve"> </w:t>
-      </w:r>
-      <w:r>
-        <w:t xml:space="preserve">within each stratification. This was highlighted in </w:t>
-      </w:r>
-      <w:r>
-        <w:rPr>
-          <w:b/>
-          <w:bCs/>
-        </w:rPr>
-        <w:t>Figure 1</w:t>
-      </w:r>
-      <w:r>
-        <w:t>, where limited follow-up for some risk factors.</w:t>
-      </w:r>
-    </w:p>
-    <w:p/>
-    <w:p>
-      <w:pPr>
-        <w:pStyle w:val="Heading4"/>
-      </w:pPr>
-      <w:r>
-        <w:t>3.</w:t>
-      </w:r>
-      <w:r>
-        <w:t>2</w:t>
-      </w:r>
-      <w:r>
-        <w:t xml:space="preserve"> </w:t>
-      </w:r>
-      <w:r>
-        <w:t>10-year Probability of Stroke by Risk Profile</w:t>
-      </w:r>
-    </w:p>
-    <w:p/>
-    <w:p/>
-    <w:p/>
-    <w:p>
-      <w:r>
-        <w:t xml:space="preserve">The estimated 10-year probabilities of stroke were low for individuals without </w:t>
-      </w:r>
-      <w:r>
-        <w:t xml:space="preserve">any </w:t>
-      </w:r>
-      <w:r>
-        <w:t>major risk factors, reflecting the relatively low incidence of stroke in this cohort over a 10-year period. Predicted risk increased with age and the presence of risk factors</w:t>
-      </w:r>
-      <w:r>
-        <w:t xml:space="preserve"> in both men and women. The </w:t>
-      </w:r>
-      <w:r>
-        <w:t xml:space="preserve">highest risks </w:t>
-      </w:r>
-      <w:r>
-        <w:t xml:space="preserve">were </w:t>
-      </w:r>
-      <w:r>
-        <w:t xml:space="preserve">observed among individuals with </w:t>
-      </w:r>
-      <w:r>
-        <w:t xml:space="preserve">multiple risk factors, particularly for men, </w:t>
-      </w:r>
-      <w:r>
-        <w:lastRenderedPageBreak/>
-        <w:t xml:space="preserve">where having </w:t>
-      </w:r>
-      <w:r>
-        <w:t>diabetes</w:t>
-      </w:r>
-      <w:r>
-        <w:t xml:space="preserve">, </w:t>
-      </w:r>
-      <w:r>
-        <w:t>elevated blood pressure</w:t>
-      </w:r>
-      <w:r>
-        <w:t xml:space="preserve">, and </w:t>
-      </w:r>
-      <w:r>
-        <w:t>being a</w:t>
-      </w:r>
-      <w:r>
-        <w:t xml:space="preserve"> current smoker</w:t>
-      </w:r>
-      <w:r>
-        <w:t xml:space="preserve"> resulted in the highest probabilities</w:t>
-      </w:r>
-      <w:r>
-        <w:t>.</w:t>
-      </w:r>
-    </w:p>
-    <w:p>
-      <w:pPr>
-        <w:rPr>
-          <w:rFonts w:asciiTheme="minorHAnsi" w:eastAsiaTheme="minorHAnsi" w:hAnsiTheme="minorHAnsi" w:cstheme="minorBidi"/>
-          <w:kern w:val="2"/>
-          <w14:ligatures w14:val="standardContextual"/>
-        </w:rPr>
-      </w:pPr>
-    </w:p>
-    <w:p>
-      <w:pPr>
-        <w:pStyle w:val="Caption"/>
+        <w:t>Distribution of risk factors across three examination periods in the Framingham Heart Study, stratified by sex. Continuous variables are presented as mean (</w:t>
+      </w:r>
+      <w:r>
         <w:rPr>
           <w:rFonts w:asciiTheme="minorHAnsi" w:eastAsiaTheme="minorHAnsi" w:hAnsiTheme="minorHAnsi" w:cstheme="minorBidi"/>
           <w:color w:val="000000" w:themeColor="text1"/>
@@ -2295,34 +2282,7 @@
           <w:szCs w:val="21"/>
           <w14:ligatures w14:val="standardContextual"/>
         </w:rPr>
-      </w:pPr>
-      <w:r>
-        <w:rPr>
-          <w:b/>
-          <w:bCs/>
-          <w:color w:val="000000" w:themeColor="text1"/>
-          <w:sz w:val="21"/>
-          <w:szCs w:val="21"/>
-        </w:rPr>
-        <w:t xml:space="preserve">Table </w:t>
-      </w:r>
-      <w:r>
-        <w:rPr>
-          <w:b/>
-          <w:bCs/>
-          <w:color w:val="000000" w:themeColor="text1"/>
-          <w:sz w:val="21"/>
-          <w:szCs w:val="21"/>
-        </w:rPr>
-        <w:t>2</w:t>
-      </w:r>
-      <w:r>
-        <w:rPr>
-          <w:color w:val="000000" w:themeColor="text1"/>
-          <w:sz w:val="21"/>
-          <w:szCs w:val="21"/>
-        </w:rPr>
-        <w:t xml:space="preserve">.  </w:t>
+        <w:t>SD</w:t>
       </w:r>
       <w:r>
         <w:rPr>
@@ -2333,75 +2293,117 @@
           <w:szCs w:val="21"/>
           <w14:ligatures w14:val="standardContextual"/>
         </w:rPr>
-        <w:t>Predicted 10-year stroke risk (%) by age, sex, and risk profile from sex-specific Cox models. Risk profiles include baseline, high blood pressure, diabetes, diabetes with high blood pressure, and combined smoking, diabetes, and high blood pressure, with other factors held constant at reference levels</w:t>
-      </w:r>
-      <w:r>
-        <w:rPr>
-          <w:color w:val="000000" w:themeColor="text1"/>
-          <w:sz w:val="21"/>
-          <w:szCs w:val="21"/>
-        </w:rPr>
-        <w:t xml:space="preserve"> (absent of disease)</w:t>
-      </w:r>
-      <w:r>
-        <w:rPr>
-          <w:rFonts w:asciiTheme="minorHAnsi" w:eastAsiaTheme="minorHAnsi" w:hAnsiTheme="minorHAnsi" w:cstheme="minorBidi"/>
-          <w:color w:val="000000" w:themeColor="text1"/>
-          <w:kern w:val="2"/>
-          <w:sz w:val="21"/>
-          <w:szCs w:val="21"/>
-          <w14:ligatures w14:val="standardContextual"/>
-        </w:rPr>
+        <w:t>), and categorical variables are presented as percentages. Estimates reflect cross-sectional summaries at each examination period.</w:t>
+      </w:r>
+    </w:p>
+    <w:p/>
+    <w:p>
+      <w:pPr>
+        <w:spacing w:line="480" w:lineRule="auto"/>
+      </w:pPr>
+      <w:r>
+        <w:t xml:space="preserve">Risk factor distributions changed over time in both men and women. Systolic </w:t>
+      </w:r>
+      <w:r>
+        <w:t>BP</w:t>
+      </w:r>
+      <w:r>
+        <w:t xml:space="preserve"> and diabetes prevalence increased over time, while smoking prevalence declined in both sexes. </w:t>
+      </w:r>
+    </w:p>
+    <w:p>
+      <w:pPr>
+        <w:jc w:val="center"/>
+      </w:pPr>
+    </w:p>
+    <w:p>
+      <w:pPr>
+        <w:pStyle w:val="Heading2"/>
+      </w:pPr>
+      <w:bookmarkStart w:id="16" w:name="_Toc221022976"/>
+      <w:bookmarkStart w:id="17" w:name="_Toc227079196"/>
+      <w:r>
+        <w:t>4. Discussion</w:t>
+      </w:r>
+      <w:bookmarkEnd w:id="16"/>
+      <w:bookmarkEnd w:id="17"/>
+    </w:p>
+    <w:p>
+      <w:pPr>
+        <w:pStyle w:val="p1"/>
+        <w:spacing w:line="480" w:lineRule="auto"/>
+      </w:pPr>
+      <w:r>
+        <w:t xml:space="preserve">High </w:t>
+      </w:r>
+      <w:r>
+        <w:t>S</w:t>
+      </w:r>
+      <w:r>
+        <w:t>BP</w:t>
+      </w:r>
+      <w:r>
+        <w:t xml:space="preserve"> (hypertension) was identified as the primary risk factor for stroke in both </w:t>
+      </w:r>
+      <w:r>
+        <w:t>sexes</w:t>
+      </w:r>
+      <w:r>
+        <w:t xml:space="preserve">, consistent with findings from Wolf et al. Among men, </w:t>
+      </w:r>
+      <w:r>
+        <w:t xml:space="preserve">smoking, </w:t>
+      </w:r>
+      <w:r>
+        <w:t xml:space="preserve">diabetes and the interaction between </w:t>
+      </w:r>
+      <w:r>
+        <w:t>SBP</w:t>
+      </w:r>
+      <w:r>
+        <w:t xml:space="preserve"> and BP medication use were also identified as important predictors of stroke. </w:t>
+      </w:r>
+    </w:p>
+    <w:p>
+      <w:pPr>
+        <w:pStyle w:val="p1"/>
+        <w:spacing w:line="480" w:lineRule="auto"/>
+      </w:pPr>
+      <w:r>
+        <w:t>Although several additional risk factors, were not statistically significan, their estimated effects were generally consistent with prior literature. The lack of statistical significance is likely attributable to the relatively low number of stroke events.</w:t>
+      </w:r>
+    </w:p>
+    <w:p>
+      <w:pPr>
+        <w:pStyle w:val="p1"/>
+        <w:spacing w:line="480" w:lineRule="auto"/>
+      </w:pPr>
+      <w:r>
+        <w:t xml:space="preserve">Predicted 10-year stroke risk increased with both age and accumulation of risk factors, with the highest probabilities observed among individuals with multiple concurrent risk factors. </w:t>
+      </w:r>
+    </w:p>
+    <w:p>
+      <w:pPr>
+        <w:pStyle w:val="p1"/>
+        <w:spacing w:line="480" w:lineRule="auto"/>
+      </w:pPr>
+      <w:r>
+        <w:lastRenderedPageBreak/>
+        <w:t>Risk factor distributions were also observed to change across examination periods, with increases in SBP and diabetes prevalence and declines in smoking prevalence over time. These findings suggest that</w:t>
+      </w:r>
+      <w:r>
+        <w:t xml:space="preserve"> a</w:t>
+      </w:r>
+      <w:r>
+        <w:t xml:space="preserve"> time-varying covariate analysis </w:t>
+      </w:r>
+      <w:r>
+        <w:t>may provide more accurate estimates in future work</w:t>
+      </w:r>
+      <w:r>
         <w:t>.</w:t>
       </w:r>
     </w:p>
-    <w:p>
-      <w:pPr>
-        <w:pStyle w:val="Caption"/>
-        <w:rPr>
-          <w:color w:val="000000" w:themeColor="text1"/>
-          <w:sz w:val="21"/>
-          <w:szCs w:val="21"/>
-        </w:rPr>
-      </w:pPr>
-    </w:p>
-    <w:p>
-      <w:pPr>
-        <w:rPr>
-          <w:rFonts w:asciiTheme="minorHAnsi" w:eastAsiaTheme="minorHAnsi" w:hAnsiTheme="minorHAnsi" w:cstheme="minorBidi"/>
-          <w:kern w:val="2"/>
-          <w14:ligatures w14:val="standardContextual"/>
-        </w:rPr>
-      </w:pPr>
-    </w:p>
-    <w:p/>
-    <w:p>
-      <w:pPr>
-        <w:pStyle w:val="Heading2"/>
-      </w:pPr>
-      <w:bookmarkStart w:id="17" w:name="_Toc221022976"/>
-      <w:bookmarkStart w:id="18" w:name="_Toc227079196"/>
-      <w:r>
-        <w:t>4. Discussion</w:t>
-      </w:r>
-      <w:bookmarkEnd w:id="17"/>
-      <w:bookmarkEnd w:id="18"/>
-    </w:p>
-    <w:p>
-      <w:r>
-        <w:t xml:space="preserve">High blood pressure (hypertension) was identified as the largest risk factor </w:t>
-      </w:r>
-      <w:r>
-        <w:t>of</w:t>
-      </w:r>
-      <w:r>
-        <w:t xml:space="preserve"> stroke</w:t>
-      </w:r>
-      <w:r>
-        <w:t xml:space="preserve"> for both women and men.</w:t>
-      </w:r>
-    </w:p>
-    <w:p/>
     <w:p>
       <w:pPr>
         <w:pStyle w:val="Heading4"/>
@@ -2420,6 +2422,21 @@
     <w:p/>
     <w:p>
       <w:pPr>
+        <w:spacing w:line="480" w:lineRule="auto"/>
+      </w:pPr>
+      <w:r>
+        <w:t xml:space="preserve">Several limitations should be considered. First, the low number of stroke events limited statistical power, particularly for less prevalent risk factors and within sex-stratified analyses. Second, the use of baseline covariates may not capture changes in risk over time. Third, </w:t>
+      </w:r>
+      <w:r>
+        <w:t xml:space="preserve">while model selection was guided by multiple information criteria, </w:t>
+      </w:r>
+      <w:r>
+        <w:t>stepwise variable selection may introduce bias and overfitting, especially with correlated predictors. Finally, complete-case analysis may introduce bias if missingness is not at random.</w:t>
+      </w:r>
+    </w:p>
+    <w:p/>
+    <w:p>
+      <w:pPr>
         <w:pStyle w:val="Heading4"/>
         <w:contextualSpacing/>
       </w:pPr>
@@ -2433,17 +2450,50 @@
         <w:t>Conclusions</w:t>
       </w:r>
     </w:p>
+    <w:p>
+      <w:pPr>
+        <w:pStyle w:val="p1"/>
+        <w:spacing w:line="480" w:lineRule="auto"/>
+      </w:pPr>
+      <w:r>
+        <w:t>In this cohort from the Framingham Heart Study, age and SBP were identified as the primary determinants of 10-year stroke risk in both men and women. While several additional risk factors were not statistically significant, their estimated effects were consistent with established clinical knowledge, suggesting that limited statistical power may have influenced inference.</w:t>
+      </w:r>
+    </w:p>
+    <w:p>
+      <w:pPr>
+        <w:pStyle w:val="p1"/>
+        <w:spacing w:line="480" w:lineRule="auto"/>
+      </w:pPr>
+      <w:r>
+        <w:t xml:space="preserve">Predicted stroke risk increased with the </w:t>
+      </w:r>
+      <w:r>
+        <w:t>accumulation</w:t>
+      </w:r>
+      <w:r>
+        <w:t xml:space="preserve"> of risk factors, </w:t>
+      </w:r>
+      <w:r>
+        <w:t>particularly among men</w:t>
+      </w:r>
+      <w:r>
+        <w:t>. Observed changes in risk factor distributions over time further suggest that future analyses incorporating time-varying covariates may improve estimation of stroke risk.</w:t>
+      </w:r>
+    </w:p>
     <w:p/>
     <w:p/>
+    <w:p/>
+    <w:p/>
     <w:p>
       <w:pPr>
         <w:pStyle w:val="Heading2"/>
       </w:pPr>
-      <w:bookmarkStart w:id="19" w:name="_Toc227079197"/>
-      <w:r>
+      <w:bookmarkStart w:id="18" w:name="_Toc227079197"/>
+      <w:r>
+        <w:lastRenderedPageBreak/>
         <w:t>References</w:t>
       </w:r>
-      <w:bookmarkEnd w:id="19"/>
+      <w:bookmarkEnd w:id="18"/>
     </w:p>
     <w:p>
       <w:r>
@@ -2453,8 +2503,14 @@
     <w:p>
       <w:pPr>
         <w:pStyle w:val="p1"/>
-      </w:pPr>
-      <w:r>
+        <w:rPr>
+          <w:lang w:val="it-IT"/>
+        </w:rPr>
+      </w:pPr>
+      <w:r>
+        <w:rPr>
+          <w:lang w:val="it-IT"/>
+        </w:rPr>
         <w:t xml:space="preserve">Li, J., Hu, K., Lu, X., Nayak, S. N., Bautista Sotelo, C., Lodato, M. A., Liu, W., &amp; Zhu, L. J. (2026). </w:t>
       </w:r>
       <w:proofErr w:type="spellStart"/>
@@ -2462,6 +2518,7 @@
         <w:rPr>
           <w:i/>
           <w:iCs/>
+          <w:lang w:val="it-IT"/>
         </w:rPr>
         <w:t>StepReg</w:t>
       </w:r>
@@ -2470,16 +2527,75 @@
         <w:rPr>
           <w:i/>
           <w:iCs/>
-        </w:rPr>
-        <w:t>: Stepwise regression analysis (Version 1.6.2) [R package vignette]</w:t>
-      </w:r>
-      <w:r>
+          <w:lang w:val="it-IT"/>
+        </w:rPr>
+        <w:t xml:space="preserve">: </w:t>
+      </w:r>
+      <w:proofErr w:type="spellStart"/>
+      <w:r>
+        <w:rPr>
+          <w:i/>
+          <w:iCs/>
+          <w:lang w:val="it-IT"/>
+        </w:rPr>
+        <w:t>Stepwise</w:t>
+      </w:r>
+      <w:proofErr w:type="spellEnd"/>
+      <w:r>
+        <w:rPr>
+          <w:i/>
+          <w:iCs/>
+          <w:lang w:val="it-IT"/>
+        </w:rPr>
+        <w:t xml:space="preserve"> </w:t>
+      </w:r>
+      <w:proofErr w:type="spellStart"/>
+      <w:r>
+        <w:rPr>
+          <w:i/>
+          <w:iCs/>
+          <w:lang w:val="it-IT"/>
+        </w:rPr>
+        <w:t>regression</w:t>
+      </w:r>
+      <w:proofErr w:type="spellEnd"/>
+      <w:r>
+        <w:rPr>
+          <w:i/>
+          <w:iCs/>
+          <w:lang w:val="it-IT"/>
+        </w:rPr>
+        <w:t xml:space="preserve"> </w:t>
+      </w:r>
+      <w:proofErr w:type="spellStart"/>
+      <w:r>
+        <w:rPr>
+          <w:i/>
+          <w:iCs/>
+          <w:lang w:val="it-IT"/>
+        </w:rPr>
+        <w:t>analysis</w:t>
+      </w:r>
+      <w:proofErr w:type="spellEnd"/>
+      <w:r>
+        <w:rPr>
+          <w:i/>
+          <w:iCs/>
+          <w:lang w:val="it-IT"/>
+        </w:rPr>
+        <w:t xml:space="preserve"> (Version 1.6.2) [R package vignette]</w:t>
+      </w:r>
+      <w:r>
+        <w:rPr>
+          <w:lang w:val="it-IT"/>
+        </w:rPr>
         <w:t xml:space="preserve">. Comprehensive R Archive Network. </w:t>
       </w:r>
       <w:hyperlink r:id="rId12" w:history="1">
         <w:r>
           <w:rPr>
             <w:rStyle w:val="Hyperlink"/>
+            <w:lang w:val="it-IT"/>
           </w:rPr>
           <w:t>https://cran.rproject.org/web/packages/StepReg/vignettes/StepReg.html</w:t>
         </w:r>
@@ -2503,24 +2619,68 @@
         <w:t>(3), 312–318.</w:t>
       </w:r>
     </w:p>
+    <w:p>
+      <w:pPr>
+        <w:pStyle w:val="p1"/>
+      </w:pPr>
+      <w:r>
+        <w:t xml:space="preserve">Boehme, A. K., </w:t>
+      </w:r>
+      <w:proofErr w:type="spellStart"/>
+      <w:r>
+        <w:t>Esenwa</w:t>
+      </w:r>
+      <w:proofErr w:type="spellEnd"/>
+      <w:r>
+        <w:t>, C., &amp; Elkind, M. S. (2017). Stroke Risk Factors, Genetics, and Prevention. </w:t>
+      </w:r>
+      <w:r>
+        <w:rPr>
+          <w:i/>
+          <w:iCs/>
+        </w:rPr>
+        <w:t>Circulation research</w:t>
+      </w:r>
+      <w:r>
+        <w:t>, </w:t>
+      </w:r>
+      <w:r>
+        <w:rPr>
+          <w:i/>
+          <w:iCs/>
+        </w:rPr>
+        <w:t>120</w:t>
+      </w:r>
+      <w:r>
+        <w:t xml:space="preserve">(3), 472–495. </w:t>
+      </w:r>
+      <w:hyperlink r:id="rId13" w:history="1">
+        <w:r>
+          <w:rPr>
+            <w:rStyle w:val="Hyperlink"/>
+          </w:rPr>
+          <w:t>https://doi.org/10.1161/CIRCRESAHA.116.308398</w:t>
+        </w:r>
+      </w:hyperlink>
+    </w:p>
     <w:p/>
     <w:p>
       <w:pPr>
         <w:pStyle w:val="Heading2"/>
       </w:pPr>
-      <w:bookmarkStart w:id="20" w:name="_Toc221022978"/>
-      <w:bookmarkStart w:id="21" w:name="_Toc227079198"/>
+      <w:bookmarkStart w:id="19" w:name="_Toc221022978"/>
+      <w:bookmarkStart w:id="20" w:name="_Toc227079198"/>
       <w:r>
         <w:t>Reproducibility Statement</w:t>
       </w:r>
+      <w:bookmarkEnd w:id="19"/>
       <w:bookmarkEnd w:id="20"/>
-      <w:bookmarkEnd w:id="21"/>
     </w:p>
     <w:p>
       <w:r>
         <w:t xml:space="preserve">The statistical code used in this analysis is available on my GitHub under the Code directory at: </w:t>
       </w:r>
-      <w:hyperlink r:id="rId13" w:history="1">
+      <w:hyperlink r:id="rId14" w:history="1">
         <w:r>
           <w:rPr>
             <w:rStyle w:val="Hyperlink"/>
@@ -4262,6 +4422,17 @@
     <w:basedOn w:val="DefaultParagraphFont"/>
     <w:rsid w:val="00525D92"/>
   </w:style>
+  <w:style w:type="paragraph" w:customStyle="1" w:styleId="p2">
+    <w:name w:val="p2"/>
+    <w:basedOn w:val="Normal"/>
+    <w:rsid w:val="008A31F7"/>
+    <w:pPr>
+      <w:spacing w:before="100" w:beforeAutospacing="1" w:after="100" w:afterAutospacing="1"/>
+    </w:pPr>
+    <w:rPr>
+      <w:lang w:eastAsia="zh-CN"/>
+    </w:rPr>
+  </w:style>
 </w:styles>
 </file>
 

</xml_diff>

<commit_message>
final touches on report and presentation. updated tables and plots and corrected formatting issues.
</commit_message>
<xml_diff>
--- a/Project3/Reports/Project3_Final_Report.docx
+++ b/Project3/Reports/Project3_Final_Report.docx
@@ -16,6 +16,7 @@
       <w:bookmarkStart w:id="1" w:name="_Toc221895378"/>
       <w:bookmarkStart w:id="2" w:name="_Toc222223983"/>
       <w:bookmarkStart w:id="3" w:name="_Toc227079192"/>
+      <w:bookmarkStart w:id="4" w:name="_Toc227684280"/>
       <w:r>
         <w:rPr>
           <w:b/>
@@ -68,6 +69,7 @@
         <w:t>Final Report</w:t>
       </w:r>
       <w:bookmarkEnd w:id="3"/>
+      <w:bookmarkEnd w:id="4"/>
     </w:p>
     <w:p>
       <w:pPr>
@@ -264,8 +266,8 @@
             </w:tabs>
             <w:rPr>
               <w:rFonts w:eastAsiaTheme="minorEastAsia" w:cstheme="minorBidi"/>
-              <w:i/>
-              <w:iCs/>
+              <w:b w:val="0"/>
+              <w:bCs w:val="0"/>
               <w:noProof/>
               <w:kern w:val="2"/>
               <w:sz w:val="24"/>
@@ -273,7 +275,7 @@
               <w14:ligatures w14:val="standardContextual"/>
             </w:rPr>
           </w:pPr>
-          <w:hyperlink w:anchor="_Toc227079193" w:history="1">
+          <w:hyperlink w:anchor="_Toc227684281" w:history="1">
             <w:r>
               <w:rPr>
                 <w:rStyle w:val="Hyperlink"/>
@@ -300,7 +302,7 @@
                 <w:noProof/>
                 <w:webHidden/>
               </w:rPr>
-              <w:instrText xml:space="preserve"> PAGEREF _Toc227079193 \h </w:instrText>
+              <w:instrText xml:space="preserve"> PAGEREF _Toc227684281 \h </w:instrText>
             </w:r>
             <w:r>
               <w:rPr>
@@ -339,8 +341,8 @@
             </w:tabs>
             <w:rPr>
               <w:rFonts w:eastAsiaTheme="minorEastAsia" w:cstheme="minorBidi"/>
-              <w:i/>
-              <w:iCs/>
+              <w:b w:val="0"/>
+              <w:bCs w:val="0"/>
               <w:noProof/>
               <w:kern w:val="2"/>
               <w:sz w:val="24"/>
@@ -348,7 +350,7 @@
               <w14:ligatures w14:val="standardContextual"/>
             </w:rPr>
           </w:pPr>
-          <w:hyperlink w:anchor="_Toc227079194" w:history="1">
+          <w:hyperlink w:anchor="_Toc227684282" w:history="1">
             <w:r>
               <w:rPr>
                 <w:rStyle w:val="Hyperlink"/>
@@ -375,7 +377,7 @@
                 <w:noProof/>
                 <w:webHidden/>
               </w:rPr>
-              <w:instrText xml:space="preserve"> PAGEREF _Toc227079194 \h </w:instrText>
+              <w:instrText xml:space="preserve"> PAGEREF _Toc227684282 \h </w:instrText>
             </w:r>
             <w:r>
               <w:rPr>
@@ -414,8 +416,8 @@
             </w:tabs>
             <w:rPr>
               <w:rFonts w:eastAsiaTheme="minorEastAsia" w:cstheme="minorBidi"/>
-              <w:i/>
-              <w:iCs/>
+              <w:b w:val="0"/>
+              <w:bCs w:val="0"/>
               <w:noProof/>
               <w:kern w:val="2"/>
               <w:sz w:val="24"/>
@@ -423,7 +425,7 @@
               <w14:ligatures w14:val="standardContextual"/>
             </w:rPr>
           </w:pPr>
-          <w:hyperlink w:anchor="_Toc227079195" w:history="1">
+          <w:hyperlink w:anchor="_Toc227684283" w:history="1">
             <w:r>
               <w:rPr>
                 <w:rStyle w:val="Hyperlink"/>
@@ -450,7 +452,7 @@
                 <w:noProof/>
                 <w:webHidden/>
               </w:rPr>
-              <w:instrText xml:space="preserve"> PAGEREF _Toc227079195 \h </w:instrText>
+              <w:instrText xml:space="preserve"> PAGEREF _Toc227684283 \h </w:instrText>
             </w:r>
             <w:r>
               <w:rPr>
@@ -489,8 +491,8 @@
             </w:tabs>
             <w:rPr>
               <w:rFonts w:eastAsiaTheme="minorEastAsia" w:cstheme="minorBidi"/>
-              <w:i/>
-              <w:iCs/>
+              <w:b w:val="0"/>
+              <w:bCs w:val="0"/>
               <w:noProof/>
               <w:kern w:val="2"/>
               <w:sz w:val="24"/>
@@ -498,7 +500,7 @@
               <w14:ligatures w14:val="standardContextual"/>
             </w:rPr>
           </w:pPr>
-          <w:hyperlink w:anchor="_Toc227079196" w:history="1">
+          <w:hyperlink w:anchor="_Toc227684284" w:history="1">
             <w:r>
               <w:rPr>
                 <w:rStyle w:val="Hyperlink"/>
@@ -525,7 +527,7 @@
                 <w:noProof/>
                 <w:webHidden/>
               </w:rPr>
-              <w:instrText xml:space="preserve"> PAGEREF _Toc227079196 \h </w:instrText>
+              <w:instrText xml:space="preserve"> PAGEREF _Toc227684284 \h </w:instrText>
             </w:r>
             <w:r>
               <w:rPr>
@@ -564,8 +566,8 @@
             </w:tabs>
             <w:rPr>
               <w:rFonts w:eastAsiaTheme="minorEastAsia" w:cstheme="minorBidi"/>
-              <w:i/>
-              <w:iCs/>
+              <w:b w:val="0"/>
+              <w:bCs w:val="0"/>
               <w:noProof/>
               <w:kern w:val="2"/>
               <w:sz w:val="24"/>
@@ -573,7 +575,7 @@
               <w14:ligatures w14:val="standardContextual"/>
             </w:rPr>
           </w:pPr>
-          <w:hyperlink w:anchor="_Toc227079197" w:history="1">
+          <w:hyperlink w:anchor="_Toc227684285" w:history="1">
             <w:r>
               <w:rPr>
                 <w:rStyle w:val="Hyperlink"/>
@@ -600,7 +602,7 @@
                 <w:noProof/>
                 <w:webHidden/>
               </w:rPr>
-              <w:instrText xml:space="preserve"> PAGEREF _Toc227079197 \h </w:instrText>
+              <w:instrText xml:space="preserve"> PAGEREF _Toc227684285 \h </w:instrText>
             </w:r>
             <w:r>
               <w:rPr>
@@ -620,7 +622,7 @@
                 <w:noProof/>
                 <w:webHidden/>
               </w:rPr>
-              <w:t>10</w:t>
+              <w:t>11</w:t>
             </w:r>
             <w:r>
               <w:rPr>
@@ -639,8 +641,8 @@
             </w:tabs>
             <w:rPr>
               <w:rFonts w:eastAsiaTheme="minorEastAsia" w:cstheme="minorBidi"/>
-              <w:i/>
-              <w:iCs/>
+              <w:b w:val="0"/>
+              <w:bCs w:val="0"/>
               <w:noProof/>
               <w:kern w:val="2"/>
               <w:sz w:val="24"/>
@@ -648,7 +650,7 @@
               <w14:ligatures w14:val="standardContextual"/>
             </w:rPr>
           </w:pPr>
-          <w:hyperlink w:anchor="_Toc227079198" w:history="1">
+          <w:hyperlink w:anchor="_Toc227684286" w:history="1">
             <w:r>
               <w:rPr>
                 <w:rStyle w:val="Hyperlink"/>
@@ -675,7 +677,7 @@
                 <w:noProof/>
                 <w:webHidden/>
               </w:rPr>
-              <w:instrText xml:space="preserve"> PAGEREF _Toc227079198 \h </w:instrText>
+              <w:instrText xml:space="preserve"> PAGEREF _Toc227684286 \h </w:instrText>
             </w:r>
             <w:r>
               <w:rPr>
@@ -695,7 +697,82 @@
                 <w:noProof/>
                 <w:webHidden/>
               </w:rPr>
-              <w:t>10</w:t>
+              <w:t>11</w:t>
+            </w:r>
+            <w:r>
+              <w:rPr>
+                <w:noProof/>
+                <w:webHidden/>
+              </w:rPr>
+              <w:fldChar w:fldCharType="end"/>
+            </w:r>
+          </w:hyperlink>
+        </w:p>
+        <w:p>
+          <w:pPr>
+            <w:pStyle w:val="TOC2"/>
+            <w:tabs>
+              <w:tab w:val="right" w:leader="dot" w:pos="9350"/>
+            </w:tabs>
+            <w:rPr>
+              <w:rFonts w:eastAsiaTheme="minorEastAsia" w:cstheme="minorBidi"/>
+              <w:b w:val="0"/>
+              <w:bCs w:val="0"/>
+              <w:noProof/>
+              <w:kern w:val="2"/>
+              <w:sz w:val="24"/>
+              <w:szCs w:val="24"/>
+              <w14:ligatures w14:val="standardContextual"/>
+            </w:rPr>
+          </w:pPr>
+          <w:hyperlink w:anchor="_Toc227684287" w:history="1">
+            <w:r>
+              <w:rPr>
+                <w:rStyle w:val="Hyperlink"/>
+                <w:noProof/>
+              </w:rPr>
+              <w:t>Supplemental</w:t>
+            </w:r>
+            <w:r>
+              <w:rPr>
+                <w:noProof/>
+                <w:webHidden/>
+              </w:rPr>
+              <w:tab/>
+            </w:r>
+            <w:r>
+              <w:rPr>
+                <w:noProof/>
+                <w:webHidden/>
+              </w:rPr>
+              <w:fldChar w:fldCharType="begin"/>
+            </w:r>
+            <w:r>
+              <w:rPr>
+                <w:noProof/>
+                <w:webHidden/>
+              </w:rPr>
+              <w:instrText xml:space="preserve"> PAGEREF _Toc227684287 \h </w:instrText>
+            </w:r>
+            <w:r>
+              <w:rPr>
+                <w:noProof/>
+                <w:webHidden/>
+              </w:rPr>
+            </w:r>
+            <w:r>
+              <w:rPr>
+                <w:noProof/>
+                <w:webHidden/>
+              </w:rPr>
+              <w:fldChar w:fldCharType="separate"/>
+            </w:r>
+            <w:r>
+              <w:rPr>
+                <w:noProof/>
+                <w:webHidden/>
+              </w:rPr>
+              <w:t>12</w:t>
             </w:r>
             <w:r>
               <w:rPr>
@@ -763,15 +840,15 @@
       </w:pPr>
     </w:p>
     <w:p>
-      <w:bookmarkStart w:id="4" w:name="_Toc221895315"/>
-      <w:bookmarkStart w:id="5" w:name="_Toc221895380"/>
+      <w:bookmarkStart w:id="5" w:name="_Toc221895315"/>
+      <w:bookmarkStart w:id="6" w:name="_Toc221895380"/>
     </w:p>
     <w:p>
       <w:pPr>
         <w:pStyle w:val="Heading2"/>
       </w:pPr>
-      <w:bookmarkStart w:id="6" w:name="_Toc222223985"/>
-      <w:bookmarkStart w:id="7" w:name="_Toc227079193"/>
+      <w:bookmarkStart w:id="7" w:name="_Toc222223985"/>
+      <w:bookmarkStart w:id="8" w:name="_Toc227684281"/>
       <w:r>
         <w:lastRenderedPageBreak/>
         <w:t>1. I</w:t>
@@ -779,10 +856,10 @@
       <w:r>
         <w:t>ntroduction</w:t>
       </w:r>
-      <w:bookmarkEnd w:id="4"/>
       <w:bookmarkEnd w:id="5"/>
       <w:bookmarkEnd w:id="6"/>
       <w:bookmarkEnd w:id="7"/>
+      <w:bookmarkEnd w:id="8"/>
     </w:p>
     <w:p/>
     <w:p>
@@ -790,7 +867,17 @@
         <w:spacing w:after="240" w:line="480" w:lineRule="auto"/>
       </w:pPr>
       <w:r>
-        <w:t>The Framingham Heart Study (FHS) is a long-term prospective study investigating cardiovascular disease among community-dwelling individuals in Framingham, Massachusetts. This dataset includes up to 24 years of biennial follow-up for 4,434 participants, with repeated measures of clinical, laboratory, and questionnaire data, as well as adjudicated cardiovascular events.</w:t>
+        <w:t>The Framingham Heart Study (</w:t>
+      </w:r>
+      <w:r>
+        <w:rPr>
+          <w:b/>
+          <w:bCs/>
+        </w:rPr>
+        <w:t>FHS</w:t>
+      </w:r>
+      <w:r>
+        <w:t>) is a long-term prospective study investigating cardiovascular disease among individuals in Framingham, Massachusetts. This dataset includes up to 24 years of biennial follow-up for 4,434 participants, with repeated measures of clinical, laboratory, and questionnaire data, as well as adjudicated cardiovascular events.</w:t>
       </w:r>
     </w:p>
     <w:p>
@@ -823,22 +910,105 @@
         <w:t xml:space="preserve">is to </w:t>
       </w:r>
       <w:r>
-        <w:t>answer the research question</w:t>
-      </w:r>
-      <w:r>
-        <w:t>s</w:t>
+        <w:t xml:space="preserve">answer the </w:t>
+      </w:r>
+      <w:r>
+        <w:t>primary hypothesis</w:t>
       </w:r>
       <w:r>
         <w:t xml:space="preserve"> </w:t>
       </w:r>
       <w:r>
-        <w:t xml:space="preserve">guiding this </w:t>
-      </w:r>
-      <w:r>
-        <w:t xml:space="preserve">analysis: </w:t>
-      </w:r>
-      <w:r>
-        <w:t>What baseline risk factors are significantly associated with stroke incidence within 10 years of follow-up, and how does the 10-year probability of stroke vary by risk profile and sex among participants in the FHS</w:t>
+        <w:t>that baseline risk factors are associated with time to stroke within 10 years of follow-up (</w:t>
+      </w:r>
+      <m:oMath>
+        <m:sSub>
+          <m:sSubPr>
+            <m:ctrlPr>
+              <w:rPr>
+                <w:rFonts w:ascii="Cambria Math" w:hAnsi="Cambria Math"/>
+                <w:i/>
+              </w:rPr>
+            </m:ctrlPr>
+          </m:sSubPr>
+          <m:e>
+            <m:r>
+              <w:rPr>
+                <w:rFonts w:ascii="Cambria Math" w:hAnsi="Cambria Math"/>
+              </w:rPr>
+              <m:t>H</m:t>
+            </m:r>
+          </m:e>
+          <m:sub>
+            <m:r>
+              <w:rPr>
+                <w:rFonts w:ascii="Cambria Math" w:hAnsi="Cambria Math"/>
+              </w:rPr>
+              <m:t>0</m:t>
+            </m:r>
+          </m:sub>
+        </m:sSub>
+      </m:oMath>
+      <w:r>
+        <w:t xml:space="preserve">: </w:t>
+      </w:r>
+      <w:r>
+        <w:t>HR</w:t>
+      </w:r>
+      <w:r>
+        <w:t xml:space="preserve"> = </w:t>
+      </w:r>
+      <w:r>
+        <w:t>1</w:t>
+      </w:r>
+      <w:r>
+        <w:t xml:space="preserve"> vs. </w:t>
+      </w:r>
+      <m:oMath>
+        <m:sSub>
+          <m:sSubPr>
+            <m:ctrlPr>
+              <w:rPr>
+                <w:rFonts w:ascii="Cambria Math" w:hAnsi="Cambria Math"/>
+                <w:i/>
+              </w:rPr>
+            </m:ctrlPr>
+          </m:sSubPr>
+          <m:e>
+            <m:r>
+              <w:rPr>
+                <w:rFonts w:ascii="Cambria Math" w:hAnsi="Cambria Math"/>
+              </w:rPr>
+              <m:t>H</m:t>
+            </m:r>
+          </m:e>
+          <m:sub>
+            <m:r>
+              <w:rPr>
+                <w:rFonts w:ascii="Cambria Math" w:hAnsi="Cambria Math"/>
+              </w:rPr>
+              <m:t>a</m:t>
+            </m:r>
+          </m:sub>
+        </m:sSub>
+      </m:oMath>
+      <w:r>
+        <w:t xml:space="preserve">: </w:t>
+      </w:r>
+      <w:r>
+        <w:t>HR</w:t>
+      </w:r>
+      <w:r>
+        <w:t xml:space="preserve"> ≠ </w:t>
+      </w:r>
+      <w:r>
+        <w:t>1</w:t>
+      </w:r>
+      <w:r>
+        <w:t>)</w:t>
+      </w:r>
+      <w:r>
+        <w:t>, and how does the 10-year probability of stroke vary by risk profile and sex among participants in the FHS</w:t>
       </w:r>
       <w:r>
         <w:t>.</w:t>
@@ -848,20 +1018,20 @@
       <w:pPr>
         <w:pStyle w:val="Heading2"/>
       </w:pPr>
-      <w:bookmarkStart w:id="8" w:name="_Toc221895316"/>
-      <w:bookmarkStart w:id="9" w:name="_Toc221895381"/>
-      <w:bookmarkStart w:id="10" w:name="_Toc222223986"/>
-      <w:bookmarkStart w:id="11" w:name="_Toc227079194"/>
+      <w:bookmarkStart w:id="9" w:name="_Toc221895316"/>
+      <w:bookmarkStart w:id="10" w:name="_Toc221895381"/>
+      <w:bookmarkStart w:id="11" w:name="_Toc222223986"/>
+      <w:bookmarkStart w:id="12" w:name="_Toc227684282"/>
       <w:r>
         <w:t xml:space="preserve">2. </w:t>
       </w:r>
       <w:r>
         <w:t>Methods</w:t>
       </w:r>
-      <w:bookmarkEnd w:id="8"/>
       <w:bookmarkEnd w:id="9"/>
       <w:bookmarkEnd w:id="10"/>
       <w:bookmarkEnd w:id="11"/>
+      <w:bookmarkEnd w:id="12"/>
     </w:p>
     <w:p/>
     <w:p>
@@ -1195,13 +1365,18 @@
         <w:t xml:space="preserve">As an additional descriptive aim, </w:t>
       </w:r>
       <w:r>
-        <w:t>risk factors were also summarized across three examination periods using means (SD) and proportions to assess temporal changes.</w:t>
-      </w:r>
-    </w:p>
-    <w:p>
-      <w:pPr>
-        <w:pStyle w:val="p1"/>
-        <w:spacing w:line="480" w:lineRule="auto"/>
+        <w:t xml:space="preserve">risk factors were also summarized across three examination periods using means (SD) and proportions to assess </w:t>
+      </w:r>
+      <w:r>
+        <w:t>changes over time</w:t>
+      </w:r>
+      <w:r>
+        <w:t>.</w:t>
+      </w:r>
+    </w:p>
+    <w:p>
+      <w:pPr>
+        <w:spacing w:after="240" w:line="480" w:lineRule="auto"/>
       </w:pPr>
       <w:r>
         <w:t xml:space="preserve">All analyses used complete-case data under a missing at random assumption, </w:t>
@@ -1212,15 +1387,54 @@
       <w:r>
         <w:t>.</w:t>
       </w:r>
+      <w:r>
+        <w:t xml:space="preserve"> </w:t>
+      </w:r>
+      <w:r>
+        <w:t> </w:t>
+      </w:r>
+      <w:r>
+        <w:t>This resulted in a final analytical sample of 2,378 women and 1,897 men</w:t>
+      </w:r>
+      <w:r>
+        <w:t xml:space="preserve">. </w:t>
+      </w:r>
+      <w:r>
+        <w:t xml:space="preserve">Statistical significance was assessed at a two-sided α = 0.05 level. All analyses were conducted in R (version </w:t>
+      </w:r>
+      <w:r>
+        <w:t>4</w:t>
+      </w:r>
+      <w:r>
+        <w:t>.</w:t>
+      </w:r>
+      <w:r>
+        <w:t>5</w:t>
+      </w:r>
+      <w:r>
+        <w:t>.</w:t>
+      </w:r>
+      <w:r>
+        <w:t>3</w:t>
+      </w:r>
+      <w:r>
+        <w:t>;</w:t>
+      </w:r>
+      <w:r>
+        <w:t xml:space="preserve"> </w:t>
+      </w:r>
+      <w:r>
+        <w:t>Reassured Reassurer).</w:t>
+      </w:r>
     </w:p>
     <w:p>
       <w:pPr>
         <w:pStyle w:val="Heading2"/>
       </w:pPr>
-      <w:bookmarkStart w:id="12" w:name="_Toc221895317"/>
-      <w:bookmarkStart w:id="13" w:name="_Toc221895382"/>
-      <w:bookmarkStart w:id="14" w:name="_Toc222223987"/>
-      <w:bookmarkStart w:id="15" w:name="_Toc227079195"/>
+      <w:bookmarkStart w:id="13" w:name="_Toc221895317"/>
+      <w:bookmarkStart w:id="14" w:name="_Toc221895382"/>
+      <w:bookmarkStart w:id="15" w:name="_Toc222223987"/>
+      <w:bookmarkStart w:id="16" w:name="_Toc227684283"/>
       <w:r>
         <w:t xml:space="preserve">3. </w:t>
       </w:r>
@@ -1230,24 +1444,21 @@
       <w:r>
         <w:t>esults</w:t>
       </w:r>
-      <w:bookmarkEnd w:id="12"/>
       <w:bookmarkEnd w:id="13"/>
       <w:bookmarkEnd w:id="14"/>
       <w:bookmarkEnd w:id="15"/>
+      <w:bookmarkEnd w:id="16"/>
     </w:p>
     <w:p>
       <w:pPr>
         <w:jc w:val="center"/>
       </w:pPr>
       <w:r>
-        <w:rPr>
-          <w:noProof/>
-        </w:rPr>
         <w:drawing>
-          <wp:inline distT="0" distB="0" distL="0" distR="0" wp14:anchorId="65933D86" wp14:editId="740783D5">
-            <wp:extent cx="5789962" cy="5368705"/>
-            <wp:effectExtent l="0" t="0" r="1270" b="3810"/>
-            <wp:docPr id="1602840842" name="Picture 1"/>
+          <wp:inline distT="0" distB="0" distL="0" distR="0" wp14:anchorId="623260D2" wp14:editId="3BF3F7D3">
+            <wp:extent cx="5287224" cy="4512781"/>
+            <wp:effectExtent l="0" t="0" r="0" b="0"/>
+            <wp:docPr id="1565886299" name="Picture 1"/>
             <wp:cNvGraphicFramePr>
               <a:graphicFrameLocks xmlns:a="http://schemas.openxmlformats.org/drawingml/2006/main" noChangeAspect="1"/>
             </wp:cNvGraphicFramePr>
@@ -1255,7 +1466,7 @@
               <a:graphicData uri="http://schemas.openxmlformats.org/drawingml/2006/picture">
                 <pic:pic xmlns:pic="http://schemas.openxmlformats.org/drawingml/2006/picture">
                   <pic:nvPicPr>
-                    <pic:cNvPr id="1602840842" name=""/>
+                    <pic:cNvPr id="1565886299" name=""/>
                     <pic:cNvPicPr/>
                   </pic:nvPicPr>
                   <pic:blipFill>
@@ -1267,7 +1478,7 @@
                   <pic:spPr>
                     <a:xfrm>
                       <a:off x="0" y="0"/>
-                      <a:ext cx="5799776" cy="5377805"/>
+                      <a:ext cx="5342824" cy="4560237"/>
                     </a:xfrm>
                     <a:prstGeom prst="rect">
                       <a:avLst/>
@@ -1282,11 +1493,6 @@
     </w:p>
     <w:p>
       <w:pPr>
-        <w:jc w:val="center"/>
-      </w:pPr>
-    </w:p>
-    <w:p>
-      <w:pPr>
         <w:pStyle w:val="Caption"/>
         <w:rPr>
           <w:rFonts w:asciiTheme="minorHAnsi" w:hAnsiTheme="minorHAnsi"/>
@@ -1377,7 +1583,6 @@
         <w:t> Baseline characteristics of Framingham Heart Study participants, overall and stratified by sex during 10 years of follow-up.</w:t>
       </w:r>
     </w:p>
-    <w:p/>
     <w:p>
       <w:pPr>
         <w:spacing w:line="480" w:lineRule="auto"/>
@@ -1403,17 +1608,27 @@
         <w:t xml:space="preserve"> Smoking and prevalent CHD were more common in men, while other risk factors were similar between sexes. Over 10 years, 111 stroke events </w:t>
       </w:r>
       <w:r>
+        <w:lastRenderedPageBreak/>
         <w:t xml:space="preserve">occurred </w:t>
       </w:r>
       <w:r>
         <w:t>among 2,472 women and 1,930 men, corresponding to a cumulative incidence of approximately 2.5%.</w:t>
       </w:r>
+      <w:r>
+        <w:t xml:space="preserve"> Missingness was low (≈2.9%) and not expected to meaningfully impact results</w:t>
+      </w:r>
+      <w:r>
+        <w:t>.</w:t>
+      </w:r>
     </w:p>
     <w:p>
       <w:pPr>
         <w:jc w:val="center"/>
       </w:pPr>
       <w:r>
+        <w:rPr>
+          <w:noProof/>
+        </w:rPr>
         <w:drawing>
           <wp:inline distT="0" distB="0" distL="0" distR="0" wp14:anchorId="51D2C172" wp14:editId="1D540390">
             <wp:extent cx="5943600" cy="2874645"/>
@@ -1461,6 +1676,9 @@
         <w:jc w:val="center"/>
       </w:pPr>
       <w:r>
+        <w:rPr>
+          <w:noProof/>
+        </w:rPr>
         <w:drawing>
           <wp:inline distT="0" distB="0" distL="0" distR="0" wp14:anchorId="3B197A4A" wp14:editId="5B752D97">
             <wp:extent cx="5943600" cy="2834640"/>
@@ -1669,7 +1887,15 @@
           <w:sz w:val="24"/>
           <w:szCs w:val="24"/>
         </w:rPr>
-        <w:t xml:space="preserve">Stepwise procedures identified smoking as the only statistically significant predictor of stroke. However, prior literature, including the Framingham Stroke Risk Profile (Wolf et al., 1991), incorporated an interaction between </w:t>
+        <w:t>Stepwise procedures identified smoking as the only statistically significant predictor of stroke. However, prior literature, including the Framingham Stroke Risk Profile (</w:t>
+      </w:r>
+      <w:r>
+        <w:rPr>
+          <w:color w:val="auto"/>
+          <w:sz w:val="24"/>
+          <w:szCs w:val="24"/>
+        </w:rPr>
+        <w:t>Wolf et al., 1991</w:t>
       </w:r>
       <w:r>
         <w:rPr>
@@ -1679,7 +1905,7 @@
           <w:sz w:val="24"/>
           <w:szCs w:val="24"/>
         </w:rPr>
-        <w:t>SBP</w:t>
+        <w:t xml:space="preserve">), incorporated an interaction between </w:t>
       </w:r>
       <w:r>
         <w:rPr>
@@ -1689,7 +1915,7 @@
           <w:sz w:val="24"/>
           <w:szCs w:val="24"/>
         </w:rPr>
-        <w:t xml:space="preserve"> and BP medication use, as well as prevalent </w:t>
+        <w:t>SBP</w:t>
       </w:r>
       <w:r>
         <w:rPr>
@@ -1699,7 +1925,7 @@
           <w:sz w:val="24"/>
           <w:szCs w:val="24"/>
         </w:rPr>
-        <w:t>CHD</w:t>
+        <w:t xml:space="preserve"> and BP medication use, as well as prevalent </w:t>
       </w:r>
       <w:r>
         <w:rPr>
@@ -1709,7 +1935,7 @@
           <w:sz w:val="24"/>
           <w:szCs w:val="24"/>
         </w:rPr>
-        <w:t>, based on clinical relevance. These terms were therefore retained in the final sex-specific Cox models</w:t>
+        <w:t>CHD</w:t>
       </w:r>
       <w:r>
         <w:rPr>
@@ -1719,6 +1945,16 @@
           <w:sz w:val="24"/>
           <w:szCs w:val="24"/>
         </w:rPr>
+        <w:t>, based on clinical relevance. These terms were therefore retained in the final sex-specific Cox models</w:t>
+      </w:r>
+      <w:r>
+        <w:rPr>
+          <w:i w:val="0"/>
+          <w:iCs w:val="0"/>
+          <w:color w:val="auto"/>
+          <w:sz w:val="24"/>
+          <w:szCs w:val="24"/>
+        </w:rPr>
         <w:t>.</w:t>
       </w:r>
     </w:p>
@@ -1739,14 +1975,15 @@
           <w:rFonts w:asciiTheme="minorHAnsi" w:hAnsiTheme="minorHAnsi"/>
           <w:b/>
           <w:bCs/>
+          <w:position w:val="-6"/>
           <w:sz w:val="21"/>
           <w:szCs w:val="21"/>
         </w:rPr>
         <w:drawing>
-          <wp:inline distT="0" distB="0" distL="0" distR="0" wp14:anchorId="3CF09226" wp14:editId="3DFC97D1">
-            <wp:extent cx="5943600" cy="2292985"/>
-            <wp:effectExtent l="0" t="0" r="0" b="5715"/>
-            <wp:docPr id="511273182" name="Picture 1"/>
+          <wp:inline distT="0" distB="0" distL="0" distR="0" wp14:anchorId="56B93327" wp14:editId="4E947EF2">
+            <wp:extent cx="5943600" cy="2855595"/>
+            <wp:effectExtent l="0" t="0" r="0" b="1905"/>
+            <wp:docPr id="1133291003" name="Picture 1"/>
             <wp:cNvGraphicFramePr>
               <a:graphicFrameLocks xmlns:a="http://schemas.openxmlformats.org/drawingml/2006/main" noChangeAspect="1"/>
             </wp:cNvGraphicFramePr>
@@ -1754,7 +1991,7 @@
               <a:graphicData uri="http://schemas.openxmlformats.org/drawingml/2006/picture">
                 <pic:pic xmlns:pic="http://schemas.openxmlformats.org/drawingml/2006/picture">
                   <pic:nvPicPr>
-                    <pic:cNvPr id="511273182" name=""/>
+                    <pic:cNvPr id="1133291003" name=""/>
                     <pic:cNvPicPr/>
                   </pic:nvPicPr>
                   <pic:blipFill>
@@ -1766,7 +2003,7 @@
                   <pic:spPr>
                     <a:xfrm>
                       <a:off x="0" y="0"/>
-                      <a:ext cx="5943600" cy="2292985"/>
+                      <a:ext cx="5943600" cy="2855595"/>
                     </a:xfrm>
                     <a:prstGeom prst="rect">
                       <a:avLst/>
@@ -1885,26 +2122,170 @@
     <w:p>
       <w:pPr>
         <w:pStyle w:val="p1"/>
-        <w:spacing w:after="0" w:afterAutospacing="0" w:line="480" w:lineRule="auto"/>
-      </w:pPr>
-      <w:r>
-        <w:t>In sex-stratified Cox models, age and SBP were the primary predictors of stroke in both sexes. SBP was associated with a 28% increase in hazard per 10 mmHg in women and 41% in men.</w:t>
-      </w:r>
-    </w:p>
-    <w:p>
-      <w:pPr>
-        <w:pStyle w:val="p1"/>
-        <w:spacing w:after="240" w:afterAutospacing="0" w:line="480" w:lineRule="auto"/>
-      </w:pPr>
-      <w:r>
-        <w:t>Among men, diabetes, smoking status, and the interaction between SBP and BP medication use were also important predictors. Diabetes was associated with a markedly increased hazard (HR ≈ 5), although the small number of events (N = 7) suggests some uncertainty in this estimate.</w:t>
+        <w:spacing w:after="240" w:line="480" w:lineRule="auto"/>
+      </w:pPr>
+      <w:r>
+        <w:t xml:space="preserve">In </w:t>
+      </w:r>
+      <w:r>
+        <w:t>both sexes, older</w:t>
+      </w:r>
+      <w:r>
+        <w:t xml:space="preserve"> age and </w:t>
+      </w:r>
+      <w:r>
+        <w:t xml:space="preserve">higher </w:t>
+      </w:r>
+      <w:r>
+        <w:t xml:space="preserve">SBP were </w:t>
+      </w:r>
+      <w:r>
+        <w:t xml:space="preserve">associated with higher risk of stroke </w:t>
+      </w:r>
+      <w:r>
+        <w:t>at any given moment</w:t>
       </w:r>
       <w:r>
         <w:t xml:space="preserve"> </w:t>
       </w:r>
       <w:r>
+        <w:t xml:space="preserve">during follow-up period </w:t>
+      </w:r>
+      <w:r>
+        <w:t>(</w:t>
+      </w:r>
+      <w:r>
+        <w:rPr>
+          <w:b/>
+          <w:bCs/>
+        </w:rPr>
+        <w:t>Table 2</w:t>
+      </w:r>
+      <w:r>
+        <w:t>)</w:t>
+      </w:r>
+      <w:r>
+        <w:t xml:space="preserve">. </w:t>
+      </w:r>
+      <w:r>
+        <w:t xml:space="preserve">Each 10 mmHg increase in </w:t>
+      </w:r>
+      <w:r>
+        <w:t xml:space="preserve">SBP was associated with </w:t>
+      </w:r>
+      <w:r>
+        <w:t>approximately a</w:t>
+      </w:r>
+      <w:r>
+        <w:t xml:space="preserve"> 28% </w:t>
+      </w:r>
+      <w:r>
+        <w:t xml:space="preserve">higher risk of stroke </w:t>
+      </w:r>
+      <w:r>
+        <w:t>in women and 41% in men.</w:t>
+      </w:r>
+      <w:r>
+        <w:t xml:space="preserve"> </w:t>
+      </w:r>
+      <w:r>
+        <w:t xml:space="preserve">In men, diabetes and smoking were also </w:t>
+      </w:r>
+      <w:r>
+        <w:t>identified as</w:t>
+      </w:r>
+      <w:r>
+        <w:t xml:space="preserve"> </w:t>
+      </w:r>
+      <w:r>
+        <w:t>risk factors,</w:t>
+      </w:r>
+      <w:r>
+        <w:t xml:space="preserve"> with diabetes </w:t>
+      </w:r>
+      <w:r>
+        <w:t xml:space="preserve">being </w:t>
+      </w:r>
+      <w:r>
+        <w:t xml:space="preserve">associated with an </w:t>
+      </w:r>
+      <w:r>
         <w:lastRenderedPageBreak/>
-        <w:t>Current smoking was also associated with an approximately twofold increase in hazard (HR ≈ 2). The interaction indicates that men on BP medication have lower hazards at higher SBP levels compared to men not on BP medication.</w:t>
+        <w:t>approximately fivefold higher risk of stroke</w:t>
+      </w:r>
+      <w:r>
+        <w:t>, although the small number of events (N=7) suggest</w:t>
+      </w:r>
+      <w:r>
+        <w:t>s</w:t>
+      </w:r>
+      <w:r>
+        <w:t xml:space="preserve"> uncertainty in this estimate. </w:t>
+      </w:r>
+      <w:r>
+        <w:t>The interaction indicates that, at higher levels of SBP, men taking BP medication have a lower risk of stroke over time compared to those not on medication, suggesting that medication modifies the effect of SBP</w:t>
+      </w:r>
+      <w:r>
+        <w:t xml:space="preserve"> </w:t>
+      </w:r>
+      <w:r>
+        <w:t>(</w:t>
+      </w:r>
+      <w:r>
+        <w:rPr>
+          <w:i/>
+          <w:iCs/>
+        </w:rPr>
+        <w:fldChar w:fldCharType="begin"/>
+      </w:r>
+      <w:r>
+        <w:rPr>
+          <w:i/>
+          <w:iCs/>
+        </w:rPr>
+        <w:instrText xml:space="preserve"> REF _Ref227251234 \h  \* MERGEFORMAT </w:instrText>
+      </w:r>
+      <w:r>
+        <w:rPr>
+          <w:i/>
+          <w:iCs/>
+        </w:rPr>
+      </w:r>
+      <w:r>
+        <w:rPr>
+          <w:i/>
+          <w:iCs/>
+        </w:rPr>
+        <w:fldChar w:fldCharType="separate"/>
+      </w:r>
+      <w:r>
+        <w:rPr>
+          <w:b/>
+          <w:bCs/>
+          <w:i/>
+          <w:iCs/>
+        </w:rPr>
+        <w:t xml:space="preserve">Supplementary Figure </w:t>
+      </w:r>
+      <w:r>
+        <w:rPr>
+          <w:b/>
+          <w:bCs/>
+          <w:i/>
+          <w:iCs/>
+          <w:noProof/>
+        </w:rPr>
+        <w:t>1</w:t>
+      </w:r>
+      <w:r>
+        <w:rPr>
+          <w:i/>
+          <w:iCs/>
+        </w:rPr>
+        <w:fldChar w:fldCharType="end"/>
+      </w:r>
+      <w:r>
+        <w:t>).</w:t>
       </w:r>
     </w:p>
     <w:p>
@@ -1912,11 +2293,171 @@
         <w:spacing w:after="240" w:line="480" w:lineRule="auto"/>
       </w:pPr>
       <w:r>
-        <w:t>Other predictors, including smoking, BP medication use, and prevalent CHD, were not statistically significant, likely reflecting limited power due to the relatively small number of stroke events within each stratum. For example, there were only seven events among women and five among men with prevalent CHD. Although CHD is a well-established risk factor for stroke, it was not statistically significant in this analysis</w:t>
+        <w:t xml:space="preserve">Other predictors, </w:t>
+      </w:r>
+      <w:r>
+        <w:t>mainly in women,</w:t>
+      </w:r>
+      <w:r>
+        <w:t xml:space="preserve"> were not statistically significant, likely reflecting limited power due to the relatively small number of stroke events within each stratum. For example, there were only seven events among women and five among men with prevalent CHD. Although CHD is a well-established risk factor for stroke, it was not statistically significant in this analysis</w:t>
       </w:r>
       <w:r>
         <w:t>.</w:t>
       </w:r>
+      <w:r>
+        <w:t xml:space="preserve"> </w:t>
+      </w:r>
+    </w:p>
+    <w:p>
+      <w:pPr>
+        <w:pStyle w:val="Caption"/>
+        <w:spacing w:line="480" w:lineRule="auto"/>
+        <w:rPr>
+          <w:i w:val="0"/>
+          <w:iCs w:val="0"/>
+          <w:color w:val="auto"/>
+          <w:sz w:val="24"/>
+          <w:szCs w:val="24"/>
+        </w:rPr>
+      </w:pPr>
+      <w:r>
+        <w:rPr>
+          <w:i w:val="0"/>
+          <w:iCs w:val="0"/>
+          <w:color w:val="auto"/>
+          <w:sz w:val="24"/>
+          <w:szCs w:val="24"/>
+        </w:rPr>
+        <w:t xml:space="preserve">The proportional hazards assumption was assessed using Schoenfeld residuals and was not violated for the final </w:t>
+      </w:r>
+      <w:r>
+        <w:rPr>
+          <w:i w:val="0"/>
+          <w:iCs w:val="0"/>
+          <w:color w:val="auto"/>
+          <w:sz w:val="24"/>
+          <w:szCs w:val="24"/>
+        </w:rPr>
+        <w:t xml:space="preserve">sex-stratified cox </w:t>
+      </w:r>
+      <w:r>
+        <w:rPr>
+          <w:i w:val="0"/>
+          <w:iCs w:val="0"/>
+          <w:color w:val="auto"/>
+          <w:sz w:val="24"/>
+          <w:szCs w:val="24"/>
+        </w:rPr>
+        <w:t>models</w:t>
+      </w:r>
+      <w:r>
+        <w:rPr>
+          <w:i w:val="0"/>
+          <w:iCs w:val="0"/>
+          <w:color w:val="auto"/>
+          <w:sz w:val="24"/>
+          <w:szCs w:val="24"/>
+        </w:rPr>
+        <w:t xml:space="preserve"> (</w:t>
+      </w:r>
+      <w:r>
+        <w:rPr>
+          <w:i w:val="0"/>
+          <w:iCs w:val="0"/>
+          <w:color w:val="auto"/>
+          <w:sz w:val="24"/>
+          <w:szCs w:val="24"/>
+        </w:rPr>
+        <w:fldChar w:fldCharType="begin"/>
+      </w:r>
+      <w:r>
+        <w:rPr>
+          <w:i w:val="0"/>
+          <w:iCs w:val="0"/>
+          <w:color w:val="auto"/>
+          <w:sz w:val="24"/>
+          <w:szCs w:val="24"/>
+        </w:rPr>
+        <w:instrText xml:space="preserve"> REF _Ref227253905 \h </w:instrText>
+      </w:r>
+      <w:r>
+        <w:rPr>
+          <w:i w:val="0"/>
+          <w:iCs w:val="0"/>
+          <w:color w:val="auto"/>
+          <w:sz w:val="24"/>
+          <w:szCs w:val="24"/>
+        </w:rPr>
+        <w:instrText xml:space="preserve"> \* MERGEFORMAT </w:instrText>
+      </w:r>
+      <w:r>
+        <w:rPr>
+          <w:i w:val="0"/>
+          <w:iCs w:val="0"/>
+          <w:color w:val="auto"/>
+          <w:sz w:val="24"/>
+          <w:szCs w:val="24"/>
+        </w:rPr>
+      </w:r>
+      <w:r>
+        <w:rPr>
+          <w:i w:val="0"/>
+          <w:iCs w:val="0"/>
+          <w:color w:val="auto"/>
+          <w:sz w:val="24"/>
+          <w:szCs w:val="24"/>
+        </w:rPr>
+        <w:fldChar w:fldCharType="separate"/>
+      </w:r>
+      <w:r>
+        <w:rPr>
+          <w:b/>
+          <w:bCs/>
+          <w:sz w:val="24"/>
+          <w:szCs w:val="24"/>
+        </w:rPr>
+        <w:t xml:space="preserve">Supplementary Table </w:t>
+      </w:r>
+      <w:r>
+        <w:rPr>
+          <w:b/>
+          <w:bCs/>
+          <w:noProof/>
+          <w:sz w:val="24"/>
+          <w:szCs w:val="24"/>
+        </w:rPr>
+        <w:t>1</w:t>
+      </w:r>
+      <w:r>
+        <w:rPr>
+          <w:i w:val="0"/>
+          <w:iCs w:val="0"/>
+          <w:color w:val="auto"/>
+          <w:sz w:val="24"/>
+          <w:szCs w:val="24"/>
+        </w:rPr>
+        <w:fldChar w:fldCharType="end"/>
+      </w:r>
+      <w:r>
+        <w:rPr>
+          <w:i w:val="0"/>
+          <w:iCs w:val="0"/>
+          <w:color w:val="auto"/>
+          <w:sz w:val="24"/>
+          <w:szCs w:val="24"/>
+        </w:rPr>
+        <w:t>)</w:t>
+      </w:r>
+      <w:r>
+        <w:rPr>
+          <w:i w:val="0"/>
+          <w:iCs w:val="0"/>
+          <w:color w:val="auto"/>
+          <w:sz w:val="24"/>
+          <w:szCs w:val="24"/>
+        </w:rPr>
+        <w:t>.</w:t>
+      </w:r>
     </w:p>
     <w:p>
       <w:pPr>
@@ -1950,7 +2491,31 @@
         <w:t>major risk factors, reflecting the relatively low incidence of stroke in this cohort over a 10-year period. Predicted risk increased with age and the presence of risk factors</w:t>
       </w:r>
       <w:r>
-        <w:t xml:space="preserve"> in both men and women. The </w:t>
+        <w:t xml:space="preserve"> in both men and women. </w:t>
+      </w:r>
+      <w:r>
+        <w:t xml:space="preserve">Within women, elevated </w:t>
+      </w:r>
+      <w:r>
+        <w:t>BP</w:t>
+      </w:r>
+      <w:r>
+        <w:t xml:space="preserve"> (≥160mmHg)</w:t>
+      </w:r>
+      <w:r>
+        <w:t xml:space="preserve"> was associated with higher predicted stroke risk than diabetes across all age groups. In contrast, among men, diabetes was associated with higher predicted risk than elevated </w:t>
+      </w:r>
+      <w:r>
+        <w:t>BP</w:t>
+      </w:r>
+      <w:r>
+        <w:t xml:space="preserve"> at each age</w:t>
+      </w:r>
+      <w:r>
+        <w:t xml:space="preserve">. </w:t>
+      </w:r>
+      <w:r>
+        <w:t xml:space="preserve">The </w:t>
       </w:r>
       <w:r>
         <w:t xml:space="preserve">highest risks </w:t>
@@ -1995,6 +2560,8 @@
         <w:rPr>
           <w:b/>
           <w:bCs/>
+          <w:i/>
+          <w:iCs/>
         </w:rPr>
         <w:t xml:space="preserve">Table </w:t>
       </w:r>
@@ -2002,6 +2569,8 @@
         <w:rPr>
           <w:b/>
           <w:bCs/>
+          <w:i/>
+          <w:iCs/>
         </w:rPr>
         <w:t>3</w:t>
       </w:r>
@@ -2014,8 +2583,12 @@
     </w:p>
     <w:p>
       <w:pPr>
+        <w:spacing w:line="480" w:lineRule="auto"/>
+      </w:pPr>
+    </w:p>
+    <w:p>
+      <w:pPr>
         <w:pStyle w:val="Caption"/>
-        <w:jc w:val="center"/>
         <w:rPr>
           <w:color w:val="000000" w:themeColor="text1"/>
           <w:sz w:val="21"/>
@@ -2024,15 +2597,18 @@
       </w:pPr>
       <w:r>
         <w:rPr>
+          <w:b/>
+          <w:bCs/>
           <w:color w:val="000000" w:themeColor="text1"/>
           <w:sz w:val="21"/>
           <w:szCs w:val="21"/>
         </w:rPr>
+        <w:lastRenderedPageBreak/>
         <w:drawing>
-          <wp:inline distT="0" distB="0" distL="0" distR="0" wp14:anchorId="04EE87C0" wp14:editId="18715BB3">
-            <wp:extent cx="5576934" cy="2062154"/>
+          <wp:inline distT="0" distB="0" distL="0" distR="0" wp14:anchorId="1C3769B5" wp14:editId="74A95A60">
+            <wp:extent cx="5943600" cy="2782570"/>
             <wp:effectExtent l="0" t="0" r="0" b="0"/>
-            <wp:docPr id="545186418" name="Picture 1"/>
+            <wp:docPr id="1656131898" name="Picture 1"/>
             <wp:cNvGraphicFramePr>
               <a:graphicFrameLocks xmlns:a="http://schemas.openxmlformats.org/drawingml/2006/main" noChangeAspect="1"/>
             </wp:cNvGraphicFramePr>
@@ -2040,7 +2616,7 @@
               <a:graphicData uri="http://schemas.openxmlformats.org/drawingml/2006/picture">
                 <pic:pic xmlns:pic="http://schemas.openxmlformats.org/drawingml/2006/picture">
                   <pic:nvPicPr>
-                    <pic:cNvPr id="545186418" name=""/>
+                    <pic:cNvPr id="1656131898" name=""/>
                     <pic:cNvPicPr/>
                   </pic:nvPicPr>
                   <pic:blipFill>
@@ -2052,7 +2628,7 @@
                   <pic:spPr>
                     <a:xfrm>
                       <a:off x="0" y="0"/>
-                      <a:ext cx="5614293" cy="2075968"/>
+                      <a:ext cx="5943600" cy="2782570"/>
                     </a:xfrm>
                     <a:prstGeom prst="rect">
                       <a:avLst/>
@@ -2064,16 +2640,6 @@
           </wp:inline>
         </w:drawing>
       </w:r>
-    </w:p>
-    <w:p>
-      <w:pPr>
-        <w:pStyle w:val="Caption"/>
-        <w:rPr>
-          <w:color w:val="000000" w:themeColor="text1"/>
-          <w:sz w:val="21"/>
-          <w:szCs w:val="21"/>
-        </w:rPr>
-      </w:pPr>
       <w:r>
         <w:rPr>
           <w:b/>
@@ -2101,7 +2667,7 @@
           <w:szCs w:val="21"/>
           <w14:ligatures w14:val="standardContextual"/>
         </w:rPr>
-        <w:t xml:space="preserve">Predicted 10-year stroke risk (%) by age, sex, and risk profile from sex-specific Cox models. </w:t>
+        <w:t>Predicted 10-year stroke risk (%) by age, sex, and risk profile from sex-specific Cox models</w:t>
       </w:r>
       <w:r>
         <w:rPr>
@@ -2112,7 +2678,7 @@
           <w:szCs w:val="21"/>
           <w14:ligatures w14:val="standardContextual"/>
         </w:rPr>
-        <w:t>Other r</w:t>
+        <w:t xml:space="preserve"> with 95% CI</w:t>
       </w:r>
       <w:r>
         <w:rPr>
@@ -2123,7 +2689,7 @@
           <w:szCs w:val="21"/>
           <w14:ligatures w14:val="standardContextual"/>
         </w:rPr>
-        <w:t xml:space="preserve">isk </w:t>
+        <w:t xml:space="preserve">. </w:t>
       </w:r>
       <w:r>
         <w:rPr>
@@ -2134,7 +2700,7 @@
           <w:szCs w:val="21"/>
           <w14:ligatures w14:val="standardContextual"/>
         </w:rPr>
-        <w:t>factors were</w:t>
+        <w:t>Other r</w:t>
       </w:r>
       <w:r>
         <w:rPr>
@@ -2145,7 +2711,7 @@
           <w:szCs w:val="21"/>
           <w14:ligatures w14:val="standardContextual"/>
         </w:rPr>
-        <w:t xml:space="preserve"> held constant at reference levels</w:t>
+        <w:t xml:space="preserve">isk </w:t>
       </w:r>
       <w:r>
         <w:rPr>
@@ -2156,7 +2722,7 @@
           <w:szCs w:val="21"/>
           <w14:ligatures w14:val="standardContextual"/>
         </w:rPr>
-        <w:t xml:space="preserve"> (absent of disease)</w:t>
+        <w:t>factors were</w:t>
       </w:r>
       <w:r>
         <w:rPr>
@@ -2167,39 +2733,101 @@
           <w:szCs w:val="21"/>
           <w14:ligatures w14:val="standardContextual"/>
         </w:rPr>
+        <w:t xml:space="preserve"> held constant at reference levels</w:t>
+      </w:r>
+      <w:r>
+        <w:rPr>
+          <w:rFonts w:asciiTheme="minorHAnsi" w:eastAsiaTheme="minorHAnsi" w:hAnsiTheme="minorHAnsi" w:cstheme="minorBidi"/>
+          <w:color w:val="000000" w:themeColor="text1"/>
+          <w:kern w:val="2"/>
+          <w:sz w:val="21"/>
+          <w:szCs w:val="21"/>
+          <w14:ligatures w14:val="standardContextual"/>
+        </w:rPr>
+        <w:t xml:space="preserve"> (absent of disease)</w:t>
+      </w:r>
+      <w:r>
+        <w:rPr>
+          <w:rFonts w:asciiTheme="minorHAnsi" w:eastAsiaTheme="minorHAnsi" w:hAnsiTheme="minorHAnsi" w:cstheme="minorBidi"/>
+          <w:color w:val="000000" w:themeColor="text1"/>
+          <w:kern w:val="2"/>
+          <w:sz w:val="21"/>
+          <w:szCs w:val="21"/>
+          <w14:ligatures w14:val="standardContextual"/>
+        </w:rPr>
         <w:t>.</w:t>
       </w:r>
     </w:p>
     <w:p/>
+    <w:p>
+      <w:pPr>
+        <w:pStyle w:val="Heading4"/>
+      </w:pPr>
+      <w:r>
+        <w:t>3.</w:t>
+      </w:r>
+      <w:r>
+        <w:t>3</w:t>
+      </w:r>
+      <w:r>
+        <w:t xml:space="preserve"> </w:t>
+      </w:r>
+      <w:r>
+        <w:t>Time-varying Covariates</w:t>
+      </w:r>
+    </w:p>
     <w:p/>
     <w:p>
       <w:pPr>
-        <w:pStyle w:val="Heading4"/>
-      </w:pPr>
-      <w:r>
-        <w:t>3.</w:t>
-      </w:r>
-      <w:r>
-        <w:t>3</w:t>
-      </w:r>
-      <w:r>
-        <w:t xml:space="preserve"> </w:t>
-      </w:r>
-      <w:r>
-        <w:t>Time-varying Covariates</w:t>
-      </w:r>
-    </w:p>
-    <w:p/>
+        <w:spacing w:line="480" w:lineRule="auto"/>
+      </w:pPr>
+      <w:r>
+        <w:t xml:space="preserve">Risk factor </w:t>
+      </w:r>
+      <w:r>
+        <w:t>levels and prevalence</w:t>
+      </w:r>
+      <w:r>
+        <w:t xml:space="preserve"> changed over time in both men and women. Systolic </w:t>
+      </w:r>
+      <w:r>
+        <w:t>BP</w:t>
+      </w:r>
+      <w:r>
+        <w:t xml:space="preserve"> and diabetes prevalence increased over time, while smoking prevalence declined in both sexes</w:t>
+      </w:r>
+      <w:r>
+        <w:t xml:space="preserve"> (</w:t>
+      </w:r>
+      <w:r>
+        <w:rPr>
+          <w:b/>
+          <w:bCs/>
+          <w:i/>
+          <w:iCs/>
+        </w:rPr>
+        <w:t>Table 4</w:t>
+      </w:r>
+      <w:r>
+        <w:t>)</w:t>
+      </w:r>
+      <w:r>
+        <w:t xml:space="preserve">. </w:t>
+      </w:r>
+    </w:p>
     <w:p>
       <w:pPr>
         <w:jc w:val="center"/>
       </w:pPr>
       <w:r>
+        <w:rPr>
+          <w:noProof/>
+        </w:rPr>
         <w:drawing>
-          <wp:inline distT="0" distB="0" distL="0" distR="0" wp14:anchorId="38EE3CF9" wp14:editId="40B1C1A7">
-            <wp:extent cx="5943600" cy="1563370"/>
+          <wp:inline distT="0" distB="0" distL="0" distR="0" wp14:anchorId="36D35AC5" wp14:editId="6BBE4AEB">
+            <wp:extent cx="5943600" cy="1537970"/>
             <wp:effectExtent l="0" t="0" r="0" b="0"/>
-            <wp:docPr id="952664028" name="Picture 1"/>
+            <wp:docPr id="1752307855" name="Picture 1"/>
             <wp:cNvGraphicFramePr>
               <a:graphicFrameLocks xmlns:a="http://schemas.openxmlformats.org/drawingml/2006/main" noChangeAspect="1"/>
             </wp:cNvGraphicFramePr>
@@ -2207,7 +2835,7 @@
               <a:graphicData uri="http://schemas.openxmlformats.org/drawingml/2006/picture">
                 <pic:pic xmlns:pic="http://schemas.openxmlformats.org/drawingml/2006/picture">
                   <pic:nvPicPr>
-                    <pic:cNvPr id="952664028" name=""/>
+                    <pic:cNvPr id="1752307855" name=""/>
                     <pic:cNvPicPr/>
                   </pic:nvPicPr>
                   <pic:blipFill>
@@ -2219,7 +2847,7 @@
                   <pic:spPr>
                     <a:xfrm>
                       <a:off x="0" y="0"/>
-                      <a:ext cx="5943600" cy="1563370"/>
+                      <a:ext cx="5943600" cy="1537970"/>
                     </a:xfrm>
                     <a:prstGeom prst="rect">
                       <a:avLst/>
@@ -2271,7 +2899,7 @@
           <w:szCs w:val="21"/>
           <w14:ligatures w14:val="standardContextual"/>
         </w:rPr>
-        <w:t>Distribution of risk factors across three examination periods in the Framingham Heart Study, stratified by sex. Continuous variables are presented as mean (</w:t>
+        <w:t>R</w:t>
       </w:r>
       <w:r>
         <w:rPr>
@@ -2282,7 +2910,7 @@
           <w:szCs w:val="21"/>
           <w14:ligatures w14:val="standardContextual"/>
         </w:rPr>
-        <w:t>SD</w:t>
+        <w:t>isk factor</w:t>
       </w:r>
       <w:r>
         <w:rPr>
@@ -2293,40 +2921,53 @@
           <w:szCs w:val="21"/>
           <w14:ligatures w14:val="standardContextual"/>
         </w:rPr>
+        <w:t xml:space="preserve"> summarie</w:t>
+      </w:r>
+      <w:r>
+        <w:rPr>
+          <w:rFonts w:asciiTheme="minorHAnsi" w:eastAsiaTheme="minorHAnsi" w:hAnsiTheme="minorHAnsi" w:cstheme="minorBidi"/>
+          <w:color w:val="000000" w:themeColor="text1"/>
+          <w:kern w:val="2"/>
+          <w:sz w:val="21"/>
+          <w:szCs w:val="21"/>
+          <w14:ligatures w14:val="standardContextual"/>
+        </w:rPr>
+        <w:t>s across three examination periods in the Framingham Heart Study, stratified by sex. Continuous variables are presented as mean (</w:t>
+      </w:r>
+      <w:r>
+        <w:rPr>
+          <w:rFonts w:asciiTheme="minorHAnsi" w:eastAsiaTheme="minorHAnsi" w:hAnsiTheme="minorHAnsi" w:cstheme="minorBidi"/>
+          <w:color w:val="000000" w:themeColor="text1"/>
+          <w:kern w:val="2"/>
+          <w:sz w:val="21"/>
+          <w:szCs w:val="21"/>
+          <w14:ligatures w14:val="standardContextual"/>
+        </w:rPr>
+        <w:t>SD</w:t>
+      </w:r>
+      <w:r>
+        <w:rPr>
+          <w:rFonts w:asciiTheme="minorHAnsi" w:eastAsiaTheme="minorHAnsi" w:hAnsiTheme="minorHAnsi" w:cstheme="minorBidi"/>
+          <w:color w:val="000000" w:themeColor="text1"/>
+          <w:kern w:val="2"/>
+          <w:sz w:val="21"/>
+          <w:szCs w:val="21"/>
+          <w14:ligatures w14:val="standardContextual"/>
+        </w:rPr>
         <w:t>), and categorical variables are presented as percentages. Estimates reflect cross-sectional summaries at each examination period.</w:t>
       </w:r>
     </w:p>
-    <w:p/>
-    <w:p>
-      <w:pPr>
-        <w:spacing w:line="480" w:lineRule="auto"/>
-      </w:pPr>
-      <w:r>
-        <w:t xml:space="preserve">Risk factor distributions changed over time in both men and women. Systolic </w:t>
-      </w:r>
-      <w:r>
-        <w:t>BP</w:t>
-      </w:r>
-      <w:r>
-        <w:t xml:space="preserve"> and diabetes prevalence increased over time, while smoking prevalence declined in both sexes. </w:t>
-      </w:r>
-    </w:p>
-    <w:p>
-      <w:pPr>
-        <w:jc w:val="center"/>
-      </w:pPr>
-    </w:p>
     <w:p>
       <w:pPr>
         <w:pStyle w:val="Heading2"/>
       </w:pPr>
-      <w:bookmarkStart w:id="16" w:name="_Toc221022976"/>
-      <w:bookmarkStart w:id="17" w:name="_Toc227079196"/>
+      <w:bookmarkStart w:id="17" w:name="_Toc221022976"/>
+      <w:bookmarkStart w:id="18" w:name="_Toc227684284"/>
       <w:r>
         <w:t>4. Discussion</w:t>
       </w:r>
-      <w:bookmarkEnd w:id="16"/>
       <w:bookmarkEnd w:id="17"/>
+      <w:bookmarkEnd w:id="18"/>
     </w:p>
     <w:p>
       <w:pPr>
@@ -2343,7 +2984,13 @@
         <w:t>BP</w:t>
       </w:r>
       <w:r>
-        <w:t xml:space="preserve"> (hypertension) was identified as the primary risk factor for stroke in both </w:t>
+        <w:t xml:space="preserve"> (hypertension) </w:t>
+      </w:r>
+      <w:r>
+        <w:t>and older age were</w:t>
+      </w:r>
+      <w:r>
+        <w:t xml:space="preserve"> identified as the primary risk factor for stroke in both </w:t>
       </w:r>
       <w:r>
         <w:t>sexes</w:t>
@@ -2355,7 +3002,11 @@
         <w:t xml:space="preserve">smoking, </w:t>
       </w:r>
       <w:r>
-        <w:t xml:space="preserve">diabetes and the interaction between </w:t>
+        <w:t xml:space="preserve">diabetes and the </w:t>
+      </w:r>
+      <w:r>
+        <w:lastRenderedPageBreak/>
+        <w:t xml:space="preserve">interaction between </w:t>
       </w:r>
       <w:r>
         <w:t>SBP</w:t>
@@ -2370,7 +3021,13 @@
         <w:spacing w:line="480" w:lineRule="auto"/>
       </w:pPr>
       <w:r>
-        <w:t>Although several additional risk factors, were not statistically significan, their estimated effects were generally consistent with prior literature. The lack of statistical significance is likely attributable to the relatively low number of stroke events.</w:t>
+        <w:t>Although several additional risk factors, were not statistically significan</w:t>
+      </w:r>
+      <w:r>
+        <w:t>t</w:t>
+      </w:r>
+      <w:r>
+        <w:t>, their estimated effects were generally consistent with prior literature. The lack of statistical significance is likely attributable to the relatively low number of stroke events.</w:t>
       </w:r>
     </w:p>
     <w:p>
@@ -2381,6 +3038,9 @@
       <w:r>
         <w:t xml:space="preserve">Predicted 10-year stroke risk increased with both age and accumulation of risk factors, with the highest probabilities observed among individuals with multiple concurrent risk factors. </w:t>
       </w:r>
+      <w:r>
+        <w:t>In women, high BP had a greater impact on predicted risk than diabetes, while in men, it was the opposite.</w:t>
+      </w:r>
     </w:p>
     <w:p>
       <w:pPr>
@@ -2388,7 +3048,6 @@
         <w:spacing w:line="480" w:lineRule="auto"/>
       </w:pPr>
       <w:r>
-        <w:lastRenderedPageBreak/>
         <w:t>Risk factor distributions were also observed to change across examination periods, with increases in SBP and diabetes prevalence and declines in smoking prevalence over time. These findings suggest that</w:t>
       </w:r>
       <w:r>
@@ -2441,6 +3100,7 @@
         <w:contextualSpacing/>
       </w:pPr>
       <w:r>
+        <w:lastRenderedPageBreak/>
         <w:t>4.2</w:t>
       </w:r>
       <w:r>
@@ -2456,7 +3116,13 @@
         <w:spacing w:line="480" w:lineRule="auto"/>
       </w:pPr>
       <w:r>
-        <w:t>In this cohort from the Framingham Heart Study, age and SBP were identified as the primary determinants of 10-year stroke risk in both men and women. While several additional risk factors were not statistically significant, their estimated effects were consistent with established clinical knowledge, suggesting that limited statistical power may have influenced inference.</w:t>
+        <w:t xml:space="preserve">In this cohort from the Framingham Heart Study, age and SBP were identified as the primary determinants of 10-year stroke risk in both men and women. While several additional risk factors were not statistically significant, their estimated effects were </w:t>
+      </w:r>
+      <w:r>
+        <w:t>large</w:t>
+      </w:r>
+      <w:r>
+        <w:t>, suggesting that limited statistical power may have influenced inference.</w:t>
       </w:r>
     </w:p>
     <w:p>
@@ -2477,23 +3143,80 @@
         <w:t>particularly among men</w:t>
       </w:r>
       <w:r>
-        <w:t>. Observed changes in risk factor distributions over time further suggest that future analyses incorporating time-varying covariates may improve estimation of stroke risk.</w:t>
+        <w:t xml:space="preserve">. </w:t>
+      </w:r>
+      <w:r>
+        <w:t xml:space="preserve">Summary measures of </w:t>
+      </w:r>
+      <w:r>
+        <w:t>risk factor</w:t>
+      </w:r>
+      <w:r>
+        <w:t xml:space="preserve">s </w:t>
+      </w:r>
+      <w:r>
+        <w:t xml:space="preserve">changed </w:t>
+      </w:r>
+      <w:r>
+        <w:t>over time</w:t>
+      </w:r>
+      <w:r>
+        <w:t>,</w:t>
+      </w:r>
+      <w:r>
+        <w:t xml:space="preserve"> </w:t>
+      </w:r>
+      <w:r>
+        <w:t>which</w:t>
+      </w:r>
+      <w:r>
+        <w:t xml:space="preserve"> suggest</w:t>
+      </w:r>
+      <w:r>
+        <w:t>s</w:t>
+      </w:r>
+      <w:r>
+        <w:t xml:space="preserve"> that incorporating time-varying covariates may improve estimation of stroke risk.</w:t>
       </w:r>
     </w:p>
     <w:p/>
     <w:p/>
     <w:p/>
     <w:p/>
+    <w:p/>
+    <w:p/>
+    <w:p/>
+    <w:p/>
+    <w:p/>
+    <w:p/>
+    <w:p/>
+    <w:p/>
+    <w:p/>
+    <w:p/>
+    <w:p/>
+    <w:p/>
+    <w:p/>
+    <w:p/>
+    <w:p/>
+    <w:p/>
+    <w:p/>
+    <w:p/>
+    <w:p/>
+    <w:p/>
+    <w:p/>
+    <w:p/>
+    <w:p/>
+    <w:p/>
     <w:p>
       <w:pPr>
         <w:pStyle w:val="Heading2"/>
       </w:pPr>
-      <w:bookmarkStart w:id="18" w:name="_Toc227079197"/>
+      <w:bookmarkStart w:id="19" w:name="_Toc227684285"/>
       <w:r>
         <w:lastRenderedPageBreak/>
         <w:t>References</w:t>
       </w:r>
-      <w:bookmarkEnd w:id="18"/>
+      <w:bookmarkEnd w:id="19"/>
     </w:p>
     <w:p>
       <w:r>
@@ -2663,18 +3386,22 @@
         </w:r>
       </w:hyperlink>
     </w:p>
-    <w:p/>
+    <w:p>
+      <w:pPr>
+        <w:pStyle w:val="p1"/>
+      </w:pPr>
+    </w:p>
     <w:p>
       <w:pPr>
         <w:pStyle w:val="Heading2"/>
       </w:pPr>
-      <w:bookmarkStart w:id="19" w:name="_Toc221022978"/>
-      <w:bookmarkStart w:id="20" w:name="_Toc227079198"/>
+      <w:bookmarkStart w:id="20" w:name="_Toc221022978"/>
+      <w:bookmarkStart w:id="21" w:name="_Toc227684286"/>
       <w:r>
         <w:t>Reproducibility Statement</w:t>
       </w:r>
-      <w:bookmarkEnd w:id="19"/>
       <w:bookmarkEnd w:id="20"/>
+      <w:bookmarkEnd w:id="21"/>
     </w:p>
     <w:p>
       <w:r>
@@ -2714,6 +3441,423 @@
       </w:r>
     </w:p>
     <w:p/>
+    <w:p>
+      <w:pPr>
+        <w:pStyle w:val="Heading2"/>
+      </w:pPr>
+      <w:bookmarkStart w:id="22" w:name="_Toc227684287"/>
+    </w:p>
+    <w:p>
+      <w:pPr>
+        <w:pStyle w:val="Heading2"/>
+      </w:pPr>
+      <w:r>
+        <w:t>Supplementa</w:t>
+      </w:r>
+      <w:r>
+        <w:t>l</w:t>
+      </w:r>
+      <w:bookmarkEnd w:id="22"/>
+    </w:p>
+    <w:p>
+      <w:pPr>
+        <w:jc w:val="center"/>
+      </w:pPr>
+      <w:r>
+        <w:rPr>
+          <w:noProof/>
+        </w:rPr>
+        <w:drawing>
+          <wp:inline distT="0" distB="0" distL="0" distR="0" wp14:anchorId="5ABB7A44" wp14:editId="7C2A7418">
+            <wp:extent cx="4522330" cy="3078178"/>
+            <wp:effectExtent l="0" t="0" r="0" b="0"/>
+            <wp:docPr id="839559756" name="Picture 1"/>
+            <wp:cNvGraphicFramePr>
+              <a:graphicFrameLocks xmlns:a="http://schemas.openxmlformats.org/drawingml/2006/main" noChangeAspect="1"/>
+            </wp:cNvGraphicFramePr>
+            <a:graphic xmlns:a="http://schemas.openxmlformats.org/drawingml/2006/main">
+              <a:graphicData uri="http://schemas.openxmlformats.org/drawingml/2006/picture">
+                <pic:pic xmlns:pic="http://schemas.openxmlformats.org/drawingml/2006/picture">
+                  <pic:nvPicPr>
+                    <pic:cNvPr id="839559756" name=""/>
+                    <pic:cNvPicPr/>
+                  </pic:nvPicPr>
+                  <pic:blipFill>
+                    <a:blip r:embed="rId15"/>
+                    <a:stretch>
+                      <a:fillRect/>
+                    </a:stretch>
+                  </pic:blipFill>
+                  <pic:spPr>
+                    <a:xfrm>
+                      <a:off x="0" y="0"/>
+                      <a:ext cx="4600024" cy="3131061"/>
+                    </a:xfrm>
+                    <a:prstGeom prst="rect">
+                      <a:avLst/>
+                    </a:prstGeom>
+                  </pic:spPr>
+                </pic:pic>
+              </a:graphicData>
+            </a:graphic>
+          </wp:inline>
+        </w:drawing>
+      </w:r>
+    </w:p>
+    <w:p>
+      <w:pPr>
+        <w:jc w:val="center"/>
+      </w:pPr>
+    </w:p>
+    <w:p>
+      <w:pPr>
+        <w:pStyle w:val="Caption"/>
+        <w:rPr>
+          <w:color w:val="0E0E0E"/>
+          <w:sz w:val="21"/>
+          <w:szCs w:val="21"/>
+        </w:rPr>
+      </w:pPr>
+      <w:bookmarkStart w:id="23" w:name="_Ref227251234"/>
+      <w:r>
+        <w:rPr>
+          <w:b/>
+          <w:bCs/>
+          <w:sz w:val="21"/>
+          <w:szCs w:val="21"/>
+        </w:rPr>
+        <w:t xml:space="preserve">Supplementary Figure </w:t>
+      </w:r>
+      <w:r>
+        <w:rPr>
+          <w:b/>
+          <w:bCs/>
+          <w:sz w:val="21"/>
+          <w:szCs w:val="21"/>
+        </w:rPr>
+        <w:fldChar w:fldCharType="begin"/>
+      </w:r>
+      <w:r>
+        <w:rPr>
+          <w:b/>
+          <w:bCs/>
+          <w:sz w:val="21"/>
+          <w:szCs w:val="21"/>
+        </w:rPr>
+        <w:instrText xml:space="preserve"> SEQ Supplementary_Figure \* ARABIC </w:instrText>
+      </w:r>
+      <w:r>
+        <w:rPr>
+          <w:b/>
+          <w:bCs/>
+          <w:sz w:val="21"/>
+          <w:szCs w:val="21"/>
+        </w:rPr>
+        <w:fldChar w:fldCharType="separate"/>
+      </w:r>
+      <w:r>
+        <w:rPr>
+          <w:b/>
+          <w:bCs/>
+          <w:noProof/>
+          <w:sz w:val="21"/>
+          <w:szCs w:val="21"/>
+        </w:rPr>
+        <w:t>1</w:t>
+      </w:r>
+      <w:r>
+        <w:rPr>
+          <w:b/>
+          <w:bCs/>
+          <w:sz w:val="21"/>
+          <w:szCs w:val="21"/>
+        </w:rPr>
+        <w:fldChar w:fldCharType="end"/>
+      </w:r>
+      <w:bookmarkEnd w:id="23"/>
+      <w:r>
+        <w:rPr>
+          <w:b/>
+          <w:bCs/>
+          <w:sz w:val="21"/>
+          <w:szCs w:val="21"/>
+        </w:rPr>
+        <w:t xml:space="preserve"> </w:t>
+      </w:r>
+      <w:r>
+        <w:rPr>
+          <w:sz w:val="21"/>
+          <w:szCs w:val="21"/>
+        </w:rPr>
+        <w:t>Predicted 10-year stroke risk by SBP and BP medication use in men.</w:t>
+      </w:r>
+      <w:r>
+        <w:rPr>
+          <w:b/>
+          <w:bCs/>
+          <w:sz w:val="21"/>
+          <w:szCs w:val="21"/>
+        </w:rPr>
+        <w:t xml:space="preserve"> </w:t>
+      </w:r>
+      <w:r>
+        <w:rPr>
+          <w:color w:val="0E0E0E"/>
+          <w:sz w:val="21"/>
+          <w:szCs w:val="21"/>
+        </w:rPr>
+        <w:t xml:space="preserve">Risk increased sharply with SBP among </w:t>
+      </w:r>
+      <w:r>
+        <w:rPr>
+          <w:color w:val="0E0E0E"/>
+          <w:sz w:val="21"/>
+          <w:szCs w:val="21"/>
+        </w:rPr>
+        <w:t>men not on medication</w:t>
+      </w:r>
+      <w:r>
+        <w:rPr>
+          <w:color w:val="0E0E0E"/>
+          <w:sz w:val="21"/>
+          <w:szCs w:val="21"/>
+        </w:rPr>
+        <w:t xml:space="preserve"> but was attenuated among treated men. The slight decrease in risk at higher SBP levels among </w:t>
+      </w:r>
+      <w:r>
+        <w:rPr>
+          <w:color w:val="0E0E0E"/>
+          <w:sz w:val="21"/>
+          <w:szCs w:val="21"/>
+        </w:rPr>
+        <w:t>men on medication</w:t>
+      </w:r>
+      <w:r>
+        <w:rPr>
+          <w:color w:val="0E0E0E"/>
+          <w:sz w:val="21"/>
+          <w:szCs w:val="21"/>
+        </w:rPr>
+        <w:t xml:space="preserve"> likely reflects limited data </w:t>
+      </w:r>
+      <w:r>
+        <w:rPr>
+          <w:color w:val="0E0E0E"/>
+          <w:sz w:val="21"/>
+          <w:szCs w:val="21"/>
+        </w:rPr>
+        <w:t>and patients having a higher baseline SBP to begin with.</w:t>
+      </w:r>
+    </w:p>
+    <w:p>
+      <w:pPr>
+        <w:jc w:val="center"/>
+      </w:pPr>
+      <w:r>
+        <w:rPr>
+          <w:noProof/>
+        </w:rPr>
+        <w:drawing>
+          <wp:inline distT="0" distB="0" distL="0" distR="0" wp14:anchorId="50B770C0" wp14:editId="1899B859">
+            <wp:extent cx="2145671" cy="2668334"/>
+            <wp:effectExtent l="12700" t="12700" r="9525" b="8890"/>
+            <wp:docPr id="1225204431" name="Picture 1"/>
+            <wp:cNvGraphicFramePr>
+              <a:graphicFrameLocks xmlns:a="http://schemas.openxmlformats.org/drawingml/2006/main" noChangeAspect="1"/>
+            </wp:cNvGraphicFramePr>
+            <a:graphic xmlns:a="http://schemas.openxmlformats.org/drawingml/2006/main">
+              <a:graphicData uri="http://schemas.openxmlformats.org/drawingml/2006/picture">
+                <pic:pic xmlns:pic="http://schemas.openxmlformats.org/drawingml/2006/picture">
+                  <pic:nvPicPr>
+                    <pic:cNvPr id="1225204431" name=""/>
+                    <pic:cNvPicPr/>
+                  </pic:nvPicPr>
+                  <pic:blipFill>
+                    <a:blip r:embed="rId16"/>
+                    <a:stretch>
+                      <a:fillRect/>
+                    </a:stretch>
+                  </pic:blipFill>
+                  <pic:spPr>
+                    <a:xfrm>
+                      <a:off x="0" y="0"/>
+                      <a:ext cx="2145671" cy="2668334"/>
+                    </a:xfrm>
+                    <a:prstGeom prst="rect">
+                      <a:avLst/>
+                    </a:prstGeom>
+                    <a:ln>
+                      <a:solidFill>
+                        <a:schemeClr val="tx1"/>
+                      </a:solidFill>
+                    </a:ln>
+                  </pic:spPr>
+                </pic:pic>
+              </a:graphicData>
+            </a:graphic>
+          </wp:inline>
+        </w:drawing>
+      </w:r>
+      <w:r>
+        <w:rPr>
+          <w:noProof/>
+        </w:rPr>
+        <w:drawing>
+          <wp:inline distT="0" distB="0" distL="0" distR="0" wp14:anchorId="11235C24" wp14:editId="40F1D589">
+            <wp:extent cx="2145671" cy="2668334"/>
+            <wp:effectExtent l="12700" t="12700" r="15240" b="12700"/>
+            <wp:docPr id="1981954868" name="Picture 1"/>
+            <wp:cNvGraphicFramePr>
+              <a:graphicFrameLocks xmlns:a="http://schemas.openxmlformats.org/drawingml/2006/main" noChangeAspect="1"/>
+            </wp:cNvGraphicFramePr>
+            <a:graphic xmlns:a="http://schemas.openxmlformats.org/drawingml/2006/main">
+              <a:graphicData uri="http://schemas.openxmlformats.org/drawingml/2006/picture">
+                <pic:pic xmlns:pic="http://schemas.openxmlformats.org/drawingml/2006/picture">
+                  <pic:nvPicPr>
+                    <pic:cNvPr id="1981954868" name=""/>
+                    <pic:cNvPicPr/>
+                  </pic:nvPicPr>
+                  <pic:blipFill>
+                    <a:blip r:embed="rId17"/>
+                    <a:stretch>
+                      <a:fillRect/>
+                    </a:stretch>
+                  </pic:blipFill>
+                  <pic:spPr>
+                    <a:xfrm>
+                      <a:off x="0" y="0"/>
+                      <a:ext cx="2145671" cy="2668334"/>
+                    </a:xfrm>
+                    <a:prstGeom prst="rect">
+                      <a:avLst/>
+                    </a:prstGeom>
+                    <a:ln>
+                      <a:solidFill>
+                        <a:schemeClr val="tx1"/>
+                      </a:solidFill>
+                    </a:ln>
+                  </pic:spPr>
+                </pic:pic>
+              </a:graphicData>
+            </a:graphic>
+          </wp:inline>
+        </w:drawing>
+      </w:r>
+    </w:p>
+    <w:p>
+      <w:pPr>
+        <w:jc w:val="center"/>
+      </w:pPr>
+    </w:p>
+    <w:p>
+      <w:pPr>
+        <w:pStyle w:val="Caption"/>
+        <w:rPr>
+          <w:sz w:val="21"/>
+          <w:szCs w:val="21"/>
+        </w:rPr>
+      </w:pPr>
+      <w:bookmarkStart w:id="24" w:name="_Ref227253905"/>
+      <w:r>
+        <w:rPr>
+          <w:b/>
+          <w:bCs/>
+          <w:sz w:val="21"/>
+          <w:szCs w:val="21"/>
+        </w:rPr>
+        <w:t xml:space="preserve">Supplementary Table </w:t>
+      </w:r>
+      <w:r>
+        <w:rPr>
+          <w:b/>
+          <w:bCs/>
+          <w:sz w:val="21"/>
+          <w:szCs w:val="21"/>
+        </w:rPr>
+        <w:fldChar w:fldCharType="begin"/>
+      </w:r>
+      <w:r>
+        <w:rPr>
+          <w:b/>
+          <w:bCs/>
+          <w:sz w:val="21"/>
+          <w:szCs w:val="21"/>
+        </w:rPr>
+        <w:instrText xml:space="preserve"> SEQ Supplementary_Table \* ARABIC </w:instrText>
+      </w:r>
+      <w:r>
+        <w:rPr>
+          <w:b/>
+          <w:bCs/>
+          <w:sz w:val="21"/>
+          <w:szCs w:val="21"/>
+        </w:rPr>
+        <w:fldChar w:fldCharType="separate"/>
+      </w:r>
+      <w:r>
+        <w:rPr>
+          <w:b/>
+          <w:bCs/>
+          <w:noProof/>
+          <w:sz w:val="21"/>
+          <w:szCs w:val="21"/>
+        </w:rPr>
+        <w:t>1</w:t>
+      </w:r>
+      <w:r>
+        <w:rPr>
+          <w:b/>
+          <w:bCs/>
+          <w:sz w:val="21"/>
+          <w:szCs w:val="21"/>
+        </w:rPr>
+        <w:fldChar w:fldCharType="end"/>
+      </w:r>
+      <w:bookmarkEnd w:id="24"/>
+      <w:r>
+        <w:t xml:space="preserve"> </w:t>
+      </w:r>
+      <w:r>
+        <w:rPr>
+          <w:sz w:val="21"/>
+          <w:szCs w:val="21"/>
+        </w:rPr>
+        <w:t>Tests of the proportional hazards assumption for Cox models stratified by sex.</w:t>
+      </w:r>
+      <w:r>
+        <w:t xml:space="preserve"> </w:t>
+      </w:r>
+      <w:r>
+        <w:rPr>
+          <w:sz w:val="21"/>
+          <w:szCs w:val="21"/>
+        </w:rPr>
+        <w:t xml:space="preserve">Schoenfeld residual-based tests showed no evidence of violation of the proportional </w:t>
+      </w:r>
+      <w:proofErr w:type="gramStart"/>
+      <w:r>
+        <w:rPr>
+          <w:sz w:val="21"/>
+          <w:szCs w:val="21"/>
+        </w:rPr>
+        <w:t>hazards</w:t>
+      </w:r>
+      <w:proofErr w:type="gramEnd"/>
+      <w:r>
+        <w:rPr>
+          <w:sz w:val="21"/>
+          <w:szCs w:val="21"/>
+        </w:rPr>
+        <w:t xml:space="preserve"> assumption for any covariate or globally in either sex</w:t>
+      </w:r>
+      <w:r>
+        <w:rPr>
+          <w:sz w:val="21"/>
+          <w:szCs w:val="21"/>
+        </w:rPr>
+        <w:t xml:space="preserve"> (all p &gt; 0.05).</w:t>
+      </w:r>
+    </w:p>
     <w:sectPr>
       <w:pgSz w:w="12240" w:h="15840"/>
       <w:pgMar w:top="1440" w:right="1440" w:bottom="1440" w:left="1440" w:header="720" w:footer="720" w:gutter="0"/>
@@ -3110,6 +4254,119 @@
     </w:lvl>
   </w:abstractNum>
   <w:abstractNum w:abstractNumId="3" w15:restartNumberingAfterBreak="0">
+    <w:nsid w:val="4DC71D1A"/>
+    <w:multiLevelType w:val="hybridMultilevel"/>
+    <w:tmpl w:val="54780360"/>
+    <w:lvl w:ilvl="0" w:tplc="04090001">
+      <w:start w:val="1"/>
+      <w:numFmt w:val="bullet"/>
+      <w:lvlText w:val=""/>
+      <w:lvlJc w:val="left"/>
+      <w:pPr>
+        <w:ind w:left="720" w:hanging="360"/>
+      </w:pPr>
+      <w:rPr>
+        <w:rFonts w:ascii="Symbol" w:hAnsi="Symbol" w:hint="default"/>
+      </w:rPr>
+    </w:lvl>
+    <w:lvl w:ilvl="1" w:tplc="04090003" w:tentative="1">
+      <w:start w:val="1"/>
+      <w:numFmt w:val="bullet"/>
+      <w:lvlText w:val="o"/>
+      <w:lvlJc w:val="left"/>
+      <w:pPr>
+        <w:ind w:left="1440" w:hanging="360"/>
+      </w:pPr>
+      <w:rPr>
+        <w:rFonts w:ascii="Courier New" w:hAnsi="Courier New" w:cs="Courier New" w:hint="default"/>
+      </w:rPr>
+    </w:lvl>
+    <w:lvl w:ilvl="2" w:tplc="04090005" w:tentative="1">
+      <w:start w:val="1"/>
+      <w:numFmt w:val="bullet"/>
+      <w:lvlText w:val=""/>
+      <w:lvlJc w:val="left"/>
+      <w:pPr>
+        <w:ind w:left="2160" w:hanging="360"/>
+      </w:pPr>
+      <w:rPr>
+        <w:rFonts w:ascii="Wingdings" w:hAnsi="Wingdings" w:hint="default"/>
+      </w:rPr>
+    </w:lvl>
+    <w:lvl w:ilvl="3" w:tplc="04090001" w:tentative="1">
+      <w:start w:val="1"/>
+      <w:numFmt w:val="bullet"/>
+      <w:lvlText w:val=""/>
+      <w:lvlJc w:val="left"/>
+      <w:pPr>
+        <w:ind w:left="2880" w:hanging="360"/>
+      </w:pPr>
+      <w:rPr>
+        <w:rFonts w:ascii="Symbol" w:hAnsi="Symbol" w:hint="default"/>
+      </w:rPr>
+    </w:lvl>
+    <w:lvl w:ilvl="4" w:tplc="04090003" w:tentative="1">
+      <w:start w:val="1"/>
+      <w:numFmt w:val="bullet"/>
+      <w:lvlText w:val="o"/>
+      <w:lvlJc w:val="left"/>
+      <w:pPr>
+        <w:ind w:left="3600" w:hanging="360"/>
+      </w:pPr>
+      <w:rPr>
+        <w:rFonts w:ascii="Courier New" w:hAnsi="Courier New" w:cs="Courier New" w:hint="default"/>
+      </w:rPr>
+    </w:lvl>
+    <w:lvl w:ilvl="5" w:tplc="04090005" w:tentative="1">
+      <w:start w:val="1"/>
+      <w:numFmt w:val="bullet"/>
+      <w:lvlText w:val=""/>
+      <w:lvlJc w:val="left"/>
+      <w:pPr>
+        <w:ind w:left="4320" w:hanging="360"/>
+      </w:pPr>
+      <w:rPr>
+        <w:rFonts w:ascii="Wingdings" w:hAnsi="Wingdings" w:hint="default"/>
+      </w:rPr>
+    </w:lvl>
+    <w:lvl w:ilvl="6" w:tplc="04090001" w:tentative="1">
+      <w:start w:val="1"/>
+      <w:numFmt w:val="bullet"/>
+      <w:lvlText w:val=""/>
+      <w:lvlJc w:val="left"/>
+      <w:pPr>
+        <w:ind w:left="5040" w:hanging="360"/>
+      </w:pPr>
+      <w:rPr>
+        <w:rFonts w:ascii="Symbol" w:hAnsi="Symbol" w:hint="default"/>
+      </w:rPr>
+    </w:lvl>
+    <w:lvl w:ilvl="7" w:tplc="04090003" w:tentative="1">
+      <w:start w:val="1"/>
+      <w:numFmt w:val="bullet"/>
+      <w:lvlText w:val="o"/>
+      <w:lvlJc w:val="left"/>
+      <w:pPr>
+        <w:ind w:left="5760" w:hanging="360"/>
+      </w:pPr>
+      <w:rPr>
+        <w:rFonts w:ascii="Courier New" w:hAnsi="Courier New" w:cs="Courier New" w:hint="default"/>
+      </w:rPr>
+    </w:lvl>
+    <w:lvl w:ilvl="8" w:tplc="04090005" w:tentative="1">
+      <w:start w:val="1"/>
+      <w:numFmt w:val="bullet"/>
+      <w:lvlText w:val=""/>
+      <w:lvlJc w:val="left"/>
+      <w:pPr>
+        <w:ind w:left="6480" w:hanging="360"/>
+      </w:pPr>
+      <w:rPr>
+        <w:rFonts w:ascii="Wingdings" w:hAnsi="Wingdings" w:hint="default"/>
+      </w:rPr>
+    </w:lvl>
+  </w:abstractNum>
+  <w:abstractNum w:abstractNumId="4" w15:restartNumberingAfterBreak="0">
     <w:nsid w:val="5BF33F4E"/>
     <w:multiLevelType w:val="hybridMultilevel"/>
     <w:tmpl w:val="A8426FE2"/>
@@ -3202,10 +4459,13 @@
     <w:abstractNumId w:val="2"/>
   </w:num>
   <w:num w:numId="3" w16cid:durableId="464080542">
-    <w:abstractNumId w:val="3"/>
+    <w:abstractNumId w:val="4"/>
   </w:num>
   <w:num w:numId="4" w16cid:durableId="1792894366">
     <w:abstractNumId w:val="0"/>
+  </w:num>
+  <w:num w:numId="5" w16cid:durableId="681011225">
+    <w:abstractNumId w:val="3"/>
   </w:num>
 </w:numbering>
 </file>
@@ -3610,7 +4870,7 @@
   <w:style w:type="paragraph" w:default="1" w:styleId="Normal">
     <w:name w:val="Normal"/>
     <w:qFormat/>
-    <w:rsid w:val="00496AE5"/>
+    <w:rsid w:val="0088059F"/>
     <w:pPr>
       <w:spacing w:after="0" w:line="240" w:lineRule="auto"/>
     </w:pPr>

</xml_diff>